<commit_message>
260331 XFP v8.1.12 release
Release version of v8.1.11
</commit_message>
<xml_diff>
--- a/XFP/Resources/XFP Revision History[en-GB].docx
+++ b/XFP/Resources/XFP Revision History[en-GB].docx
@@ -58,7 +58,7 @@
           <w:sz w:val="24"/>
           <w:szCs w:val="24"/>
         </w:rPr>
-        <w:t>1</w:t>
+        <w:t>12</w:t>
       </w:r>
       <w:r>
         <w:rPr>
@@ -69,7 +69,7 @@
           <w:sz w:val="24"/>
           <w:szCs w:val="24"/>
         </w:rPr>
-        <w:t>2</w:t>
+        <w:tab/>
       </w:r>
       <w:r>
         <w:rPr>
@@ -80,7 +80,7 @@
           <w:sz w:val="24"/>
           <w:szCs w:val="24"/>
         </w:rPr>
-        <w:tab/>
+        <w:t>31</w:t>
       </w:r>
       <w:r>
         <w:rPr>
@@ -91,7 +91,7 @@
           <w:sz w:val="24"/>
           <w:szCs w:val="24"/>
         </w:rPr>
-        <w:t>04</w:t>
+        <w:t>/</w:t>
       </w:r>
       <w:r>
         <w:rPr>
@@ -102,29 +102,7 @@
           <w:sz w:val="24"/>
           <w:szCs w:val="24"/>
         </w:rPr>
-        <w:t>/</w:t>
-      </w:r>
-      <w:r>
-        <w:rPr>
-          <w:rFonts w:ascii="Arial" w:hAnsi="Arial" w:cs="Arial"/>
-          <w:b/>
-          <w:bCs/>
-          <w:color w:val="4472C4" w:themeColor="accent5"/>
-          <w:sz w:val="24"/>
-          <w:szCs w:val="24"/>
-        </w:rPr>
-        <w:t>0</w:t>
-      </w:r>
-      <w:r>
-        <w:rPr>
-          <w:rFonts w:ascii="Arial" w:hAnsi="Arial" w:cs="Arial"/>
-          <w:b/>
-          <w:bCs/>
-          <w:color w:val="4472C4" w:themeColor="accent5"/>
-          <w:sz w:val="24"/>
-          <w:szCs w:val="24"/>
-        </w:rPr>
-        <w:t>3</w:t>
+        <w:t>03</w:t>
       </w:r>
       <w:r>
         <w:rPr>
@@ -264,25 +242,34 @@
           <w:sz w:val="18"/>
           <w:szCs w:val="18"/>
         </w:rPr>
-        <w:t>specifi</w:t>
-      </w:r>
-      <w:r>
-        <w:rPr>
-          <w:rFonts w:ascii="Arial" w:hAnsi="Arial" w:cs="Arial"/>
-          <w:color w:val="1F497D"/>
-          <w:sz w:val="18"/>
-          <w:szCs w:val="18"/>
-        </w:rPr>
-        <w:t>ed</w:t>
-      </w:r>
-      <w:r>
-        <w:rPr>
-          <w:rFonts w:ascii="Arial" w:hAnsi="Arial" w:cs="Arial"/>
-          <w:color w:val="1F497D"/>
-          <w:sz w:val="18"/>
-          <w:szCs w:val="18"/>
-        </w:rPr>
-        <w:t xml:space="preserve"> default values.  This fixes an issue where Apollo I/O units were </w:t>
+        <w:t>specified</w:t>
+      </w:r>
+      <w:r>
+        <w:rPr>
+          <w:rFonts w:ascii="Arial" w:hAnsi="Arial" w:cs="Arial"/>
+          <w:color w:val="1F497D"/>
+          <w:sz w:val="18"/>
+          <w:szCs w:val="18"/>
+        </w:rPr>
+        <w:t xml:space="preserve"> default values.  This</w:t>
+      </w:r>
+      <w:r>
+        <w:rPr>
+          <w:rFonts w:ascii="Arial" w:hAnsi="Arial" w:cs="Arial"/>
+          <w:color w:val="1F497D"/>
+          <w:sz w:val="18"/>
+          <w:szCs w:val="18"/>
+        </w:rPr>
+        <w:t xml:space="preserve"> is to correct </w:t>
+      </w:r>
+      <w:r>
+        <w:rPr>
+          <w:rFonts w:ascii="Arial" w:hAnsi="Arial" w:cs="Arial"/>
+          <w:color w:val="1F497D"/>
+          <w:sz w:val="18"/>
+          <w:szCs w:val="18"/>
+        </w:rPr>
+        <w:t xml:space="preserve">an issue where Apollo I/O units were </w:t>
       </w:r>
       <w:r>
         <w:rPr>
@@ -348,25 +335,7 @@
           <w:sz w:val="18"/>
           <w:szCs w:val="18"/>
         </w:rPr>
-        <w:t xml:space="preserve">The Site Details page was not showing </w:t>
-      </w:r>
-      <w:r>
-        <w:rPr>
-          <w:rFonts w:ascii="Arial" w:hAnsi="Arial" w:cs="Arial"/>
-          <w:color w:val="1F497D"/>
-          <w:sz w:val="18"/>
-          <w:szCs w:val="18"/>
-        </w:rPr>
-        <w:t xml:space="preserve">recalibration </w:t>
-      </w:r>
-      <w:r>
-        <w:rPr>
-          <w:rFonts w:ascii="Arial" w:hAnsi="Arial" w:cs="Arial"/>
-          <w:color w:val="1F497D"/>
-          <w:sz w:val="18"/>
-          <w:szCs w:val="18"/>
-        </w:rPr>
-        <w:t>or day/night times when reading from a config that was created by the old XFP tools</w:t>
+        <w:t>The Site Details page was not showing recalibration or day/night times when reading from a config that was created by the old XFP tools</w:t>
       </w:r>
       <w:r>
         <w:rPr>
@@ -971,21 +940,30 @@
         <w:contextualSpacing/>
         <w:rPr>
           <w:rFonts w:ascii="Arial" w:hAnsi="Arial" w:cs="Arial"/>
+          <w:color w:val="1F497D"/>
+          <w:sz w:val="18"/>
+          <w:szCs w:val="18"/>
+        </w:rPr>
+      </w:pPr>
+      <w:r>
+        <w:rPr>
+          <w:rFonts w:ascii="Arial" w:hAnsi="Arial" w:cs="Arial"/>
+          <w:color w:val="1F497D"/>
+          <w:sz w:val="18"/>
+          <w:szCs w:val="18"/>
+        </w:rPr>
+        <w:tab/>
+      </w:r>
+      <w:r>
+        <w:rPr>
+          <w:rFonts w:ascii="Arial" w:hAnsi="Arial" w:cs="Arial"/>
           <w:i/>
           <w:iCs/>
           <w:color w:val="1F497D"/>
           <w:sz w:val="18"/>
           <w:szCs w:val="18"/>
         </w:rPr>
-      </w:pPr>
-      <w:r>
-        <w:rPr>
-          <w:rFonts w:ascii="Arial" w:hAnsi="Arial" w:cs="Arial"/>
-          <w:color w:val="1F497D"/>
-          <w:sz w:val="18"/>
-          <w:szCs w:val="18"/>
-        </w:rPr>
-        <w:tab/>
+        <w:t>For this, device names and zone descriptions are prefixed with type codes and zone numbers respectively.  If not already prefixed, before uploading the user is asked whether the pane</w:t>
       </w:r>
       <w:r>
         <w:rPr>
@@ -996,7 +974,7 @@
           <w:sz w:val="18"/>
           <w:szCs w:val="18"/>
         </w:rPr>
-        <w:t>For this, device names and zone descriptions are prefixed with type codes and zone numbers respectively.  If not already prefixed, before uploading the user is asked whether the pane</w:t>
+        <w:t>l</w:t>
       </w:r>
       <w:r>
         <w:rPr>
@@ -1007,42 +985,16 @@
           <w:sz w:val="18"/>
           <w:szCs w:val="18"/>
         </w:rPr>
-        <w:t>l</w:t>
-      </w:r>
-      <w:r>
-        <w:rPr>
-          <w:rFonts w:ascii="Arial" w:hAnsi="Arial" w:cs="Arial"/>
-          <w:i/>
-          <w:iCs/>
-          <w:color w:val="1F497D"/>
-          <w:sz w:val="18"/>
-          <w:szCs w:val="18"/>
-        </w:rPr>
-        <w:t xml:space="preserve"> is for Envision and, if </w:t>
-      </w:r>
-      <w:proofErr w:type="gramStart"/>
-      <w:r>
-        <w:rPr>
-          <w:rFonts w:ascii="Arial" w:hAnsi="Arial" w:cs="Arial"/>
-          <w:i/>
-          <w:iCs/>
-          <w:color w:val="1F497D"/>
-          <w:sz w:val="18"/>
-          <w:szCs w:val="18"/>
-        </w:rPr>
-        <w:t>Yes</w:t>
-      </w:r>
-      <w:proofErr w:type="gramEnd"/>
-      <w:r>
-        <w:rPr>
-          <w:rFonts w:ascii="Arial" w:hAnsi="Arial" w:cs="Arial"/>
-          <w:i/>
-          <w:iCs/>
-          <w:color w:val="1F497D"/>
-          <w:sz w:val="18"/>
-          <w:szCs w:val="18"/>
-        </w:rPr>
-        <w:t>, the prefixes are added.</w:t>
+        <w:t xml:space="preserve"> is for Envision and, if Yes, the prefixes are added.</w:t>
+      </w:r>
+      <w:r>
+        <w:rPr>
+          <w:rFonts w:ascii="Arial" w:hAnsi="Arial" w:cs="Arial"/>
+          <w:color w:val="1F497D"/>
+          <w:sz w:val="18"/>
+          <w:szCs w:val="18"/>
+        </w:rPr>
+        <w:br/>
       </w:r>
     </w:p>
     <w:p>
@@ -1187,17 +1139,7 @@
           <w:sz w:val="18"/>
           <w:szCs w:val="18"/>
         </w:rPr>
-        <w:t xml:space="preserve"> 2-loop </w:t>
-      </w:r>
-      <w:proofErr w:type="gramStart"/>
-      <w:r>
-        <w:rPr>
-          <w:rFonts w:ascii="Arial" w:hAnsi="Arial" w:cs="Arial"/>
-          <w:color w:val="1F497D"/>
-          <w:sz w:val="18"/>
-          <w:szCs w:val="18"/>
-        </w:rPr>
-        <w:t>panel</w:t>
+        <w:t xml:space="preserve"> 2-loop panel</w:t>
       </w:r>
       <w:r>
         <w:rPr>
@@ -1224,17 +1166,7 @@
           <w:sz w:val="18"/>
           <w:szCs w:val="18"/>
         </w:rPr>
-        <w:t>and</w:t>
-      </w:r>
-      <w:proofErr w:type="gramEnd"/>
-      <w:r>
-        <w:rPr>
-          <w:rFonts w:ascii="Arial" w:hAnsi="Arial" w:cs="Arial"/>
-          <w:color w:val="1F497D"/>
-          <w:sz w:val="18"/>
-          <w:szCs w:val="18"/>
-        </w:rPr>
-        <w:t xml:space="preserve"> </w:t>
+        <w:t xml:space="preserve">and </w:t>
       </w:r>
       <w:r>
         <w:rPr>
@@ -7083,45 +7015,14 @@
         </w:rPr>
         <w:tab/>
       </w:r>
-      <w:proofErr w:type="spellStart"/>
-      <w:r>
-        <w:rPr>
-          <w:rFonts w:ascii="Arial" w:hAnsi="Arial" w:cs="Arial"/>
-          <w:color w:val="1F4E79" w:themeColor="accent1" w:themeShade="80"/>
-          <w:sz w:val="18"/>
-          <w:szCs w:val="18"/>
-        </w:rPr>
-        <w:t>NumberSpinner</w:t>
-      </w:r>
-      <w:proofErr w:type="spellEnd"/>
-      <w:r>
-        <w:rPr>
-          <w:rFonts w:ascii="Arial" w:hAnsi="Arial" w:cs="Arial"/>
-          <w:color w:val="1F4E79" w:themeColor="accent1" w:themeShade="80"/>
-          <w:sz w:val="18"/>
-          <w:szCs w:val="18"/>
-        </w:rPr>
-        <w:t xml:space="preserve"> control: added </w:t>
-      </w:r>
-      <w:proofErr w:type="spellStart"/>
-      <w:r>
-        <w:rPr>
-          <w:rFonts w:ascii="Arial" w:hAnsi="Arial" w:cs="Arial"/>
-          <w:color w:val="1F4E79" w:themeColor="accent1" w:themeShade="80"/>
-          <w:sz w:val="18"/>
-          <w:szCs w:val="18"/>
-        </w:rPr>
-        <w:t>NumberSet</w:t>
-      </w:r>
-      <w:proofErr w:type="spellEnd"/>
-      <w:r>
-        <w:rPr>
-          <w:rFonts w:ascii="Arial" w:hAnsi="Arial" w:cs="Arial"/>
-          <w:color w:val="1F4E79" w:themeColor="accent1" w:themeShade="80"/>
-          <w:sz w:val="18"/>
-          <w:szCs w:val="18"/>
-        </w:rPr>
-        <w:t xml:space="preserve"> property, that defines the set of valid values for the case when the valid values are not consecutive, and </w:t>
+      <w:r>
+        <w:rPr>
+          <w:rFonts w:ascii="Arial" w:hAnsi="Arial" w:cs="Arial"/>
+          <w:color w:val="1F4E79" w:themeColor="accent1" w:themeShade="80"/>
+          <w:sz w:val="18"/>
+          <w:szCs w:val="18"/>
+        </w:rPr>
+        <w:t xml:space="preserve">NumberSpinner control: added NumberSet property, that defines the set of valid values for the case when the valid values are not consecutive, and </w:t>
       </w:r>
       <w:r>
         <w:rPr>
@@ -8076,37 +7977,7 @@
           <w:sz w:val="18"/>
           <w:szCs w:val="18"/>
         </w:rPr>
-        <w:t xml:space="preserve">Default </w:t>
-      </w:r>
-      <w:proofErr w:type="spellStart"/>
-      <w:r>
-        <w:rPr>
-          <w:rFonts w:ascii="Arial" w:hAnsi="Arial" w:cs="Arial"/>
-          <w:color w:val="1F4E79" w:themeColor="accent1" w:themeShade="80"/>
-          <w:sz w:val="18"/>
-          <w:szCs w:val="18"/>
-        </w:rPr>
-        <w:t>DeviceData</w:t>
-      </w:r>
-      <w:proofErr w:type="spellEnd"/>
-      <w:r>
-        <w:rPr>
-          <w:rFonts w:ascii="Arial" w:hAnsi="Arial" w:cs="Arial"/>
-          <w:color w:val="1F4E79" w:themeColor="accent1" w:themeShade="80"/>
-          <w:sz w:val="18"/>
-          <w:szCs w:val="18"/>
-        </w:rPr>
-        <w:t xml:space="preserve"> day/night modes are now set according to the device </w:t>
-      </w:r>
-      <w:proofErr w:type="gramStart"/>
-      <w:r>
-        <w:rPr>
-          <w:rFonts w:ascii="Arial" w:hAnsi="Arial" w:cs="Arial"/>
-          <w:color w:val="1F4E79" w:themeColor="accent1" w:themeShade="80"/>
-          <w:sz w:val="18"/>
-          <w:szCs w:val="18"/>
-        </w:rPr>
-        <w:t>type</w:t>
+        <w:t>Default DeviceData day/night modes are now set according to the device type</w:t>
       </w:r>
       <w:r>
         <w:rPr>
@@ -8124,17 +7995,7 @@
           <w:sz w:val="18"/>
           <w:szCs w:val="18"/>
         </w:rPr>
-        <w:t xml:space="preserve"> and</w:t>
-      </w:r>
-      <w:proofErr w:type="gramEnd"/>
-      <w:r>
-        <w:rPr>
-          <w:rFonts w:ascii="Arial" w:hAnsi="Arial" w:cs="Arial"/>
-          <w:color w:val="1F4E79" w:themeColor="accent1" w:themeShade="80"/>
-          <w:sz w:val="18"/>
-          <w:szCs w:val="18"/>
-        </w:rPr>
-        <w:t xml:space="preserve"> are set to default values when a device is changed or added.</w:t>
+        <w:t xml:space="preserve"> and are set to default values when a device is changed or added.</w:t>
       </w:r>
     </w:p>
     <w:p>
@@ -8793,27 +8654,7 @@
           <w:sz w:val="18"/>
           <w:szCs w:val="18"/>
         </w:rPr>
-        <w:t xml:space="preserve">; </w:t>
-      </w:r>
-      <w:proofErr w:type="gramStart"/>
-      <w:r>
-        <w:rPr>
-          <w:rFonts w:ascii="Arial" w:hAnsi="Arial" w:cs="Arial"/>
-          <w:color w:val="1F4E79" w:themeColor="accent1" w:themeShade="80"/>
-          <w:sz w:val="18"/>
-          <w:szCs w:val="18"/>
-        </w:rPr>
-        <w:t>also</w:t>
-      </w:r>
-      <w:proofErr w:type="gramEnd"/>
-      <w:r>
-        <w:rPr>
-          <w:rFonts w:ascii="Arial" w:hAnsi="Arial" w:cs="Arial"/>
-          <w:color w:val="1F4E79" w:themeColor="accent1" w:themeShade="80"/>
-          <w:sz w:val="18"/>
-          <w:szCs w:val="18"/>
-        </w:rPr>
-        <w:t xml:space="preserve"> the option to remove it from the Recent Files list</w:t>
+        <w:t>; also the option to remove it from the Recent Files list</w:t>
       </w:r>
       <w:r>
         <w:rPr>

</xml_diff>

<commit_message>
260414 XFP v8.1.15 release
•	The facility for customised icons and title bar background colour has been added to the MessageBox control.  Error and warning messages now use red and orange title bars respectively; the Envision upload MessageBox now shows a custom icon and title bar colour.
•	Zone names offset against the wrong zone corrected.
•	Fix: screen maximise now works.
•	Fix: the available Day/Night Mode options have been corrected for the various CAST Pro device types.
•	[Removed version logging to temp directory]
</commit_message>
<xml_diff>
--- a/XFP/Resources/XFP Revision History[en-GB].docx
+++ b/XFP/Resources/XFP Revision History[en-GB].docx
@@ -36,10 +36,8 @@
           <w:color w:val="9CC2E5" w:themeColor="accent1" w:themeTint="99"/>
           <w:sz w:val="16"/>
           <w:szCs w:val="16"/>
-          <w:lang w:val="fr-FR"/>
-        </w:rPr>
-      </w:pPr>
-      <w:proofErr w:type="gramStart"/>
+        </w:rPr>
+      </w:pPr>
       <w:r>
         <w:rPr>
           <w:rFonts w:ascii="Arial" w:hAnsi="Arial" w:cs="Arial"/>
@@ -48,11 +46,9 @@
           <w:color w:val="4472C4" w:themeColor="accent5"/>
           <w:sz w:val="24"/>
           <w:szCs w:val="24"/>
-          <w:lang w:val="fr-FR"/>
-        </w:rPr>
-        <w:t>v</w:t>
-      </w:r>
-      <w:proofErr w:type="gramEnd"/>
+        </w:rPr>
+        <w:t>v8.1.</w:t>
+      </w:r>
       <w:r>
         <w:rPr>
           <w:rFonts w:ascii="Arial" w:hAnsi="Arial" w:cs="Arial"/>
@@ -61,11 +57,9 @@
           <w:color w:val="4472C4" w:themeColor="accent5"/>
           <w:sz w:val="24"/>
           <w:szCs w:val="24"/>
-          <w:lang w:val="fr-FR"/>
-        </w:rPr>
-        <w:t>8.</w:t>
-      </w:r>
-      <w:proofErr w:type="gramStart"/>
+        </w:rPr>
+        <w:t>15</w:t>
+      </w:r>
       <w:r>
         <w:rPr>
           <w:rFonts w:ascii="Arial" w:hAnsi="Arial" w:cs="Arial"/>
@@ -74,9 +68,8 @@
           <w:color w:val="4472C4" w:themeColor="accent5"/>
           <w:sz w:val="24"/>
           <w:szCs w:val="24"/>
-          <w:lang w:val="fr-FR"/>
-        </w:rPr>
-        <w:t>1.</w:t>
+        </w:rPr>
+        <w:tab/>
       </w:r>
       <w:r>
         <w:rPr>
@@ -86,11 +79,9 @@
           <w:color w:val="4472C4" w:themeColor="accent5"/>
           <w:sz w:val="24"/>
           <w:szCs w:val="24"/>
-          <w:lang w:val="fr-FR"/>
-        </w:rPr>
-        <w:t>xx</w:t>
-      </w:r>
-      <w:proofErr w:type="gramEnd"/>
+        </w:rPr>
+        <w:t>14/</w:t>
+      </w:r>
       <w:r>
         <w:rPr>
           <w:rFonts w:ascii="Arial" w:hAnsi="Arial" w:cs="Arial"/>
@@ -99,9 +90,8 @@
           <w:color w:val="4472C4" w:themeColor="accent5"/>
           <w:sz w:val="24"/>
           <w:szCs w:val="24"/>
-          <w:lang w:val="fr-FR"/>
-        </w:rPr>
-        <w:tab/>
+        </w:rPr>
+        <w:t>04</w:t>
       </w:r>
       <w:r>
         <w:rPr>
@@ -111,43 +101,6 @@
           <w:color w:val="4472C4" w:themeColor="accent5"/>
           <w:sz w:val="24"/>
           <w:szCs w:val="24"/>
-          <w:lang w:val="fr-FR"/>
-        </w:rPr>
-        <w:t>xx</w:t>
-      </w:r>
-      <w:r>
-        <w:rPr>
-          <w:rFonts w:ascii="Arial" w:hAnsi="Arial" w:cs="Arial"/>
-          <w:b/>
-          <w:bCs/>
-          <w:color w:val="4472C4" w:themeColor="accent5"/>
-          <w:sz w:val="24"/>
-          <w:szCs w:val="24"/>
-          <w:lang w:val="fr-FR"/>
-        </w:rPr>
-        <w:t>/</w:t>
-      </w:r>
-      <w:r>
-        <w:rPr>
-          <w:rFonts w:ascii="Arial" w:hAnsi="Arial" w:cs="Arial"/>
-          <w:b/>
-          <w:bCs/>
-          <w:color w:val="4472C4" w:themeColor="accent5"/>
-          <w:sz w:val="24"/>
-          <w:szCs w:val="24"/>
-          <w:lang w:val="fr-FR"/>
-        </w:rPr>
-        <w:t>xx</w:t>
-      </w:r>
-      <w:r>
-        <w:rPr>
-          <w:rFonts w:ascii="Arial" w:hAnsi="Arial" w:cs="Arial"/>
-          <w:b/>
-          <w:bCs/>
-          <w:color w:val="4472C4" w:themeColor="accent5"/>
-          <w:sz w:val="24"/>
-          <w:szCs w:val="24"/>
-          <w:lang w:val="fr-FR"/>
         </w:rPr>
         <w:t>/2026</w:t>
       </w:r>
@@ -225,15 +178,6 @@
         <w:tab/>
         <w:t>The feature for custom icons and title bar colour has been added to the popup message box. For example, error and warning messages now use red and orange title bars respectively.</w:t>
       </w:r>
-      <w:r>
-        <w:rPr>
-          <w:rFonts w:ascii="Arial" w:hAnsi="Arial" w:cs="Arial"/>
-          <w:color w:val="1F497D"/>
-          <w:sz w:val="18"/>
-          <w:szCs w:val="18"/>
-        </w:rPr>
-        <w:br/>
-      </w:r>
     </w:p>
     <w:p>
       <w:pPr>
@@ -250,26 +194,11 @@
         <w:contextualSpacing/>
         <w:rPr>
           <w:rFonts w:ascii="Arial" w:hAnsi="Arial" w:cs="Arial"/>
-          <w:b/>
-          <w:bCs/>
-          <w:color w:val="1F497D"/>
-          <w:sz w:val="18"/>
-          <w:szCs w:val="18"/>
-          <w:lang w:val="fr-FR"/>
-        </w:rPr>
-      </w:pPr>
-      <w:r>
-        <w:rPr>
-          <w:rFonts w:ascii="Arial" w:hAnsi="Arial" w:cs="Arial"/>
-          <w:b/>
-          <w:bCs/>
-          <w:color w:val="1F497D"/>
-          <w:sz w:val="18"/>
-          <w:szCs w:val="18"/>
-          <w:lang w:val="fr-FR"/>
-        </w:rPr>
-        <w:t>Fixes</w:t>
-      </w:r>
+          <w:color w:val="1F497D"/>
+          <w:sz w:val="18"/>
+          <w:szCs w:val="18"/>
+        </w:rPr>
+      </w:pPr>
     </w:p>
     <w:p>
       <w:pPr>
@@ -286,47 +215,23 @@
         <w:contextualSpacing/>
         <w:rPr>
           <w:rFonts w:ascii="Arial" w:hAnsi="Arial" w:cs="Arial"/>
-          <w:color w:val="1F497D"/>
-          <w:sz w:val="18"/>
-          <w:szCs w:val="18"/>
-        </w:rPr>
-      </w:pPr>
-      <w:r>
-        <w:rPr>
-          <w:rFonts w:ascii="Arial" w:hAnsi="Arial" w:cs="Arial"/>
-          <w:color w:val="1F497D"/>
-          <w:sz w:val="18"/>
-          <w:szCs w:val="18"/>
-        </w:rPr>
-        <w:t>•</w:t>
-      </w:r>
-      <w:r>
-        <w:rPr>
-          <w:rFonts w:ascii="Arial" w:hAnsi="Arial" w:cs="Arial"/>
-          <w:color w:val="1F497D"/>
-          <w:sz w:val="18"/>
-          <w:szCs w:val="18"/>
-        </w:rPr>
-        <w:tab/>
-        <w:t xml:space="preserve">The </w:t>
-      </w:r>
-      <w:r>
-        <w:rPr>
-          <w:rFonts w:ascii="Arial" w:hAnsi="Arial" w:cs="Arial"/>
-          <w:color w:val="1F497D"/>
-          <w:sz w:val="18"/>
-          <w:szCs w:val="18"/>
-        </w:rPr>
-        <w:t>app’s Maximise W</w:t>
-      </w:r>
-      <w:r>
-        <w:rPr>
-          <w:rFonts w:ascii="Arial" w:hAnsi="Arial" w:cs="Arial"/>
-          <w:color w:val="1F497D"/>
-          <w:sz w:val="18"/>
-          <w:szCs w:val="18"/>
-        </w:rPr>
-        <w:t>indow button now works correctly.</w:t>
+          <w:b/>
+          <w:bCs/>
+          <w:color w:val="1F497D"/>
+          <w:sz w:val="18"/>
+          <w:szCs w:val="18"/>
+        </w:rPr>
+      </w:pPr>
+      <w:r>
+        <w:rPr>
+          <w:rFonts w:ascii="Arial" w:hAnsi="Arial" w:cs="Arial"/>
+          <w:b/>
+          <w:bCs/>
+          <w:color w:val="1F497D"/>
+          <w:sz w:val="18"/>
+          <w:szCs w:val="18"/>
+        </w:rPr>
+        <w:t>Fixes</w:t>
       </w:r>
     </w:p>
     <w:p>
@@ -366,7 +271,33 @@
           <w:szCs w:val="18"/>
         </w:rPr>
         <w:tab/>
-        <w:t>The available Day/Night mode options have been corrected for the different types of CAST Pro devices.</w:t>
+      </w:r>
+      <w:r>
+        <w:rPr>
+          <w:rFonts w:ascii="Arial" w:hAnsi="Arial" w:cs="Arial"/>
+          <w:color w:val="1F497D"/>
+          <w:sz w:val="18"/>
+          <w:szCs w:val="18"/>
+        </w:rPr>
+        <w:t xml:space="preserve">Zone </w:t>
+      </w:r>
+      <w:r>
+        <w:rPr>
+          <w:rFonts w:ascii="Arial" w:hAnsi="Arial" w:cs="Arial"/>
+          <w:color w:val="1F497D"/>
+          <w:sz w:val="18"/>
+          <w:szCs w:val="18"/>
+        </w:rPr>
+        <w:t>names sent to the XFP panel being placed on the wrong zone has been corrected</w:t>
+      </w:r>
+      <w:r>
+        <w:rPr>
+          <w:rFonts w:ascii="Arial" w:hAnsi="Arial" w:cs="Arial"/>
+          <w:color w:val="1F497D"/>
+          <w:sz w:val="18"/>
+          <w:szCs w:val="18"/>
+        </w:rPr>
+        <w:t>.</w:t>
       </w:r>
     </w:p>
     <w:p>
@@ -389,128 +320,24 @@
           <w:szCs w:val="18"/>
         </w:rPr>
       </w:pPr>
-    </w:p>
-    <w:p>
-      <w:pPr>
-        <w:tabs>
-          <w:tab w:val="left" w:pos="993"/>
-        </w:tabs>
-        <w:rPr>
-          <w:rFonts w:ascii="Arial" w:hAnsi="Arial" w:cs="Arial"/>
-          <w:color w:val="9CC2E5" w:themeColor="accent1" w:themeTint="99"/>
-          <w:sz w:val="16"/>
-          <w:szCs w:val="16"/>
-        </w:rPr>
-      </w:pPr>
-      <w:r>
-        <w:rPr>
-          <w:rFonts w:ascii="Arial" w:hAnsi="Arial" w:cs="Arial"/>
-          <w:b/>
-          <w:bCs/>
-          <w:color w:val="4472C4" w:themeColor="accent5"/>
-          <w:sz w:val="24"/>
-          <w:szCs w:val="24"/>
-        </w:rPr>
-        <w:t>v8.1.</w:t>
-      </w:r>
-      <w:r>
-        <w:rPr>
-          <w:rFonts w:ascii="Arial" w:hAnsi="Arial" w:cs="Arial"/>
-          <w:b/>
-          <w:bCs/>
-          <w:color w:val="4472C4" w:themeColor="accent5"/>
-          <w:sz w:val="24"/>
-          <w:szCs w:val="24"/>
-        </w:rPr>
-        <w:t>1</w:t>
-      </w:r>
-      <w:r>
-        <w:rPr>
-          <w:rFonts w:ascii="Arial" w:hAnsi="Arial" w:cs="Arial"/>
-          <w:b/>
-          <w:bCs/>
-          <w:color w:val="4472C4" w:themeColor="accent5"/>
-          <w:sz w:val="24"/>
-          <w:szCs w:val="24"/>
-        </w:rPr>
-        <w:t>4</w:t>
-      </w:r>
-      <w:r>
-        <w:rPr>
-          <w:rFonts w:ascii="Arial" w:hAnsi="Arial" w:cs="Arial"/>
-          <w:b/>
-          <w:bCs/>
-          <w:color w:val="4472C4" w:themeColor="accent5"/>
-          <w:sz w:val="24"/>
-          <w:szCs w:val="24"/>
+      <w:r>
+        <w:rPr>
+          <w:rFonts w:ascii="Arial" w:hAnsi="Arial" w:cs="Arial"/>
+          <w:color w:val="1F497D"/>
+          <w:sz w:val="18"/>
+          <w:szCs w:val="18"/>
+        </w:rPr>
+        <w:t>•</w:t>
+      </w:r>
+      <w:r>
+        <w:rPr>
+          <w:rFonts w:ascii="Arial" w:hAnsi="Arial" w:cs="Arial"/>
+          <w:color w:val="1F497D"/>
+          <w:sz w:val="18"/>
+          <w:szCs w:val="18"/>
         </w:rPr>
         <w:tab/>
-      </w:r>
-      <w:r>
-        <w:rPr>
-          <w:rFonts w:ascii="Arial" w:hAnsi="Arial" w:cs="Arial"/>
-          <w:b/>
-          <w:bCs/>
-          <w:color w:val="4472C4" w:themeColor="accent5"/>
-          <w:sz w:val="24"/>
-          <w:szCs w:val="24"/>
-        </w:rPr>
-        <w:t>01</w:t>
-      </w:r>
-      <w:r>
-        <w:rPr>
-          <w:rFonts w:ascii="Arial" w:hAnsi="Arial" w:cs="Arial"/>
-          <w:b/>
-          <w:bCs/>
-          <w:color w:val="4472C4" w:themeColor="accent5"/>
-          <w:sz w:val="24"/>
-          <w:szCs w:val="24"/>
-        </w:rPr>
-        <w:t>/</w:t>
-      </w:r>
-      <w:r>
-        <w:rPr>
-          <w:rFonts w:ascii="Arial" w:hAnsi="Arial" w:cs="Arial"/>
-          <w:b/>
-          <w:bCs/>
-          <w:color w:val="4472C4" w:themeColor="accent5"/>
-          <w:sz w:val="24"/>
-          <w:szCs w:val="24"/>
-        </w:rPr>
-        <w:t>0</w:t>
-      </w:r>
-      <w:r>
-        <w:rPr>
-          <w:rFonts w:ascii="Arial" w:hAnsi="Arial" w:cs="Arial"/>
-          <w:b/>
-          <w:bCs/>
-          <w:color w:val="4472C4" w:themeColor="accent5"/>
-          <w:sz w:val="24"/>
-          <w:szCs w:val="24"/>
-        </w:rPr>
-        <w:t>4</w:t>
-      </w:r>
-      <w:r>
-        <w:rPr>
-          <w:rFonts w:ascii="Arial" w:hAnsi="Arial" w:cs="Arial"/>
-          <w:b/>
-          <w:bCs/>
-          <w:color w:val="4472C4" w:themeColor="accent5"/>
-          <w:sz w:val="24"/>
-          <w:szCs w:val="24"/>
-        </w:rPr>
-        <w:t>/202</w:t>
-      </w:r>
-      <w:r>
-        <w:rPr>
-          <w:rFonts w:ascii="Arial" w:hAnsi="Arial" w:cs="Arial"/>
-          <w:b/>
-          <w:bCs/>
-          <w:color w:val="4472C4" w:themeColor="accent5"/>
-          <w:sz w:val="24"/>
-          <w:szCs w:val="24"/>
-        </w:rPr>
-        <w:t>6</w:t>
+        <w:t>The available Day/Night mode options have been corrected for the different types of CAST Pro devices.</w:t>
       </w:r>
     </w:p>
     <w:p>
@@ -528,23 +355,47 @@
         <w:contextualSpacing/>
         <w:rPr>
           <w:rFonts w:ascii="Arial" w:hAnsi="Arial" w:cs="Arial"/>
-          <w:b/>
-          <w:bCs/>
-          <w:color w:val="1F497D"/>
-          <w:sz w:val="18"/>
-          <w:szCs w:val="18"/>
-        </w:rPr>
-      </w:pPr>
-      <w:r>
-        <w:rPr>
-          <w:rFonts w:ascii="Arial" w:hAnsi="Arial" w:cs="Arial"/>
-          <w:b/>
-          <w:bCs/>
-          <w:color w:val="1F497D"/>
-          <w:sz w:val="18"/>
-          <w:szCs w:val="18"/>
-        </w:rPr>
-        <w:t>Fixes</w:t>
+          <w:color w:val="1F497D"/>
+          <w:sz w:val="18"/>
+          <w:szCs w:val="18"/>
+        </w:rPr>
+      </w:pPr>
+      <w:r>
+        <w:rPr>
+          <w:rFonts w:ascii="Arial" w:hAnsi="Arial" w:cs="Arial"/>
+          <w:color w:val="1F497D"/>
+          <w:sz w:val="18"/>
+          <w:szCs w:val="18"/>
+        </w:rPr>
+        <w:t>•</w:t>
+      </w:r>
+      <w:r>
+        <w:rPr>
+          <w:rFonts w:ascii="Arial" w:hAnsi="Arial" w:cs="Arial"/>
+          <w:color w:val="1F497D"/>
+          <w:sz w:val="18"/>
+          <w:szCs w:val="18"/>
+        </w:rPr>
+        <w:tab/>
+        <w:t xml:space="preserve">The </w:t>
+      </w:r>
+      <w:r>
+        <w:rPr>
+          <w:rFonts w:ascii="Arial" w:hAnsi="Arial" w:cs="Arial"/>
+          <w:color w:val="1F497D"/>
+          <w:sz w:val="18"/>
+          <w:szCs w:val="18"/>
+        </w:rPr>
+        <w:t>app’s Maximise W</w:t>
+      </w:r>
+      <w:r>
+        <w:rPr>
+          <w:rFonts w:ascii="Arial" w:hAnsi="Arial" w:cs="Arial"/>
+          <w:color w:val="1F497D"/>
+          <w:sz w:val="18"/>
+          <w:szCs w:val="18"/>
+        </w:rPr>
+        <w:t>indow button now works correctly.</w:t>
       </w:r>
     </w:p>
     <w:p>
@@ -567,113 +418,128 @@
           <w:szCs w:val="18"/>
         </w:rPr>
       </w:pPr>
-      <w:r>
-        <w:rPr>
-          <w:rFonts w:ascii="Arial" w:hAnsi="Arial" w:cs="Arial"/>
-          <w:color w:val="1F497D"/>
-          <w:sz w:val="18"/>
-          <w:szCs w:val="18"/>
-        </w:rPr>
-        <w:t>•</w:t>
-      </w:r>
-      <w:r>
-        <w:rPr>
-          <w:rFonts w:ascii="Arial" w:hAnsi="Arial" w:cs="Arial"/>
-          <w:color w:val="1F497D"/>
-          <w:sz w:val="18"/>
-          <w:szCs w:val="18"/>
+    </w:p>
+    <w:p>
+      <w:pPr>
+        <w:tabs>
+          <w:tab w:val="left" w:pos="993"/>
+        </w:tabs>
+        <w:rPr>
+          <w:rFonts w:ascii="Arial" w:hAnsi="Arial" w:cs="Arial"/>
+          <w:color w:val="9CC2E5" w:themeColor="accent1" w:themeTint="99"/>
+          <w:sz w:val="16"/>
+          <w:szCs w:val="16"/>
+        </w:rPr>
+      </w:pPr>
+      <w:r>
+        <w:rPr>
+          <w:rFonts w:ascii="Arial" w:hAnsi="Arial" w:cs="Arial"/>
+          <w:b/>
+          <w:bCs/>
+          <w:color w:val="4472C4" w:themeColor="accent5"/>
+          <w:sz w:val="24"/>
+          <w:szCs w:val="24"/>
+        </w:rPr>
+        <w:t>v8.1.</w:t>
+      </w:r>
+      <w:r>
+        <w:rPr>
+          <w:rFonts w:ascii="Arial" w:hAnsi="Arial" w:cs="Arial"/>
+          <w:b/>
+          <w:bCs/>
+          <w:color w:val="4472C4" w:themeColor="accent5"/>
+          <w:sz w:val="24"/>
+          <w:szCs w:val="24"/>
+        </w:rPr>
+        <w:t>1</w:t>
+      </w:r>
+      <w:r>
+        <w:rPr>
+          <w:rFonts w:ascii="Arial" w:hAnsi="Arial" w:cs="Arial"/>
+          <w:b/>
+          <w:bCs/>
+          <w:color w:val="4472C4" w:themeColor="accent5"/>
+          <w:sz w:val="24"/>
+          <w:szCs w:val="24"/>
+        </w:rPr>
+        <w:t>4</w:t>
+      </w:r>
+      <w:r>
+        <w:rPr>
+          <w:rFonts w:ascii="Arial" w:hAnsi="Arial" w:cs="Arial"/>
+          <w:b/>
+          <w:bCs/>
+          <w:color w:val="4472C4" w:themeColor="accent5"/>
+          <w:sz w:val="24"/>
+          <w:szCs w:val="24"/>
         </w:rPr>
         <w:tab/>
       </w:r>
       <w:r>
         <w:rPr>
           <w:rFonts w:ascii="Arial" w:hAnsi="Arial" w:cs="Arial"/>
-          <w:color w:val="1F497D"/>
-          <w:sz w:val="18"/>
-          <w:szCs w:val="18"/>
-        </w:rPr>
-        <w:t xml:space="preserve">The data for </w:t>
-      </w:r>
-      <w:r>
-        <w:rPr>
-          <w:rFonts w:ascii="Arial" w:hAnsi="Arial" w:cs="Arial"/>
-          <w:color w:val="1F497D"/>
-          <w:sz w:val="18"/>
-          <w:szCs w:val="18"/>
-        </w:rPr>
-        <w:t>‘</w:t>
-      </w:r>
-      <w:r>
-        <w:rPr>
-          <w:rFonts w:ascii="Arial" w:hAnsi="Arial" w:cs="Arial"/>
-          <w:color w:val="1F497D"/>
-          <w:sz w:val="18"/>
-          <w:szCs w:val="18"/>
-        </w:rPr>
-        <w:t>e</w:t>
-      </w:r>
-      <w:r>
-        <w:rPr>
-          <w:rFonts w:ascii="Arial" w:hAnsi="Arial" w:cs="Arial"/>
-          <w:color w:val="1F497D"/>
-          <w:sz w:val="18"/>
-          <w:szCs w:val="18"/>
-        </w:rPr>
-        <w:t xml:space="preserve">mpty’ device slots are now set with </w:t>
-      </w:r>
-      <w:r>
-        <w:rPr>
-          <w:rFonts w:ascii="Arial" w:hAnsi="Arial" w:cs="Arial"/>
-          <w:color w:val="1F497D"/>
-          <w:sz w:val="18"/>
-          <w:szCs w:val="18"/>
-        </w:rPr>
-        <w:t>specified</w:t>
-      </w:r>
-      <w:r>
-        <w:rPr>
-          <w:rFonts w:ascii="Arial" w:hAnsi="Arial" w:cs="Arial"/>
-          <w:color w:val="1F497D"/>
-          <w:sz w:val="18"/>
-          <w:szCs w:val="18"/>
-        </w:rPr>
-        <w:t xml:space="preserve"> default values.  This</w:t>
-      </w:r>
-      <w:r>
-        <w:rPr>
-          <w:rFonts w:ascii="Arial" w:hAnsi="Arial" w:cs="Arial"/>
-          <w:color w:val="1F497D"/>
-          <w:sz w:val="18"/>
-          <w:szCs w:val="18"/>
-        </w:rPr>
-        <w:t xml:space="preserve"> is to correct </w:t>
-      </w:r>
-      <w:r>
-        <w:rPr>
-          <w:rFonts w:ascii="Arial" w:hAnsi="Arial" w:cs="Arial"/>
-          <w:color w:val="1F497D"/>
-          <w:sz w:val="18"/>
-          <w:szCs w:val="18"/>
-        </w:rPr>
-        <w:t xml:space="preserve">an issue where Apollo I/O units were </w:t>
-      </w:r>
-      <w:r>
-        <w:rPr>
-          <w:rFonts w:ascii="Arial" w:hAnsi="Arial" w:cs="Arial"/>
-          <w:color w:val="1F497D"/>
-          <w:sz w:val="18"/>
-          <w:szCs w:val="18"/>
-        </w:rPr>
-        <w:t xml:space="preserve">incorrectly </w:t>
-      </w:r>
-      <w:r>
-        <w:rPr>
-          <w:rFonts w:ascii="Arial" w:hAnsi="Arial" w:cs="Arial"/>
-          <w:color w:val="1F497D"/>
-          <w:sz w:val="18"/>
-          <w:szCs w:val="18"/>
-        </w:rPr>
-        <w:t>resetting on Silence.</w:t>
+          <w:b/>
+          <w:bCs/>
+          <w:color w:val="4472C4" w:themeColor="accent5"/>
+          <w:sz w:val="24"/>
+          <w:szCs w:val="24"/>
+        </w:rPr>
+        <w:t>01</w:t>
+      </w:r>
+      <w:r>
+        <w:rPr>
+          <w:rFonts w:ascii="Arial" w:hAnsi="Arial" w:cs="Arial"/>
+          <w:b/>
+          <w:bCs/>
+          <w:color w:val="4472C4" w:themeColor="accent5"/>
+          <w:sz w:val="24"/>
+          <w:szCs w:val="24"/>
+        </w:rPr>
+        <w:t>/</w:t>
+      </w:r>
+      <w:r>
+        <w:rPr>
+          <w:rFonts w:ascii="Arial" w:hAnsi="Arial" w:cs="Arial"/>
+          <w:b/>
+          <w:bCs/>
+          <w:color w:val="4472C4" w:themeColor="accent5"/>
+          <w:sz w:val="24"/>
+          <w:szCs w:val="24"/>
+        </w:rPr>
+        <w:t>0</w:t>
+      </w:r>
+      <w:r>
+        <w:rPr>
+          <w:rFonts w:ascii="Arial" w:hAnsi="Arial" w:cs="Arial"/>
+          <w:b/>
+          <w:bCs/>
+          <w:color w:val="4472C4" w:themeColor="accent5"/>
+          <w:sz w:val="24"/>
+          <w:szCs w:val="24"/>
+        </w:rPr>
+        <w:t>4</w:t>
+      </w:r>
+      <w:r>
+        <w:rPr>
+          <w:rFonts w:ascii="Arial" w:hAnsi="Arial" w:cs="Arial"/>
+          <w:b/>
+          <w:bCs/>
+          <w:color w:val="4472C4" w:themeColor="accent5"/>
+          <w:sz w:val="24"/>
+          <w:szCs w:val="24"/>
+        </w:rPr>
+        <w:t>/202</w:t>
+      </w:r>
+      <w:r>
+        <w:rPr>
+          <w:rFonts w:ascii="Arial" w:hAnsi="Arial" w:cs="Arial"/>
+          <w:b/>
+          <w:bCs/>
+          <w:color w:val="4472C4" w:themeColor="accent5"/>
+          <w:sz w:val="24"/>
+          <w:szCs w:val="24"/>
+        </w:rPr>
+        <w:t>6</w:t>
       </w:r>
     </w:p>
     <w:p>
@@ -691,46 +557,23 @@
         <w:contextualSpacing/>
         <w:rPr>
           <w:rFonts w:ascii="Arial" w:hAnsi="Arial" w:cs="Arial"/>
-          <w:color w:val="1F497D"/>
-          <w:sz w:val="18"/>
-          <w:szCs w:val="18"/>
-        </w:rPr>
-      </w:pPr>
-      <w:r>
-        <w:rPr>
-          <w:rFonts w:ascii="Arial" w:hAnsi="Arial" w:cs="Arial"/>
-          <w:color w:val="1F497D"/>
-          <w:sz w:val="18"/>
-          <w:szCs w:val="18"/>
-        </w:rPr>
-        <w:t>•</w:t>
-      </w:r>
-      <w:r>
-        <w:rPr>
-          <w:rFonts w:ascii="Arial" w:hAnsi="Arial" w:cs="Arial"/>
-          <w:color w:val="1F497D"/>
-          <w:sz w:val="18"/>
-          <w:szCs w:val="18"/>
-        </w:rPr>
-        <w:tab/>
-      </w:r>
-      <w:r>
-        <w:rPr>
-          <w:rFonts w:ascii="Arial" w:hAnsi="Arial" w:cs="Arial"/>
-          <w:color w:val="1F497D"/>
-          <w:sz w:val="18"/>
-          <w:szCs w:val="18"/>
-        </w:rPr>
-        <w:t>The Site Details page was not showing recalibration or day/night times when reading from a config that was created by the old XFP tools</w:t>
-      </w:r>
-      <w:r>
-        <w:rPr>
-          <w:rFonts w:ascii="Arial" w:hAnsi="Arial" w:cs="Arial"/>
-          <w:color w:val="1F497D"/>
-          <w:sz w:val="18"/>
-          <w:szCs w:val="18"/>
-        </w:rPr>
-        <w:t>.</w:t>
+          <w:b/>
+          <w:bCs/>
+          <w:color w:val="1F497D"/>
+          <w:sz w:val="18"/>
+          <w:szCs w:val="18"/>
+        </w:rPr>
+      </w:pPr>
+      <w:r>
+        <w:rPr>
+          <w:rFonts w:ascii="Arial" w:hAnsi="Arial" w:cs="Arial"/>
+          <w:b/>
+          <w:bCs/>
+          <w:color w:val="1F497D"/>
+          <w:sz w:val="18"/>
+          <w:szCs w:val="18"/>
+        </w:rPr>
+        <w:t>Fixes</w:t>
       </w:r>
     </w:p>
     <w:p>
@@ -753,106 +596,113 @@
           <w:szCs w:val="18"/>
         </w:rPr>
       </w:pPr>
-    </w:p>
-    <w:p>
-      <w:pPr>
-        <w:tabs>
-          <w:tab w:val="left" w:pos="993"/>
-        </w:tabs>
-        <w:rPr>
-          <w:rFonts w:ascii="Arial" w:hAnsi="Arial" w:cs="Arial"/>
-          <w:color w:val="9CC2E5" w:themeColor="accent1" w:themeTint="99"/>
-          <w:sz w:val="16"/>
-          <w:szCs w:val="16"/>
-        </w:rPr>
-      </w:pPr>
-      <w:r>
-        <w:rPr>
-          <w:rFonts w:ascii="Arial" w:hAnsi="Arial" w:cs="Arial"/>
-          <w:b/>
-          <w:bCs/>
-          <w:color w:val="4472C4" w:themeColor="accent5"/>
-          <w:sz w:val="24"/>
-          <w:szCs w:val="24"/>
-        </w:rPr>
-        <w:t>v8.1.</w:t>
-      </w:r>
-      <w:r>
-        <w:rPr>
-          <w:rFonts w:ascii="Arial" w:hAnsi="Arial" w:cs="Arial"/>
-          <w:b/>
-          <w:bCs/>
-          <w:color w:val="4472C4" w:themeColor="accent5"/>
-          <w:sz w:val="24"/>
-          <w:szCs w:val="24"/>
-        </w:rPr>
-        <w:t>10</w:t>
-      </w:r>
-      <w:r>
-        <w:rPr>
-          <w:rFonts w:ascii="Arial" w:hAnsi="Arial" w:cs="Arial"/>
-          <w:b/>
-          <w:bCs/>
-          <w:color w:val="4472C4" w:themeColor="accent5"/>
-          <w:sz w:val="24"/>
-          <w:szCs w:val="24"/>
+      <w:r>
+        <w:rPr>
+          <w:rFonts w:ascii="Arial" w:hAnsi="Arial" w:cs="Arial"/>
+          <w:color w:val="1F497D"/>
+          <w:sz w:val="18"/>
+          <w:szCs w:val="18"/>
+        </w:rPr>
+        <w:t>•</w:t>
+      </w:r>
+      <w:r>
+        <w:rPr>
+          <w:rFonts w:ascii="Arial" w:hAnsi="Arial" w:cs="Arial"/>
+          <w:color w:val="1F497D"/>
+          <w:sz w:val="18"/>
+          <w:szCs w:val="18"/>
         </w:rPr>
         <w:tab/>
       </w:r>
       <w:r>
         <w:rPr>
           <w:rFonts w:ascii="Arial" w:hAnsi="Arial" w:cs="Arial"/>
-          <w:b/>
-          <w:bCs/>
-          <w:color w:val="4472C4" w:themeColor="accent5"/>
-          <w:sz w:val="24"/>
-          <w:szCs w:val="24"/>
-        </w:rPr>
-        <w:t>16</w:t>
-      </w:r>
-      <w:r>
-        <w:rPr>
-          <w:rFonts w:ascii="Arial" w:hAnsi="Arial" w:cs="Arial"/>
-          <w:b/>
-          <w:bCs/>
-          <w:color w:val="4472C4" w:themeColor="accent5"/>
-          <w:sz w:val="24"/>
-          <w:szCs w:val="24"/>
-        </w:rPr>
-        <w:t>/</w:t>
-      </w:r>
-      <w:r>
-        <w:rPr>
-          <w:rFonts w:ascii="Arial" w:hAnsi="Arial" w:cs="Arial"/>
-          <w:b/>
-          <w:bCs/>
-          <w:color w:val="4472C4" w:themeColor="accent5"/>
-          <w:sz w:val="24"/>
-          <w:szCs w:val="24"/>
-        </w:rPr>
-        <w:t>02</w:t>
-      </w:r>
-      <w:r>
-        <w:rPr>
-          <w:rFonts w:ascii="Arial" w:hAnsi="Arial" w:cs="Arial"/>
-          <w:b/>
-          <w:bCs/>
-          <w:color w:val="4472C4" w:themeColor="accent5"/>
-          <w:sz w:val="24"/>
-          <w:szCs w:val="24"/>
-        </w:rPr>
-        <w:t>/202</w:t>
-      </w:r>
-      <w:r>
-        <w:rPr>
-          <w:rFonts w:ascii="Arial" w:hAnsi="Arial" w:cs="Arial"/>
-          <w:b/>
-          <w:bCs/>
-          <w:color w:val="4472C4" w:themeColor="accent5"/>
-          <w:sz w:val="24"/>
-          <w:szCs w:val="24"/>
-        </w:rPr>
-        <w:t>6</w:t>
+          <w:color w:val="1F497D"/>
+          <w:sz w:val="18"/>
+          <w:szCs w:val="18"/>
+        </w:rPr>
+        <w:t xml:space="preserve">The data for </w:t>
+      </w:r>
+      <w:r>
+        <w:rPr>
+          <w:rFonts w:ascii="Arial" w:hAnsi="Arial" w:cs="Arial"/>
+          <w:color w:val="1F497D"/>
+          <w:sz w:val="18"/>
+          <w:szCs w:val="18"/>
+        </w:rPr>
+        <w:t>‘</w:t>
+      </w:r>
+      <w:r>
+        <w:rPr>
+          <w:rFonts w:ascii="Arial" w:hAnsi="Arial" w:cs="Arial"/>
+          <w:color w:val="1F497D"/>
+          <w:sz w:val="18"/>
+          <w:szCs w:val="18"/>
+        </w:rPr>
+        <w:t>e</w:t>
+      </w:r>
+      <w:r>
+        <w:rPr>
+          <w:rFonts w:ascii="Arial" w:hAnsi="Arial" w:cs="Arial"/>
+          <w:color w:val="1F497D"/>
+          <w:sz w:val="18"/>
+          <w:szCs w:val="18"/>
+        </w:rPr>
+        <w:t xml:space="preserve">mpty’ device slots are now set with </w:t>
+      </w:r>
+      <w:r>
+        <w:rPr>
+          <w:rFonts w:ascii="Arial" w:hAnsi="Arial" w:cs="Arial"/>
+          <w:color w:val="1F497D"/>
+          <w:sz w:val="18"/>
+          <w:szCs w:val="18"/>
+        </w:rPr>
+        <w:t>specified</w:t>
+      </w:r>
+      <w:r>
+        <w:rPr>
+          <w:rFonts w:ascii="Arial" w:hAnsi="Arial" w:cs="Arial"/>
+          <w:color w:val="1F497D"/>
+          <w:sz w:val="18"/>
+          <w:szCs w:val="18"/>
+        </w:rPr>
+        <w:t xml:space="preserve"> default values.  This</w:t>
+      </w:r>
+      <w:r>
+        <w:rPr>
+          <w:rFonts w:ascii="Arial" w:hAnsi="Arial" w:cs="Arial"/>
+          <w:color w:val="1F497D"/>
+          <w:sz w:val="18"/>
+          <w:szCs w:val="18"/>
+        </w:rPr>
+        <w:t xml:space="preserve"> is to correct </w:t>
+      </w:r>
+      <w:r>
+        <w:rPr>
+          <w:rFonts w:ascii="Arial" w:hAnsi="Arial" w:cs="Arial"/>
+          <w:color w:val="1F497D"/>
+          <w:sz w:val="18"/>
+          <w:szCs w:val="18"/>
+        </w:rPr>
+        <w:t xml:space="preserve">an issue where Apollo I/O units were </w:t>
+      </w:r>
+      <w:r>
+        <w:rPr>
+          <w:rFonts w:ascii="Arial" w:hAnsi="Arial" w:cs="Arial"/>
+          <w:color w:val="1F497D"/>
+          <w:sz w:val="18"/>
+          <w:szCs w:val="18"/>
+        </w:rPr>
+        <w:t xml:space="preserve">incorrectly </w:t>
+      </w:r>
+      <w:r>
+        <w:rPr>
+          <w:rFonts w:ascii="Arial" w:hAnsi="Arial" w:cs="Arial"/>
+          <w:color w:val="1F497D"/>
+          <w:sz w:val="18"/>
+          <w:szCs w:val="18"/>
+        </w:rPr>
+        <w:t>resetting on Silence.</w:t>
       </w:r>
     </w:p>
     <w:p>
@@ -870,23 +720,46 @@
         <w:contextualSpacing/>
         <w:rPr>
           <w:rFonts w:ascii="Arial" w:hAnsi="Arial" w:cs="Arial"/>
-          <w:b/>
-          <w:bCs/>
-          <w:color w:val="1F497D"/>
-          <w:sz w:val="18"/>
-          <w:szCs w:val="18"/>
-        </w:rPr>
-      </w:pPr>
-      <w:r>
-        <w:rPr>
-          <w:rFonts w:ascii="Arial" w:hAnsi="Arial" w:cs="Arial"/>
-          <w:b/>
-          <w:bCs/>
-          <w:color w:val="1F497D"/>
-          <w:sz w:val="18"/>
-          <w:szCs w:val="18"/>
-        </w:rPr>
-        <w:t>New features</w:t>
+          <w:color w:val="1F497D"/>
+          <w:sz w:val="18"/>
+          <w:szCs w:val="18"/>
+        </w:rPr>
+      </w:pPr>
+      <w:r>
+        <w:rPr>
+          <w:rFonts w:ascii="Arial" w:hAnsi="Arial" w:cs="Arial"/>
+          <w:color w:val="1F497D"/>
+          <w:sz w:val="18"/>
+          <w:szCs w:val="18"/>
+        </w:rPr>
+        <w:t>•</w:t>
+      </w:r>
+      <w:r>
+        <w:rPr>
+          <w:rFonts w:ascii="Arial" w:hAnsi="Arial" w:cs="Arial"/>
+          <w:color w:val="1F497D"/>
+          <w:sz w:val="18"/>
+          <w:szCs w:val="18"/>
+        </w:rPr>
+        <w:tab/>
+      </w:r>
+      <w:r>
+        <w:rPr>
+          <w:rFonts w:ascii="Arial" w:hAnsi="Arial" w:cs="Arial"/>
+          <w:color w:val="1F497D"/>
+          <w:sz w:val="18"/>
+          <w:szCs w:val="18"/>
+        </w:rPr>
+        <w:t>The Site Details page was not showing recalibration or day/night times when reading from a config that was created by the old XFP tools</w:t>
+      </w:r>
+      <w:r>
+        <w:rPr>
+          <w:rFonts w:ascii="Arial" w:hAnsi="Arial" w:cs="Arial"/>
+          <w:color w:val="1F497D"/>
+          <w:sz w:val="18"/>
+          <w:szCs w:val="18"/>
+        </w:rPr>
+        <w:t>.</w:t>
       </w:r>
     </w:p>
     <w:p>
@@ -909,41 +782,106 @@
           <w:szCs w:val="18"/>
         </w:rPr>
       </w:pPr>
-      <w:r>
-        <w:rPr>
-          <w:rFonts w:ascii="Arial" w:hAnsi="Arial" w:cs="Arial"/>
-          <w:color w:val="1F497D"/>
-          <w:sz w:val="18"/>
-          <w:szCs w:val="18"/>
-        </w:rPr>
-        <w:t>•</w:t>
-      </w:r>
-      <w:r>
-        <w:rPr>
-          <w:rFonts w:ascii="Arial" w:hAnsi="Arial" w:cs="Arial"/>
-          <w:color w:val="1F497D"/>
-          <w:sz w:val="18"/>
-          <w:szCs w:val="18"/>
+    </w:p>
+    <w:p>
+      <w:pPr>
+        <w:tabs>
+          <w:tab w:val="left" w:pos="993"/>
+        </w:tabs>
+        <w:rPr>
+          <w:rFonts w:ascii="Arial" w:hAnsi="Arial" w:cs="Arial"/>
+          <w:color w:val="9CC2E5" w:themeColor="accent1" w:themeTint="99"/>
+          <w:sz w:val="16"/>
+          <w:szCs w:val="16"/>
+        </w:rPr>
+      </w:pPr>
+      <w:r>
+        <w:rPr>
+          <w:rFonts w:ascii="Arial" w:hAnsi="Arial" w:cs="Arial"/>
+          <w:b/>
+          <w:bCs/>
+          <w:color w:val="4472C4" w:themeColor="accent5"/>
+          <w:sz w:val="24"/>
+          <w:szCs w:val="24"/>
+        </w:rPr>
+        <w:t>v8.1.</w:t>
+      </w:r>
+      <w:r>
+        <w:rPr>
+          <w:rFonts w:ascii="Arial" w:hAnsi="Arial" w:cs="Arial"/>
+          <w:b/>
+          <w:bCs/>
+          <w:color w:val="4472C4" w:themeColor="accent5"/>
+          <w:sz w:val="24"/>
+          <w:szCs w:val="24"/>
+        </w:rPr>
+        <w:t>10</w:t>
+      </w:r>
+      <w:r>
+        <w:rPr>
+          <w:rFonts w:ascii="Arial" w:hAnsi="Arial" w:cs="Arial"/>
+          <w:b/>
+          <w:bCs/>
+          <w:color w:val="4472C4" w:themeColor="accent5"/>
+          <w:sz w:val="24"/>
+          <w:szCs w:val="24"/>
         </w:rPr>
         <w:tab/>
       </w:r>
       <w:r>
         <w:rPr>
           <w:rFonts w:ascii="Arial" w:hAnsi="Arial" w:cs="Arial"/>
-          <w:color w:val="1F497D"/>
-          <w:sz w:val="18"/>
-          <w:szCs w:val="18"/>
-        </w:rPr>
-        <w:t>Support for Spanish language has</w:t>
-      </w:r>
-      <w:r>
-        <w:rPr>
-          <w:rFonts w:ascii="Arial" w:hAnsi="Arial" w:cs="Arial"/>
-          <w:color w:val="1F497D"/>
-          <w:sz w:val="18"/>
-          <w:szCs w:val="18"/>
-        </w:rPr>
-        <w:t xml:space="preserve"> been added.</w:t>
+          <w:b/>
+          <w:bCs/>
+          <w:color w:val="4472C4" w:themeColor="accent5"/>
+          <w:sz w:val="24"/>
+          <w:szCs w:val="24"/>
+        </w:rPr>
+        <w:t>16</w:t>
+      </w:r>
+      <w:r>
+        <w:rPr>
+          <w:rFonts w:ascii="Arial" w:hAnsi="Arial" w:cs="Arial"/>
+          <w:b/>
+          <w:bCs/>
+          <w:color w:val="4472C4" w:themeColor="accent5"/>
+          <w:sz w:val="24"/>
+          <w:szCs w:val="24"/>
+        </w:rPr>
+        <w:t>/</w:t>
+      </w:r>
+      <w:r>
+        <w:rPr>
+          <w:rFonts w:ascii="Arial" w:hAnsi="Arial" w:cs="Arial"/>
+          <w:b/>
+          <w:bCs/>
+          <w:color w:val="4472C4" w:themeColor="accent5"/>
+          <w:sz w:val="24"/>
+          <w:szCs w:val="24"/>
+        </w:rPr>
+        <w:t>02</w:t>
+      </w:r>
+      <w:r>
+        <w:rPr>
+          <w:rFonts w:ascii="Arial" w:hAnsi="Arial" w:cs="Arial"/>
+          <w:b/>
+          <w:bCs/>
+          <w:color w:val="4472C4" w:themeColor="accent5"/>
+          <w:sz w:val="24"/>
+          <w:szCs w:val="24"/>
+        </w:rPr>
+        <w:t>/202</w:t>
+      </w:r>
+      <w:r>
+        <w:rPr>
+          <w:rFonts w:ascii="Arial" w:hAnsi="Arial" w:cs="Arial"/>
+          <w:b/>
+          <w:bCs/>
+          <w:color w:val="4472C4" w:themeColor="accent5"/>
+          <w:sz w:val="24"/>
+          <w:szCs w:val="24"/>
+        </w:rPr>
+        <w:t>6</w:t>
       </w:r>
     </w:p>
     <w:p>
@@ -961,111 +899,23 @@
         <w:contextualSpacing/>
         <w:rPr>
           <w:rFonts w:ascii="Arial" w:hAnsi="Arial" w:cs="Arial"/>
-          <w:color w:val="1F497D"/>
-          <w:sz w:val="18"/>
-          <w:szCs w:val="18"/>
-        </w:rPr>
-      </w:pPr>
-    </w:p>
-    <w:p>
-      <w:pPr>
-        <w:tabs>
-          <w:tab w:val="left" w:pos="993"/>
-        </w:tabs>
-        <w:rPr>
-          <w:rFonts w:ascii="Arial" w:hAnsi="Arial" w:cs="Arial"/>
-          <w:color w:val="9CC2E5" w:themeColor="accent1" w:themeTint="99"/>
-          <w:sz w:val="16"/>
-          <w:szCs w:val="16"/>
-        </w:rPr>
-      </w:pPr>
-      <w:r>
-        <w:rPr>
-          <w:rFonts w:ascii="Arial" w:hAnsi="Arial" w:cs="Arial"/>
-          <w:b/>
-          <w:bCs/>
-          <w:color w:val="4472C4" w:themeColor="accent5"/>
-          <w:sz w:val="24"/>
-          <w:szCs w:val="24"/>
-        </w:rPr>
-        <w:t>v8.1.</w:t>
-      </w:r>
-      <w:r>
-        <w:rPr>
-          <w:rFonts w:ascii="Arial" w:hAnsi="Arial" w:cs="Arial"/>
-          <w:b/>
-          <w:bCs/>
-          <w:color w:val="4472C4" w:themeColor="accent5"/>
-          <w:sz w:val="24"/>
-          <w:szCs w:val="24"/>
-        </w:rPr>
-        <w:t>9</w:t>
-      </w:r>
-      <w:r>
-        <w:rPr>
-          <w:rFonts w:ascii="Arial" w:hAnsi="Arial" w:cs="Arial"/>
-          <w:b/>
-          <w:bCs/>
-          <w:color w:val="4472C4" w:themeColor="accent5"/>
-          <w:sz w:val="24"/>
-          <w:szCs w:val="24"/>
-        </w:rPr>
-        <w:tab/>
-      </w:r>
-      <w:r>
-        <w:rPr>
-          <w:rFonts w:ascii="Arial" w:hAnsi="Arial" w:cs="Arial"/>
-          <w:b/>
-          <w:bCs/>
-          <w:color w:val="4472C4" w:themeColor="accent5"/>
-          <w:sz w:val="24"/>
-          <w:szCs w:val="24"/>
-        </w:rPr>
-        <w:t>2</w:t>
-      </w:r>
-      <w:r>
-        <w:rPr>
-          <w:rFonts w:ascii="Arial" w:hAnsi="Arial" w:cs="Arial"/>
-          <w:b/>
-          <w:bCs/>
-          <w:color w:val="4472C4" w:themeColor="accent5"/>
-          <w:sz w:val="24"/>
-          <w:szCs w:val="24"/>
-        </w:rPr>
-        <w:t>4</w:t>
-      </w:r>
-      <w:r>
-        <w:rPr>
-          <w:rFonts w:ascii="Arial" w:hAnsi="Arial" w:cs="Arial"/>
-          <w:b/>
-          <w:bCs/>
-          <w:color w:val="4472C4" w:themeColor="accent5"/>
-          <w:sz w:val="24"/>
-          <w:szCs w:val="24"/>
-        </w:rPr>
-        <w:t>/</w:t>
-      </w:r>
-      <w:r>
-        <w:rPr>
-          <w:rFonts w:ascii="Arial" w:hAnsi="Arial" w:cs="Arial"/>
-          <w:b/>
-          <w:bCs/>
-          <w:color w:val="4472C4" w:themeColor="accent5"/>
-          <w:sz w:val="24"/>
-          <w:szCs w:val="24"/>
-        </w:rPr>
-        <w:t>12</w:t>
-      </w:r>
-      <w:r>
-        <w:rPr>
-          <w:rFonts w:ascii="Arial" w:hAnsi="Arial" w:cs="Arial"/>
-          <w:b/>
-          <w:bCs/>
-          <w:color w:val="4472C4" w:themeColor="accent5"/>
-          <w:sz w:val="24"/>
-          <w:szCs w:val="24"/>
-        </w:rPr>
-        <w:t>/2025</w:t>
+          <w:b/>
+          <w:bCs/>
+          <w:color w:val="1F497D"/>
+          <w:sz w:val="18"/>
+          <w:szCs w:val="18"/>
+        </w:rPr>
+      </w:pPr>
+      <w:r>
+        <w:rPr>
+          <w:rFonts w:ascii="Arial" w:hAnsi="Arial" w:cs="Arial"/>
+          <w:b/>
+          <w:bCs/>
+          <w:color w:val="1F497D"/>
+          <w:sz w:val="18"/>
+          <w:szCs w:val="18"/>
+        </w:rPr>
+        <w:t>New features</w:t>
       </w:r>
     </w:p>
     <w:p>
@@ -1083,23 +933,46 @@
         <w:contextualSpacing/>
         <w:rPr>
           <w:rFonts w:ascii="Arial" w:hAnsi="Arial" w:cs="Arial"/>
-          <w:b/>
-          <w:bCs/>
-          <w:color w:val="1F497D"/>
-          <w:sz w:val="18"/>
-          <w:szCs w:val="18"/>
-        </w:rPr>
-      </w:pPr>
-      <w:r>
-        <w:rPr>
-          <w:rFonts w:ascii="Arial" w:hAnsi="Arial" w:cs="Arial"/>
-          <w:b/>
-          <w:bCs/>
-          <w:color w:val="1F497D"/>
-          <w:sz w:val="18"/>
-          <w:szCs w:val="18"/>
-        </w:rPr>
-        <w:t>New features</w:t>
+          <w:color w:val="1F497D"/>
+          <w:sz w:val="18"/>
+          <w:szCs w:val="18"/>
+        </w:rPr>
+      </w:pPr>
+      <w:r>
+        <w:rPr>
+          <w:rFonts w:ascii="Arial" w:hAnsi="Arial" w:cs="Arial"/>
+          <w:color w:val="1F497D"/>
+          <w:sz w:val="18"/>
+          <w:szCs w:val="18"/>
+        </w:rPr>
+        <w:t>•</w:t>
+      </w:r>
+      <w:r>
+        <w:rPr>
+          <w:rFonts w:ascii="Arial" w:hAnsi="Arial" w:cs="Arial"/>
+          <w:color w:val="1F497D"/>
+          <w:sz w:val="18"/>
+          <w:szCs w:val="18"/>
+        </w:rPr>
+        <w:tab/>
+      </w:r>
+      <w:r>
+        <w:rPr>
+          <w:rFonts w:ascii="Arial" w:hAnsi="Arial" w:cs="Arial"/>
+          <w:color w:val="1F497D"/>
+          <w:sz w:val="18"/>
+          <w:szCs w:val="18"/>
+        </w:rPr>
+        <w:t>Support for Spanish language has</w:t>
+      </w:r>
+      <w:r>
+        <w:rPr>
+          <w:rFonts w:ascii="Arial" w:hAnsi="Arial" w:cs="Arial"/>
+          <w:color w:val="1F497D"/>
+          <w:sz w:val="18"/>
+          <w:szCs w:val="18"/>
+        </w:rPr>
+        <w:t xml:space="preserve"> been added.</w:t>
       </w:r>
     </w:p>
     <w:p>
@@ -1122,24 +995,106 @@
           <w:szCs w:val="18"/>
         </w:rPr>
       </w:pPr>
-      <w:r>
-        <w:rPr>
-          <w:rFonts w:ascii="Arial" w:hAnsi="Arial" w:cs="Arial"/>
-          <w:color w:val="1F497D"/>
-          <w:sz w:val="18"/>
-          <w:szCs w:val="18"/>
-        </w:rPr>
-        <w:t>•</w:t>
-      </w:r>
-      <w:r>
-        <w:rPr>
-          <w:rFonts w:ascii="Arial" w:hAnsi="Arial" w:cs="Arial"/>
-          <w:color w:val="1F497D"/>
-          <w:sz w:val="18"/>
-          <w:szCs w:val="18"/>
+    </w:p>
+    <w:p>
+      <w:pPr>
+        <w:tabs>
+          <w:tab w:val="left" w:pos="993"/>
+        </w:tabs>
+        <w:rPr>
+          <w:rFonts w:ascii="Arial" w:hAnsi="Arial" w:cs="Arial"/>
+          <w:color w:val="9CC2E5" w:themeColor="accent1" w:themeTint="99"/>
+          <w:sz w:val="16"/>
+          <w:szCs w:val="16"/>
+        </w:rPr>
+      </w:pPr>
+      <w:r>
+        <w:rPr>
+          <w:rFonts w:ascii="Arial" w:hAnsi="Arial" w:cs="Arial"/>
+          <w:b/>
+          <w:bCs/>
+          <w:color w:val="4472C4" w:themeColor="accent5"/>
+          <w:sz w:val="24"/>
+          <w:szCs w:val="24"/>
+        </w:rPr>
+        <w:t>v8.1.</w:t>
+      </w:r>
+      <w:r>
+        <w:rPr>
+          <w:rFonts w:ascii="Arial" w:hAnsi="Arial" w:cs="Arial"/>
+          <w:b/>
+          <w:bCs/>
+          <w:color w:val="4472C4" w:themeColor="accent5"/>
+          <w:sz w:val="24"/>
+          <w:szCs w:val="24"/>
+        </w:rPr>
+        <w:t>9</w:t>
+      </w:r>
+      <w:r>
+        <w:rPr>
+          <w:rFonts w:ascii="Arial" w:hAnsi="Arial" w:cs="Arial"/>
+          <w:b/>
+          <w:bCs/>
+          <w:color w:val="4472C4" w:themeColor="accent5"/>
+          <w:sz w:val="24"/>
+          <w:szCs w:val="24"/>
         </w:rPr>
         <w:tab/>
-        <w:t>The new CAST Pro devices have been added.</w:t>
+      </w:r>
+      <w:r>
+        <w:rPr>
+          <w:rFonts w:ascii="Arial" w:hAnsi="Arial" w:cs="Arial"/>
+          <w:b/>
+          <w:bCs/>
+          <w:color w:val="4472C4" w:themeColor="accent5"/>
+          <w:sz w:val="24"/>
+          <w:szCs w:val="24"/>
+        </w:rPr>
+        <w:t>2</w:t>
+      </w:r>
+      <w:r>
+        <w:rPr>
+          <w:rFonts w:ascii="Arial" w:hAnsi="Arial" w:cs="Arial"/>
+          <w:b/>
+          <w:bCs/>
+          <w:color w:val="4472C4" w:themeColor="accent5"/>
+          <w:sz w:val="24"/>
+          <w:szCs w:val="24"/>
+        </w:rPr>
+        <w:t>4</w:t>
+      </w:r>
+      <w:r>
+        <w:rPr>
+          <w:rFonts w:ascii="Arial" w:hAnsi="Arial" w:cs="Arial"/>
+          <w:b/>
+          <w:bCs/>
+          <w:color w:val="4472C4" w:themeColor="accent5"/>
+          <w:sz w:val="24"/>
+          <w:szCs w:val="24"/>
+        </w:rPr>
+        <w:t>/</w:t>
+      </w:r>
+      <w:r>
+        <w:rPr>
+          <w:rFonts w:ascii="Arial" w:hAnsi="Arial" w:cs="Arial"/>
+          <w:b/>
+          <w:bCs/>
+          <w:color w:val="4472C4" w:themeColor="accent5"/>
+          <w:sz w:val="24"/>
+          <w:szCs w:val="24"/>
+        </w:rPr>
+        <w:t>12</w:t>
+      </w:r>
+      <w:r>
+        <w:rPr>
+          <w:rFonts w:ascii="Arial" w:hAnsi="Arial" w:cs="Arial"/>
+          <w:b/>
+          <w:bCs/>
+          <w:color w:val="4472C4" w:themeColor="accent5"/>
+          <w:sz w:val="24"/>
+          <w:szCs w:val="24"/>
+        </w:rPr>
+        <w:t>/2025</w:t>
       </w:r>
     </w:p>
     <w:p>
@@ -1157,29 +1112,23 @@
         <w:contextualSpacing/>
         <w:rPr>
           <w:rFonts w:ascii="Arial" w:hAnsi="Arial" w:cs="Arial"/>
-          <w:color w:val="1F497D"/>
-          <w:sz w:val="18"/>
-          <w:szCs w:val="18"/>
-        </w:rPr>
-      </w:pPr>
-      <w:r>
-        <w:rPr>
-          <w:rFonts w:ascii="Arial" w:hAnsi="Arial" w:cs="Arial"/>
-          <w:color w:val="1F497D"/>
-          <w:sz w:val="18"/>
-          <w:szCs w:val="18"/>
-        </w:rPr>
-        <w:t>•</w:t>
-      </w:r>
-      <w:r>
-        <w:rPr>
-          <w:rFonts w:ascii="Arial" w:hAnsi="Arial" w:cs="Arial"/>
-          <w:color w:val="1F497D"/>
-          <w:sz w:val="18"/>
-          <w:szCs w:val="18"/>
-        </w:rPr>
-        <w:tab/>
-        <w:t>The facility to print the settings has been added.</w:t>
+          <w:b/>
+          <w:bCs/>
+          <w:color w:val="1F497D"/>
+          <w:sz w:val="18"/>
+          <w:szCs w:val="18"/>
+        </w:rPr>
+      </w:pPr>
+      <w:r>
+        <w:rPr>
+          <w:rFonts w:ascii="Arial" w:hAnsi="Arial" w:cs="Arial"/>
+          <w:b/>
+          <w:bCs/>
+          <w:color w:val="1F497D"/>
+          <w:sz w:val="18"/>
+          <w:szCs w:val="18"/>
+        </w:rPr>
+        <w:t>New features</w:t>
       </w:r>
     </w:p>
     <w:p>
@@ -1219,7 +1168,7 @@
           <w:szCs w:val="18"/>
         </w:rPr>
         <w:tab/>
-        <w:t>Device day &amp; night modes are now always set to their default values when a device type is changed.</w:t>
+        <w:t>The new CAST Pro devices have been added.</w:t>
       </w:r>
     </w:p>
     <w:p>
@@ -1259,7 +1208,7 @@
           <w:szCs w:val="18"/>
         </w:rPr>
         <w:tab/>
-        <w:t>A newly-added second loop is now correctly filled with empty device slots and the device pages are updated correspondingly.</w:t>
+        <w:t>The facility to print the settings has been added.</w:t>
       </w:r>
     </w:p>
     <w:p>
@@ -1299,16 +1248,7 @@
           <w:szCs w:val="18"/>
         </w:rPr>
         <w:tab/>
-        <w:t>Envision support for Apollo systems</w:t>
-      </w:r>
-      <w:r>
-        <w:rPr>
-          <w:rFonts w:ascii="Arial" w:hAnsi="Arial" w:cs="Arial"/>
-          <w:color w:val="1F497D"/>
-          <w:sz w:val="18"/>
-          <w:szCs w:val="18"/>
-        </w:rPr>
-        <w:t>:</w:t>
+        <w:t>Device day &amp; night modes are now always set to their default values when a device type is changed.</w:t>
       </w:r>
     </w:p>
     <w:p>
@@ -1338,73 +1278,17 @@
           <w:sz w:val="18"/>
           <w:szCs w:val="18"/>
         </w:rPr>
+        <w:t>•</w:t>
+      </w:r>
+      <w:r>
+        <w:rPr>
+          <w:rFonts w:ascii="Arial" w:hAnsi="Arial" w:cs="Arial"/>
+          <w:color w:val="1F497D"/>
+          <w:sz w:val="18"/>
+          <w:szCs w:val="18"/>
+        </w:rPr>
         <w:tab/>
-      </w:r>
-      <w:r>
-        <w:rPr>
-          <w:rFonts w:ascii="Arial" w:hAnsi="Arial" w:cs="Arial"/>
-          <w:i/>
-          <w:iCs/>
-          <w:color w:val="1F497D"/>
-          <w:sz w:val="18"/>
-          <w:szCs w:val="18"/>
-        </w:rPr>
-        <w:t>For this, device names and zone descriptions are prefixed with type codes and zone numbers respectively.  If not already prefixed, before uploading the user is asked whether the pane</w:t>
-      </w:r>
-      <w:r>
-        <w:rPr>
-          <w:rFonts w:ascii="Arial" w:hAnsi="Arial" w:cs="Arial"/>
-          <w:i/>
-          <w:iCs/>
-          <w:color w:val="1F497D"/>
-          <w:sz w:val="18"/>
-          <w:szCs w:val="18"/>
-        </w:rPr>
-        <w:t>l</w:t>
-      </w:r>
-      <w:r>
-        <w:rPr>
-          <w:rFonts w:ascii="Arial" w:hAnsi="Arial" w:cs="Arial"/>
-          <w:i/>
-          <w:iCs/>
-          <w:color w:val="1F497D"/>
-          <w:sz w:val="18"/>
-          <w:szCs w:val="18"/>
-        </w:rPr>
-        <w:t xml:space="preserve"> is for Envision and, if </w:t>
-      </w:r>
-      <w:proofErr w:type="gramStart"/>
-      <w:r>
-        <w:rPr>
-          <w:rFonts w:ascii="Arial" w:hAnsi="Arial" w:cs="Arial"/>
-          <w:i/>
-          <w:iCs/>
-          <w:color w:val="1F497D"/>
-          <w:sz w:val="18"/>
-          <w:szCs w:val="18"/>
-        </w:rPr>
-        <w:t>Yes</w:t>
-      </w:r>
-      <w:proofErr w:type="gramEnd"/>
-      <w:r>
-        <w:rPr>
-          <w:rFonts w:ascii="Arial" w:hAnsi="Arial" w:cs="Arial"/>
-          <w:i/>
-          <w:iCs/>
-          <w:color w:val="1F497D"/>
-          <w:sz w:val="18"/>
-          <w:szCs w:val="18"/>
-        </w:rPr>
-        <w:t>, the prefixes are added.</w:t>
-      </w:r>
-      <w:r>
-        <w:rPr>
-          <w:rFonts w:ascii="Arial" w:hAnsi="Arial" w:cs="Arial"/>
-          <w:color w:val="1F497D"/>
-          <w:sz w:val="18"/>
-          <w:szCs w:val="18"/>
-        </w:rPr>
-        <w:br/>
+        <w:t>A newly-added second loop is now correctly filled with empty device slots and the device pages are updated correspondingly.</w:t>
       </w:r>
     </w:p>
     <w:p>
@@ -1422,23 +1306,38 @@
         <w:contextualSpacing/>
         <w:rPr>
           <w:rFonts w:ascii="Arial" w:hAnsi="Arial" w:cs="Arial"/>
-          <w:b/>
-          <w:bCs/>
-          <w:color w:val="1F497D"/>
-          <w:sz w:val="18"/>
-          <w:szCs w:val="18"/>
-        </w:rPr>
-      </w:pPr>
-      <w:r>
-        <w:rPr>
-          <w:rFonts w:ascii="Arial" w:hAnsi="Arial" w:cs="Arial"/>
-          <w:b/>
-          <w:bCs/>
-          <w:color w:val="1F497D"/>
-          <w:sz w:val="18"/>
-          <w:szCs w:val="18"/>
-        </w:rPr>
-        <w:t>Fixes</w:t>
+          <w:color w:val="1F497D"/>
+          <w:sz w:val="18"/>
+          <w:szCs w:val="18"/>
+        </w:rPr>
+      </w:pPr>
+      <w:r>
+        <w:rPr>
+          <w:rFonts w:ascii="Arial" w:hAnsi="Arial" w:cs="Arial"/>
+          <w:color w:val="1F497D"/>
+          <w:sz w:val="18"/>
+          <w:szCs w:val="18"/>
+        </w:rPr>
+        <w:t>•</w:t>
+      </w:r>
+      <w:r>
+        <w:rPr>
+          <w:rFonts w:ascii="Arial" w:hAnsi="Arial" w:cs="Arial"/>
+          <w:color w:val="1F497D"/>
+          <w:sz w:val="18"/>
+          <w:szCs w:val="18"/>
+        </w:rPr>
+        <w:tab/>
+        <w:t>Envision support for Apollo systems</w:t>
+      </w:r>
+      <w:r>
+        <w:rPr>
+          <w:rFonts w:ascii="Arial" w:hAnsi="Arial" w:cs="Arial"/>
+          <w:color w:val="1F497D"/>
+          <w:sz w:val="18"/>
+          <w:szCs w:val="18"/>
+        </w:rPr>
+        <w:t>:</w:t>
       </w:r>
     </w:p>
     <w:p>
@@ -1468,162 +1367,49 @@
           <w:sz w:val="18"/>
           <w:szCs w:val="18"/>
         </w:rPr>
-        <w:t>•</w:t>
-      </w:r>
-      <w:r>
-        <w:rPr>
-          <w:rFonts w:ascii="Arial" w:hAnsi="Arial" w:cs="Arial"/>
-          <w:color w:val="1F497D"/>
-          <w:sz w:val="18"/>
-          <w:szCs w:val="18"/>
-        </w:rPr>
         <w:tab/>
       </w:r>
       <w:r>
         <w:rPr>
           <w:rFonts w:ascii="Arial" w:hAnsi="Arial" w:cs="Arial"/>
-          <w:color w:val="1F497D"/>
-          <w:sz w:val="18"/>
-          <w:szCs w:val="18"/>
-        </w:rPr>
-        <w:t>Two faults that would cause the app to shut down have been corrected: s</w:t>
-      </w:r>
-      <w:r>
-        <w:rPr>
-          <w:rFonts w:ascii="Arial" w:hAnsi="Arial" w:cs="Arial"/>
-          <w:color w:val="1F497D"/>
-          <w:sz w:val="18"/>
-          <w:szCs w:val="18"/>
-        </w:rPr>
-        <w:t>end</w:t>
-      </w:r>
-      <w:r>
-        <w:rPr>
-          <w:rFonts w:ascii="Arial" w:hAnsi="Arial" w:cs="Arial"/>
-          <w:color w:val="1F497D"/>
-          <w:sz w:val="18"/>
-          <w:szCs w:val="18"/>
-        </w:rPr>
-        <w:t>ing</w:t>
-      </w:r>
-      <w:r>
-        <w:rPr>
-          <w:rFonts w:ascii="Arial" w:hAnsi="Arial" w:cs="Arial"/>
-          <w:color w:val="1F497D"/>
-          <w:sz w:val="18"/>
-          <w:szCs w:val="18"/>
-        </w:rPr>
-        <w:t xml:space="preserve"> </w:t>
-      </w:r>
-      <w:r>
-        <w:rPr>
-          <w:rFonts w:ascii="Arial" w:hAnsi="Arial" w:cs="Arial"/>
-          <w:color w:val="1F497D"/>
-          <w:sz w:val="18"/>
-          <w:szCs w:val="18"/>
-        </w:rPr>
-        <w:t>single-</w:t>
-      </w:r>
-      <w:r>
-        <w:rPr>
-          <w:rFonts w:ascii="Arial" w:hAnsi="Arial" w:cs="Arial"/>
-          <w:color w:val="1F497D"/>
-          <w:sz w:val="18"/>
-          <w:szCs w:val="18"/>
-        </w:rPr>
-        <w:t xml:space="preserve">loop </w:t>
-      </w:r>
-      <w:r>
-        <w:rPr>
-          <w:rFonts w:ascii="Arial" w:hAnsi="Arial" w:cs="Arial"/>
-          <w:color w:val="1F497D"/>
-          <w:sz w:val="18"/>
-          <w:szCs w:val="18"/>
-        </w:rPr>
-        <w:t>data to a</w:t>
-      </w:r>
-      <w:r>
-        <w:rPr>
-          <w:rFonts w:ascii="Arial" w:hAnsi="Arial" w:cs="Arial"/>
-          <w:color w:val="1F497D"/>
-          <w:sz w:val="18"/>
-          <w:szCs w:val="18"/>
-        </w:rPr>
-        <w:t xml:space="preserve"> 2-loop </w:t>
-      </w:r>
-      <w:proofErr w:type="gramStart"/>
-      <w:r>
-        <w:rPr>
-          <w:rFonts w:ascii="Arial" w:hAnsi="Arial" w:cs="Arial"/>
-          <w:color w:val="1F497D"/>
-          <w:sz w:val="18"/>
-          <w:szCs w:val="18"/>
-        </w:rPr>
-        <w:t>panel</w:t>
-      </w:r>
-      <w:r>
-        <w:rPr>
-          <w:rFonts w:ascii="Arial" w:hAnsi="Arial" w:cs="Arial"/>
-          <w:color w:val="1F497D"/>
-          <w:sz w:val="18"/>
-          <w:szCs w:val="18"/>
-        </w:rPr>
-        <w:t>,</w:t>
-      </w:r>
-      <w:r>
-        <w:rPr>
-          <w:rFonts w:ascii="Arial" w:hAnsi="Arial" w:cs="Arial"/>
-          <w:color w:val="1F497D"/>
-          <w:sz w:val="18"/>
-          <w:szCs w:val="18"/>
-        </w:rPr>
-        <w:t xml:space="preserve"> </w:t>
-      </w:r>
-      <w:r>
-        <w:rPr>
-          <w:rFonts w:ascii="Arial" w:hAnsi="Arial" w:cs="Arial"/>
-          <w:color w:val="1F497D"/>
-          <w:sz w:val="18"/>
-          <w:szCs w:val="18"/>
-        </w:rPr>
-        <w:t>and</w:t>
-      </w:r>
-      <w:proofErr w:type="gramEnd"/>
-      <w:r>
-        <w:rPr>
-          <w:rFonts w:ascii="Arial" w:hAnsi="Arial" w:cs="Arial"/>
-          <w:color w:val="1F497D"/>
-          <w:sz w:val="18"/>
-          <w:szCs w:val="18"/>
-        </w:rPr>
-        <w:t xml:space="preserve"> </w:t>
-      </w:r>
-      <w:r>
-        <w:rPr>
-          <w:rFonts w:ascii="Arial" w:hAnsi="Arial" w:cs="Arial"/>
-          <w:color w:val="1F497D"/>
-          <w:sz w:val="18"/>
-          <w:szCs w:val="18"/>
-        </w:rPr>
-        <w:t>opening a file wh</w:t>
-      </w:r>
-      <w:r>
-        <w:rPr>
-          <w:rFonts w:ascii="Arial" w:hAnsi="Arial" w:cs="Arial"/>
-          <w:color w:val="1F497D"/>
-          <w:sz w:val="18"/>
-          <w:szCs w:val="18"/>
-        </w:rPr>
-        <w:t xml:space="preserve">ich does not contain any panel numbers the same as the </w:t>
-      </w:r>
-      <w:r>
-        <w:rPr>
-          <w:rFonts w:ascii="Arial" w:hAnsi="Arial" w:cs="Arial"/>
-          <w:color w:val="1F497D"/>
-          <w:sz w:val="18"/>
-          <w:szCs w:val="18"/>
-        </w:rPr>
-        <w:t>current panel.</w:t>
+          <w:i/>
+          <w:iCs/>
+          <w:color w:val="1F497D"/>
+          <w:sz w:val="18"/>
+          <w:szCs w:val="18"/>
+        </w:rPr>
+        <w:t>For this, device names and zone descriptions are prefixed with type codes and zone numbers respectively.  If not already prefixed, before uploading the user is asked whether the pane</w:t>
+      </w:r>
+      <w:r>
+        <w:rPr>
+          <w:rFonts w:ascii="Arial" w:hAnsi="Arial" w:cs="Arial"/>
+          <w:i/>
+          <w:iCs/>
+          <w:color w:val="1F497D"/>
+          <w:sz w:val="18"/>
+          <w:szCs w:val="18"/>
+        </w:rPr>
+        <w:t>l</w:t>
+      </w:r>
+      <w:r>
+        <w:rPr>
+          <w:rFonts w:ascii="Arial" w:hAnsi="Arial" w:cs="Arial"/>
+          <w:i/>
+          <w:iCs/>
+          <w:color w:val="1F497D"/>
+          <w:sz w:val="18"/>
+          <w:szCs w:val="18"/>
+        </w:rPr>
+        <w:t xml:space="preserve"> is for Envision and, if Yes, the prefixes are added.</w:t>
+      </w:r>
+      <w:r>
+        <w:rPr>
+          <w:rFonts w:ascii="Arial" w:hAnsi="Arial" w:cs="Arial"/>
+          <w:color w:val="1F497D"/>
+          <w:sz w:val="18"/>
+          <w:szCs w:val="18"/>
+        </w:rPr>
+        <w:br/>
       </w:r>
     </w:p>
     <w:p>
@@ -1641,64 +1427,23 @@
         <w:contextualSpacing/>
         <w:rPr>
           <w:rFonts w:ascii="Arial" w:hAnsi="Arial" w:cs="Arial"/>
-          <w:color w:val="1F497D"/>
-          <w:sz w:val="18"/>
-          <w:szCs w:val="18"/>
-        </w:rPr>
-      </w:pPr>
-      <w:r>
-        <w:rPr>
-          <w:rFonts w:ascii="Arial" w:hAnsi="Arial" w:cs="Arial"/>
-          <w:color w:val="1F497D"/>
-          <w:sz w:val="18"/>
-          <w:szCs w:val="18"/>
-        </w:rPr>
-        <w:t>•</w:t>
-      </w:r>
-      <w:r>
-        <w:rPr>
-          <w:rFonts w:ascii="Arial" w:hAnsi="Arial" w:cs="Arial"/>
-          <w:color w:val="1F497D"/>
-          <w:sz w:val="18"/>
-          <w:szCs w:val="18"/>
-        </w:rPr>
-        <w:tab/>
-      </w:r>
-      <w:r>
-        <w:rPr>
-          <w:rFonts w:ascii="Arial" w:hAnsi="Arial" w:cs="Arial"/>
-          <w:color w:val="1F497D"/>
-          <w:sz w:val="18"/>
-          <w:szCs w:val="18"/>
-        </w:rPr>
-        <w:t>The displaying of e</w:t>
-      </w:r>
-      <w:r>
-        <w:rPr>
-          <w:rFonts w:ascii="Arial" w:hAnsi="Arial" w:cs="Arial"/>
-          <w:color w:val="1F497D"/>
-          <w:sz w:val="18"/>
-          <w:szCs w:val="18"/>
-        </w:rPr>
-        <w:t xml:space="preserve">rror boxes on invalid items </w:t>
-      </w:r>
-      <w:r>
-        <w:rPr>
-          <w:rFonts w:ascii="Arial" w:hAnsi="Arial" w:cs="Arial"/>
-          <w:color w:val="1F497D"/>
-          <w:sz w:val="18"/>
-          <w:szCs w:val="18"/>
-        </w:rPr>
-        <w:t>has been made more consistent</w:t>
-      </w:r>
-      <w:r>
-        <w:rPr>
-          <w:rFonts w:ascii="Arial" w:hAnsi="Arial" w:cs="Arial"/>
-          <w:color w:val="1F497D"/>
-          <w:sz w:val="18"/>
-          <w:szCs w:val="18"/>
-        </w:rPr>
-        <w:t>.</w:t>
+          <w:b/>
+          <w:bCs/>
+          <w:color w:val="1F497D"/>
+          <w:sz w:val="18"/>
+          <w:szCs w:val="18"/>
+        </w:rPr>
+      </w:pPr>
+      <w:r>
+        <w:rPr>
+          <w:rFonts w:ascii="Arial" w:hAnsi="Arial" w:cs="Arial"/>
+          <w:b/>
+          <w:bCs/>
+          <w:color w:val="1F497D"/>
+          <w:sz w:val="18"/>
+          <w:szCs w:val="18"/>
+        </w:rPr>
+        <w:t>Fixes</w:t>
       </w:r>
     </w:p>
     <w:p>
@@ -1738,43 +1483,132 @@
           <w:szCs w:val="18"/>
         </w:rPr>
         <w:tab/>
-        <w:t xml:space="preserve">The Validation Window no longer </w:t>
-      </w:r>
-      <w:r>
-        <w:rPr>
-          <w:rFonts w:ascii="Arial" w:hAnsi="Arial" w:cs="Arial"/>
-          <w:color w:val="1F497D"/>
-          <w:sz w:val="18"/>
-          <w:szCs w:val="18"/>
-        </w:rPr>
-        <w:t>indicate</w:t>
-      </w:r>
-      <w:r>
-        <w:rPr>
-          <w:rFonts w:ascii="Arial" w:hAnsi="Arial" w:cs="Arial"/>
-          <w:color w:val="1F497D"/>
-          <w:sz w:val="18"/>
-          <w:szCs w:val="18"/>
-        </w:rPr>
-        <w:t xml:space="preserve">s Loop 2 for </w:t>
-      </w:r>
-      <w:r>
-        <w:rPr>
-          <w:rFonts w:ascii="Arial" w:hAnsi="Arial" w:cs="Arial"/>
-          <w:color w:val="1F497D"/>
-          <w:sz w:val="18"/>
-          <w:szCs w:val="18"/>
-        </w:rPr>
-        <w:t xml:space="preserve">a </w:t>
-      </w:r>
-      <w:r>
-        <w:rPr>
-          <w:rFonts w:ascii="Arial" w:hAnsi="Arial" w:cs="Arial"/>
-          <w:color w:val="1F497D"/>
-          <w:sz w:val="18"/>
-          <w:szCs w:val="18"/>
-        </w:rPr>
-        <w:t>single-loop panel.</w:t>
+      </w:r>
+      <w:r>
+        <w:rPr>
+          <w:rFonts w:ascii="Arial" w:hAnsi="Arial" w:cs="Arial"/>
+          <w:color w:val="1F497D"/>
+          <w:sz w:val="18"/>
+          <w:szCs w:val="18"/>
+        </w:rPr>
+        <w:t>Two faults that would cause the app to shut down have been corrected: s</w:t>
+      </w:r>
+      <w:r>
+        <w:rPr>
+          <w:rFonts w:ascii="Arial" w:hAnsi="Arial" w:cs="Arial"/>
+          <w:color w:val="1F497D"/>
+          <w:sz w:val="18"/>
+          <w:szCs w:val="18"/>
+        </w:rPr>
+        <w:t>end</w:t>
+      </w:r>
+      <w:r>
+        <w:rPr>
+          <w:rFonts w:ascii="Arial" w:hAnsi="Arial" w:cs="Arial"/>
+          <w:color w:val="1F497D"/>
+          <w:sz w:val="18"/>
+          <w:szCs w:val="18"/>
+        </w:rPr>
+        <w:t>ing</w:t>
+      </w:r>
+      <w:r>
+        <w:rPr>
+          <w:rFonts w:ascii="Arial" w:hAnsi="Arial" w:cs="Arial"/>
+          <w:color w:val="1F497D"/>
+          <w:sz w:val="18"/>
+          <w:szCs w:val="18"/>
+        </w:rPr>
+        <w:t xml:space="preserve"> </w:t>
+      </w:r>
+      <w:r>
+        <w:rPr>
+          <w:rFonts w:ascii="Arial" w:hAnsi="Arial" w:cs="Arial"/>
+          <w:color w:val="1F497D"/>
+          <w:sz w:val="18"/>
+          <w:szCs w:val="18"/>
+        </w:rPr>
+        <w:t>single-</w:t>
+      </w:r>
+      <w:r>
+        <w:rPr>
+          <w:rFonts w:ascii="Arial" w:hAnsi="Arial" w:cs="Arial"/>
+          <w:color w:val="1F497D"/>
+          <w:sz w:val="18"/>
+          <w:szCs w:val="18"/>
+        </w:rPr>
+        <w:t xml:space="preserve">loop </w:t>
+      </w:r>
+      <w:r>
+        <w:rPr>
+          <w:rFonts w:ascii="Arial" w:hAnsi="Arial" w:cs="Arial"/>
+          <w:color w:val="1F497D"/>
+          <w:sz w:val="18"/>
+          <w:szCs w:val="18"/>
+        </w:rPr>
+        <w:t>data to a</w:t>
+      </w:r>
+      <w:r>
+        <w:rPr>
+          <w:rFonts w:ascii="Arial" w:hAnsi="Arial" w:cs="Arial"/>
+          <w:color w:val="1F497D"/>
+          <w:sz w:val="18"/>
+          <w:szCs w:val="18"/>
+        </w:rPr>
+        <w:t xml:space="preserve"> 2-loop panel</w:t>
+      </w:r>
+      <w:r>
+        <w:rPr>
+          <w:rFonts w:ascii="Arial" w:hAnsi="Arial" w:cs="Arial"/>
+          <w:color w:val="1F497D"/>
+          <w:sz w:val="18"/>
+          <w:szCs w:val="18"/>
+        </w:rPr>
+        <w:t>,</w:t>
+      </w:r>
+      <w:r>
+        <w:rPr>
+          <w:rFonts w:ascii="Arial" w:hAnsi="Arial" w:cs="Arial"/>
+          <w:color w:val="1F497D"/>
+          <w:sz w:val="18"/>
+          <w:szCs w:val="18"/>
+        </w:rPr>
+        <w:t xml:space="preserve"> </w:t>
+      </w:r>
+      <w:r>
+        <w:rPr>
+          <w:rFonts w:ascii="Arial" w:hAnsi="Arial" w:cs="Arial"/>
+          <w:color w:val="1F497D"/>
+          <w:sz w:val="18"/>
+          <w:szCs w:val="18"/>
+        </w:rPr>
+        <w:t xml:space="preserve">and </w:t>
+      </w:r>
+      <w:r>
+        <w:rPr>
+          <w:rFonts w:ascii="Arial" w:hAnsi="Arial" w:cs="Arial"/>
+          <w:color w:val="1F497D"/>
+          <w:sz w:val="18"/>
+          <w:szCs w:val="18"/>
+        </w:rPr>
+        <w:t>opening a file wh</w:t>
+      </w:r>
+      <w:r>
+        <w:rPr>
+          <w:rFonts w:ascii="Arial" w:hAnsi="Arial" w:cs="Arial"/>
+          <w:color w:val="1F497D"/>
+          <w:sz w:val="18"/>
+          <w:szCs w:val="18"/>
+        </w:rPr>
+        <w:t xml:space="preserve">ich does not contain any panel numbers the same as the </w:t>
+      </w:r>
+      <w:r>
+        <w:rPr>
+          <w:rFonts w:ascii="Arial" w:hAnsi="Arial" w:cs="Arial"/>
+          <w:color w:val="1F497D"/>
+          <w:sz w:val="18"/>
+          <w:szCs w:val="18"/>
+        </w:rPr>
+        <w:t>current panel.</w:t>
       </w:r>
     </w:p>
     <w:p>
@@ -1822,25 +1656,25 @@
           <w:sz w:val="18"/>
           <w:szCs w:val="18"/>
         </w:rPr>
-        <w:t xml:space="preserve">On the </w:t>
-      </w:r>
-      <w:r>
-        <w:rPr>
-          <w:rFonts w:ascii="Arial" w:hAnsi="Arial" w:cs="Arial"/>
-          <w:color w:val="1F497D"/>
-          <w:sz w:val="18"/>
-          <w:szCs w:val="18"/>
-        </w:rPr>
-        <w:t>Causes &amp; Effects page</w:t>
-      </w:r>
-      <w:r>
-        <w:rPr>
-          <w:rFonts w:ascii="Arial" w:hAnsi="Arial" w:cs="Arial"/>
-          <w:color w:val="1F497D"/>
-          <w:sz w:val="18"/>
-          <w:szCs w:val="18"/>
-        </w:rPr>
-        <w:t>, data that has been read from a file is now updated correctly on all lines</w:t>
+        <w:t>The displaying of e</w:t>
+      </w:r>
+      <w:r>
+        <w:rPr>
+          <w:rFonts w:ascii="Arial" w:hAnsi="Arial" w:cs="Arial"/>
+          <w:color w:val="1F497D"/>
+          <w:sz w:val="18"/>
+          <w:szCs w:val="18"/>
+        </w:rPr>
+        <w:t xml:space="preserve">rror boxes on invalid items </w:t>
+      </w:r>
+      <w:r>
+        <w:rPr>
+          <w:rFonts w:ascii="Arial" w:hAnsi="Arial" w:cs="Arial"/>
+          <w:color w:val="1F497D"/>
+          <w:sz w:val="18"/>
+          <w:szCs w:val="18"/>
+        </w:rPr>
+        <w:t>has been made more consistent</w:t>
       </w:r>
       <w:r>
         <w:rPr>
@@ -1872,95 +1706,60 @@
           <w:szCs w:val="18"/>
         </w:rPr>
       </w:pPr>
-    </w:p>
-    <w:p>
-      <w:pPr>
-        <w:tabs>
-          <w:tab w:val="left" w:pos="993"/>
-        </w:tabs>
-        <w:rPr>
-          <w:rFonts w:ascii="Arial" w:hAnsi="Arial" w:cs="Arial"/>
-          <w:color w:val="9CC2E5" w:themeColor="accent1" w:themeTint="99"/>
-          <w:sz w:val="16"/>
-          <w:szCs w:val="16"/>
-        </w:rPr>
-      </w:pPr>
-      <w:r>
-        <w:rPr>
-          <w:rFonts w:ascii="Arial" w:hAnsi="Arial" w:cs="Arial"/>
-          <w:b/>
-          <w:bCs/>
-          <w:color w:val="4472C4" w:themeColor="accent5"/>
-          <w:sz w:val="24"/>
-          <w:szCs w:val="24"/>
-        </w:rPr>
-        <w:t>v8.1.</w:t>
-      </w:r>
-      <w:r>
-        <w:rPr>
-          <w:rFonts w:ascii="Arial" w:hAnsi="Arial" w:cs="Arial"/>
-          <w:b/>
-          <w:bCs/>
-          <w:color w:val="4472C4" w:themeColor="accent5"/>
-          <w:sz w:val="24"/>
-          <w:szCs w:val="24"/>
-        </w:rPr>
-        <w:t>8</w:t>
-      </w:r>
-      <w:r>
-        <w:rPr>
-          <w:rFonts w:ascii="Arial" w:hAnsi="Arial" w:cs="Arial"/>
-          <w:b/>
-          <w:bCs/>
-          <w:color w:val="4472C4" w:themeColor="accent5"/>
-          <w:sz w:val="24"/>
-          <w:szCs w:val="24"/>
+      <w:r>
+        <w:rPr>
+          <w:rFonts w:ascii="Arial" w:hAnsi="Arial" w:cs="Arial"/>
+          <w:color w:val="1F497D"/>
+          <w:sz w:val="18"/>
+          <w:szCs w:val="18"/>
+        </w:rPr>
+        <w:t>•</w:t>
+      </w:r>
+      <w:r>
+        <w:rPr>
+          <w:rFonts w:ascii="Arial" w:hAnsi="Arial" w:cs="Arial"/>
+          <w:color w:val="1F497D"/>
+          <w:sz w:val="18"/>
+          <w:szCs w:val="18"/>
         </w:rPr>
         <w:tab/>
-      </w:r>
-      <w:r>
-        <w:rPr>
-          <w:rFonts w:ascii="Arial" w:hAnsi="Arial" w:cs="Arial"/>
-          <w:b/>
-          <w:bCs/>
-          <w:color w:val="4472C4" w:themeColor="accent5"/>
-          <w:sz w:val="24"/>
-          <w:szCs w:val="24"/>
-        </w:rPr>
-        <w:t>26</w:t>
-      </w:r>
-      <w:r>
-        <w:rPr>
-          <w:rFonts w:ascii="Arial" w:hAnsi="Arial" w:cs="Arial"/>
-          <w:b/>
-          <w:bCs/>
-          <w:color w:val="4472C4" w:themeColor="accent5"/>
-          <w:sz w:val="24"/>
-          <w:szCs w:val="24"/>
-        </w:rPr>
-        <w:t>/</w:t>
-      </w:r>
-      <w:r>
-        <w:rPr>
-          <w:rFonts w:ascii="Arial" w:hAnsi="Arial" w:cs="Arial"/>
-          <w:b/>
-          <w:bCs/>
-          <w:color w:val="4472C4" w:themeColor="accent5"/>
-          <w:sz w:val="24"/>
-          <w:szCs w:val="24"/>
-        </w:rPr>
-        <w:t>09</w:t>
-      </w:r>
-      <w:r>
-        <w:rPr>
-          <w:rFonts w:ascii="Arial" w:hAnsi="Arial" w:cs="Arial"/>
-          <w:b/>
-          <w:bCs/>
-          <w:color w:val="4472C4" w:themeColor="accent5"/>
-          <w:sz w:val="24"/>
-          <w:szCs w:val="24"/>
-        </w:rPr>
-        <w:t>/2025</w:t>
+        <w:t xml:space="preserve">The Validation Window no longer </w:t>
+      </w:r>
+      <w:r>
+        <w:rPr>
+          <w:rFonts w:ascii="Arial" w:hAnsi="Arial" w:cs="Arial"/>
+          <w:color w:val="1F497D"/>
+          <w:sz w:val="18"/>
+          <w:szCs w:val="18"/>
+        </w:rPr>
+        <w:t>indicate</w:t>
+      </w:r>
+      <w:r>
+        <w:rPr>
+          <w:rFonts w:ascii="Arial" w:hAnsi="Arial" w:cs="Arial"/>
+          <w:color w:val="1F497D"/>
+          <w:sz w:val="18"/>
+          <w:szCs w:val="18"/>
+        </w:rPr>
+        <w:t xml:space="preserve">s Loop 2 for </w:t>
+      </w:r>
+      <w:r>
+        <w:rPr>
+          <w:rFonts w:ascii="Arial" w:hAnsi="Arial" w:cs="Arial"/>
+          <w:color w:val="1F497D"/>
+          <w:sz w:val="18"/>
+          <w:szCs w:val="18"/>
+        </w:rPr>
+        <w:t xml:space="preserve">a </w:t>
+      </w:r>
+      <w:r>
+        <w:rPr>
+          <w:rFonts w:ascii="Arial" w:hAnsi="Arial" w:cs="Arial"/>
+          <w:color w:val="1F497D"/>
+          <w:sz w:val="18"/>
+          <w:szCs w:val="18"/>
+        </w:rPr>
+        <w:t>single-loop panel.</w:t>
       </w:r>
     </w:p>
     <w:p>
@@ -1990,7 +1789,7 @@
           <w:sz w:val="18"/>
           <w:szCs w:val="18"/>
         </w:rPr>
-        <w:t>-</w:t>
+        <w:t>•</w:t>
       </w:r>
       <w:r>
         <w:rPr>
@@ -2008,79 +1807,25 @@
           <w:sz w:val="18"/>
           <w:szCs w:val="18"/>
         </w:rPr>
-        <w:t>Correction:</w:t>
-      </w:r>
-      <w:r>
-        <w:rPr>
-          <w:rFonts w:ascii="Arial" w:hAnsi="Arial" w:cs="Arial"/>
-          <w:color w:val="1F497D"/>
-          <w:sz w:val="18"/>
-          <w:szCs w:val="18"/>
-        </w:rPr>
-        <w:t xml:space="preserve"> device I/O configuration </w:t>
-      </w:r>
-      <w:r>
-        <w:rPr>
-          <w:rFonts w:ascii="Arial" w:hAnsi="Arial" w:cs="Arial"/>
-          <w:color w:val="1F497D"/>
-          <w:sz w:val="18"/>
-          <w:szCs w:val="18"/>
-        </w:rPr>
-        <w:t xml:space="preserve">item </w:t>
-      </w:r>
-      <w:r>
-        <w:rPr>
-          <w:rFonts w:ascii="Arial" w:hAnsi="Arial" w:cs="Arial"/>
-          <w:color w:val="1F497D"/>
-          <w:sz w:val="18"/>
-          <w:szCs w:val="18"/>
-        </w:rPr>
-        <w:t>description</w:t>
-      </w:r>
-      <w:r>
-        <w:rPr>
-          <w:rFonts w:ascii="Arial" w:hAnsi="Arial" w:cs="Arial"/>
-          <w:color w:val="1F497D"/>
-          <w:sz w:val="18"/>
-          <w:szCs w:val="18"/>
-        </w:rPr>
-        <w:t xml:space="preserve"> edit</w:t>
-      </w:r>
-      <w:r>
-        <w:rPr>
-          <w:rFonts w:ascii="Arial" w:hAnsi="Arial" w:cs="Arial"/>
-          <w:color w:val="1F497D"/>
-          <w:sz w:val="18"/>
-          <w:szCs w:val="18"/>
-        </w:rPr>
-        <w:t xml:space="preserve">s </w:t>
-      </w:r>
-      <w:r>
-        <w:rPr>
-          <w:rFonts w:ascii="Arial" w:hAnsi="Arial" w:cs="Arial"/>
-          <w:color w:val="1F497D"/>
-          <w:sz w:val="18"/>
-          <w:szCs w:val="18"/>
-        </w:rPr>
-        <w:t xml:space="preserve">have been corrected so that </w:t>
-      </w:r>
-      <w:r>
-        <w:rPr>
-          <w:rFonts w:ascii="Arial" w:hAnsi="Arial" w:cs="Arial"/>
-          <w:color w:val="1F497D"/>
-          <w:sz w:val="18"/>
-          <w:szCs w:val="18"/>
-        </w:rPr>
-        <w:t>descriptions and/or device names on other devices</w:t>
-      </w:r>
-      <w:r>
-        <w:rPr>
-          <w:rFonts w:ascii="Arial" w:hAnsi="Arial" w:cs="Arial"/>
-          <w:color w:val="1F497D"/>
-          <w:sz w:val="18"/>
-          <w:szCs w:val="18"/>
-        </w:rPr>
-        <w:t xml:space="preserve"> are not affected</w:t>
+        <w:t xml:space="preserve">On the </w:t>
+      </w:r>
+      <w:r>
+        <w:rPr>
+          <w:rFonts w:ascii="Arial" w:hAnsi="Arial" w:cs="Arial"/>
+          <w:color w:val="1F497D"/>
+          <w:sz w:val="18"/>
+          <w:szCs w:val="18"/>
+        </w:rPr>
+        <w:t>Causes &amp; Effects page</w:t>
+      </w:r>
+      <w:r>
+        <w:rPr>
+          <w:rFonts w:ascii="Arial" w:hAnsi="Arial" w:cs="Arial"/>
+          <w:color w:val="1F497D"/>
+          <w:sz w:val="18"/>
+          <w:szCs w:val="18"/>
+        </w:rPr>
+        <w:t>, data that has been read from a file is now updated correctly on all lines</w:t>
       </w:r>
       <w:r>
         <w:rPr>
@@ -2112,51 +1857,95 @@
           <w:szCs w:val="18"/>
         </w:rPr>
       </w:pPr>
-      <w:r>
-        <w:rPr>
-          <w:rFonts w:ascii="Arial" w:hAnsi="Arial" w:cs="Arial"/>
-          <w:color w:val="1F497D"/>
-          <w:sz w:val="18"/>
-          <w:szCs w:val="18"/>
-        </w:rPr>
-        <w:t>-</w:t>
-      </w:r>
-      <w:r>
-        <w:rPr>
-          <w:rFonts w:ascii="Arial" w:hAnsi="Arial" w:cs="Arial"/>
-          <w:color w:val="1F497D"/>
-          <w:sz w:val="18"/>
-          <w:szCs w:val="18"/>
+    </w:p>
+    <w:p>
+      <w:pPr>
+        <w:tabs>
+          <w:tab w:val="left" w:pos="993"/>
+        </w:tabs>
+        <w:rPr>
+          <w:rFonts w:ascii="Arial" w:hAnsi="Arial" w:cs="Arial"/>
+          <w:color w:val="9CC2E5" w:themeColor="accent1" w:themeTint="99"/>
+          <w:sz w:val="16"/>
+          <w:szCs w:val="16"/>
+        </w:rPr>
+      </w:pPr>
+      <w:r>
+        <w:rPr>
+          <w:rFonts w:ascii="Arial" w:hAnsi="Arial" w:cs="Arial"/>
+          <w:b/>
+          <w:bCs/>
+          <w:color w:val="4472C4" w:themeColor="accent5"/>
+          <w:sz w:val="24"/>
+          <w:szCs w:val="24"/>
+        </w:rPr>
+        <w:t>v8.1.</w:t>
+      </w:r>
+      <w:r>
+        <w:rPr>
+          <w:rFonts w:ascii="Arial" w:hAnsi="Arial" w:cs="Arial"/>
+          <w:b/>
+          <w:bCs/>
+          <w:color w:val="4472C4" w:themeColor="accent5"/>
+          <w:sz w:val="24"/>
+          <w:szCs w:val="24"/>
+        </w:rPr>
+        <w:t>8</w:t>
+      </w:r>
+      <w:r>
+        <w:rPr>
+          <w:rFonts w:ascii="Arial" w:hAnsi="Arial" w:cs="Arial"/>
+          <w:b/>
+          <w:bCs/>
+          <w:color w:val="4472C4" w:themeColor="accent5"/>
+          <w:sz w:val="24"/>
+          <w:szCs w:val="24"/>
         </w:rPr>
         <w:tab/>
-        <w:t>Correction:</w:t>
-      </w:r>
-      <w:r>
-        <w:rPr>
-          <w:rFonts w:ascii="Arial" w:hAnsi="Arial" w:cs="Arial"/>
-          <w:color w:val="1F497D"/>
-          <w:sz w:val="18"/>
-          <w:szCs w:val="18"/>
-        </w:rPr>
-        <w:t xml:space="preserve"> the Add Second Loop option for single-loop panels</w:t>
-      </w:r>
-      <w:r>
-        <w:rPr>
-          <w:rFonts w:ascii="Arial" w:hAnsi="Arial" w:cs="Arial"/>
-          <w:color w:val="1F497D"/>
-          <w:sz w:val="18"/>
-          <w:szCs w:val="18"/>
-        </w:rPr>
-        <w:t xml:space="preserve"> now ensures that the</w:t>
-      </w:r>
-      <w:r>
-        <w:rPr>
-          <w:rFonts w:ascii="Arial" w:hAnsi="Arial" w:cs="Arial"/>
-          <w:color w:val="1F497D"/>
-          <w:sz w:val="18"/>
-          <w:szCs w:val="18"/>
-        </w:rPr>
-        <w:t xml:space="preserve"> device lists on the other pages are now populated correctly with the required number of (empty) devices.</w:t>
+      </w:r>
+      <w:r>
+        <w:rPr>
+          <w:rFonts w:ascii="Arial" w:hAnsi="Arial" w:cs="Arial"/>
+          <w:b/>
+          <w:bCs/>
+          <w:color w:val="4472C4" w:themeColor="accent5"/>
+          <w:sz w:val="24"/>
+          <w:szCs w:val="24"/>
+        </w:rPr>
+        <w:t>26</w:t>
+      </w:r>
+      <w:r>
+        <w:rPr>
+          <w:rFonts w:ascii="Arial" w:hAnsi="Arial" w:cs="Arial"/>
+          <w:b/>
+          <w:bCs/>
+          <w:color w:val="4472C4" w:themeColor="accent5"/>
+          <w:sz w:val="24"/>
+          <w:szCs w:val="24"/>
+        </w:rPr>
+        <w:t>/</w:t>
+      </w:r>
+      <w:r>
+        <w:rPr>
+          <w:rFonts w:ascii="Arial" w:hAnsi="Arial" w:cs="Arial"/>
+          <w:b/>
+          <w:bCs/>
+          <w:color w:val="4472C4" w:themeColor="accent5"/>
+          <w:sz w:val="24"/>
+          <w:szCs w:val="24"/>
+        </w:rPr>
+        <w:t>09</w:t>
+      </w:r>
+      <w:r>
+        <w:rPr>
+          <w:rFonts w:ascii="Arial" w:hAnsi="Arial" w:cs="Arial"/>
+          <w:b/>
+          <w:bCs/>
+          <w:color w:val="4472C4" w:themeColor="accent5"/>
+          <w:sz w:val="24"/>
+          <w:szCs w:val="24"/>
+        </w:rPr>
+        <w:t>/2025</w:t>
       </w:r>
     </w:p>
     <w:p>
@@ -2191,8 +1980,6 @@
       <w:r>
         <w:rPr>
           <w:rFonts w:ascii="Arial" w:hAnsi="Arial" w:cs="Arial"/>
-          <w:b/>
-          <w:bCs/>
           <w:color w:val="1F497D"/>
           <w:sz w:val="18"/>
           <w:szCs w:val="18"/>
@@ -2206,10 +1993,90 @@
           <w:sz w:val="18"/>
           <w:szCs w:val="18"/>
         </w:rPr>
-        <w:t xml:space="preserve">Notification popups are shown after each upload and download, indicating completion or otherwise. </w:t>
-      </w:r>
-    </w:p>
-    <w:bookmarkEnd w:id="0"/>
+        <w:t>Correction:</w:t>
+      </w:r>
+      <w:r>
+        <w:rPr>
+          <w:rFonts w:ascii="Arial" w:hAnsi="Arial" w:cs="Arial"/>
+          <w:color w:val="1F497D"/>
+          <w:sz w:val="18"/>
+          <w:szCs w:val="18"/>
+        </w:rPr>
+        <w:t xml:space="preserve"> device I/O configuration </w:t>
+      </w:r>
+      <w:r>
+        <w:rPr>
+          <w:rFonts w:ascii="Arial" w:hAnsi="Arial" w:cs="Arial"/>
+          <w:color w:val="1F497D"/>
+          <w:sz w:val="18"/>
+          <w:szCs w:val="18"/>
+        </w:rPr>
+        <w:t xml:space="preserve">item </w:t>
+      </w:r>
+      <w:r>
+        <w:rPr>
+          <w:rFonts w:ascii="Arial" w:hAnsi="Arial" w:cs="Arial"/>
+          <w:color w:val="1F497D"/>
+          <w:sz w:val="18"/>
+          <w:szCs w:val="18"/>
+        </w:rPr>
+        <w:t>description</w:t>
+      </w:r>
+      <w:r>
+        <w:rPr>
+          <w:rFonts w:ascii="Arial" w:hAnsi="Arial" w:cs="Arial"/>
+          <w:color w:val="1F497D"/>
+          <w:sz w:val="18"/>
+          <w:szCs w:val="18"/>
+        </w:rPr>
+        <w:t xml:space="preserve"> edit</w:t>
+      </w:r>
+      <w:r>
+        <w:rPr>
+          <w:rFonts w:ascii="Arial" w:hAnsi="Arial" w:cs="Arial"/>
+          <w:color w:val="1F497D"/>
+          <w:sz w:val="18"/>
+          <w:szCs w:val="18"/>
+        </w:rPr>
+        <w:t xml:space="preserve">s </w:t>
+      </w:r>
+      <w:r>
+        <w:rPr>
+          <w:rFonts w:ascii="Arial" w:hAnsi="Arial" w:cs="Arial"/>
+          <w:color w:val="1F497D"/>
+          <w:sz w:val="18"/>
+          <w:szCs w:val="18"/>
+        </w:rPr>
+        <w:t xml:space="preserve">have been corrected so that </w:t>
+      </w:r>
+      <w:r>
+        <w:rPr>
+          <w:rFonts w:ascii="Arial" w:hAnsi="Arial" w:cs="Arial"/>
+          <w:color w:val="1F497D"/>
+          <w:sz w:val="18"/>
+          <w:szCs w:val="18"/>
+        </w:rPr>
+        <w:t>descriptions and/or device names on other devices</w:t>
+      </w:r>
+      <w:r>
+        <w:rPr>
+          <w:rFonts w:ascii="Arial" w:hAnsi="Arial" w:cs="Arial"/>
+          <w:color w:val="1F497D"/>
+          <w:sz w:val="18"/>
+          <w:szCs w:val="18"/>
+        </w:rPr>
+        <w:t xml:space="preserve"> are not affected</w:t>
+      </w:r>
+      <w:r>
+        <w:rPr>
+          <w:rFonts w:ascii="Arial" w:hAnsi="Arial" w:cs="Arial"/>
+          <w:color w:val="1F497D"/>
+          <w:sz w:val="18"/>
+          <w:szCs w:val="18"/>
+        </w:rPr>
+        <w:t>.</w:t>
+      </w:r>
+    </w:p>
     <w:p>
       <w:pPr>
         <w:tabs>
@@ -2225,124 +2092,56 @@
         <w:contextualSpacing/>
         <w:rPr>
           <w:rFonts w:ascii="Arial" w:hAnsi="Arial" w:cs="Arial"/>
-          <w:b/>
-          <w:bCs/>
-          <w:color w:val="1F497D"/>
-          <w:sz w:val="18"/>
-          <w:szCs w:val="18"/>
-        </w:rPr>
-      </w:pPr>
-    </w:p>
-    <w:p>
-      <w:pPr>
-        <w:tabs>
-          <w:tab w:val="left" w:pos="993"/>
-        </w:tabs>
-        <w:rPr>
-          <w:rFonts w:ascii="Arial" w:hAnsi="Arial" w:cs="Arial"/>
-          <w:color w:val="9CC2E5" w:themeColor="accent1" w:themeTint="99"/>
-          <w:sz w:val="16"/>
-          <w:szCs w:val="16"/>
-        </w:rPr>
-      </w:pPr>
-      <w:r>
-        <w:rPr>
-          <w:rFonts w:ascii="Arial" w:hAnsi="Arial" w:cs="Arial"/>
-          <w:b/>
-          <w:bCs/>
-          <w:color w:val="4472C4" w:themeColor="accent5"/>
-          <w:sz w:val="24"/>
-          <w:szCs w:val="24"/>
-        </w:rPr>
-        <w:t>v8.1.</w:t>
-      </w:r>
-      <w:r>
-        <w:rPr>
-          <w:rFonts w:ascii="Arial" w:hAnsi="Arial" w:cs="Arial"/>
-          <w:b/>
-          <w:bCs/>
-          <w:color w:val="4472C4" w:themeColor="accent5"/>
-          <w:sz w:val="24"/>
-          <w:szCs w:val="24"/>
-        </w:rPr>
-        <w:t>7</w:t>
-      </w:r>
-      <w:r>
-        <w:rPr>
-          <w:rFonts w:ascii="Arial" w:hAnsi="Arial" w:cs="Arial"/>
-          <w:b/>
-          <w:bCs/>
-          <w:color w:val="4472C4" w:themeColor="accent5"/>
-          <w:sz w:val="24"/>
-          <w:szCs w:val="24"/>
+          <w:color w:val="1F497D"/>
+          <w:sz w:val="18"/>
+          <w:szCs w:val="18"/>
+        </w:rPr>
+      </w:pPr>
+      <w:r>
+        <w:rPr>
+          <w:rFonts w:ascii="Arial" w:hAnsi="Arial" w:cs="Arial"/>
+          <w:color w:val="1F497D"/>
+          <w:sz w:val="18"/>
+          <w:szCs w:val="18"/>
+        </w:rPr>
+        <w:t>-</w:t>
+      </w:r>
+      <w:r>
+        <w:rPr>
+          <w:rFonts w:ascii="Arial" w:hAnsi="Arial" w:cs="Arial"/>
+          <w:color w:val="1F497D"/>
+          <w:sz w:val="18"/>
+          <w:szCs w:val="18"/>
         </w:rPr>
         <w:tab/>
-      </w:r>
-      <w:r>
-        <w:rPr>
-          <w:rFonts w:ascii="Arial" w:hAnsi="Arial" w:cs="Arial"/>
-          <w:b/>
-          <w:bCs/>
-          <w:color w:val="4472C4" w:themeColor="accent5"/>
-          <w:sz w:val="24"/>
-          <w:szCs w:val="24"/>
-        </w:rPr>
-        <w:t>3</w:t>
-      </w:r>
-      <w:r>
-        <w:rPr>
-          <w:rFonts w:ascii="Arial" w:hAnsi="Arial" w:cs="Arial"/>
-          <w:b/>
-          <w:bCs/>
-          <w:color w:val="4472C4" w:themeColor="accent5"/>
-          <w:sz w:val="24"/>
-          <w:szCs w:val="24"/>
-        </w:rPr>
-        <w:t>1</w:t>
-      </w:r>
-      <w:r>
-        <w:rPr>
-          <w:rFonts w:ascii="Arial" w:hAnsi="Arial" w:cs="Arial"/>
-          <w:b/>
-          <w:bCs/>
-          <w:color w:val="4472C4" w:themeColor="accent5"/>
-          <w:sz w:val="24"/>
-          <w:szCs w:val="24"/>
-        </w:rPr>
-        <w:t>/</w:t>
-      </w:r>
-      <w:r>
-        <w:rPr>
-          <w:rFonts w:ascii="Arial" w:hAnsi="Arial" w:cs="Arial"/>
-          <w:b/>
-          <w:bCs/>
-          <w:color w:val="4472C4" w:themeColor="accent5"/>
-          <w:sz w:val="24"/>
-          <w:szCs w:val="24"/>
-        </w:rPr>
-        <w:t>0</w:t>
-      </w:r>
-      <w:r>
-        <w:rPr>
-          <w:rFonts w:ascii="Arial" w:hAnsi="Arial" w:cs="Arial"/>
-          <w:b/>
-          <w:bCs/>
-          <w:color w:val="4472C4" w:themeColor="accent5"/>
-          <w:sz w:val="24"/>
-          <w:szCs w:val="24"/>
-        </w:rPr>
-        <w:t>7</w:t>
-      </w:r>
-      <w:r>
-        <w:rPr>
-          <w:rFonts w:ascii="Arial" w:hAnsi="Arial" w:cs="Arial"/>
-          <w:b/>
-          <w:bCs/>
-          <w:color w:val="4472C4" w:themeColor="accent5"/>
-          <w:sz w:val="24"/>
-          <w:szCs w:val="24"/>
-        </w:rPr>
-        <w:t>/2025</w:t>
+        <w:t>Correction:</w:t>
+      </w:r>
+      <w:r>
+        <w:rPr>
+          <w:rFonts w:ascii="Arial" w:hAnsi="Arial" w:cs="Arial"/>
+          <w:color w:val="1F497D"/>
+          <w:sz w:val="18"/>
+          <w:szCs w:val="18"/>
+        </w:rPr>
+        <w:t xml:space="preserve"> the Add Second Loop option for single-loop panels</w:t>
+      </w:r>
+      <w:r>
+        <w:rPr>
+          <w:rFonts w:ascii="Arial" w:hAnsi="Arial" w:cs="Arial"/>
+          <w:color w:val="1F497D"/>
+          <w:sz w:val="18"/>
+          <w:szCs w:val="18"/>
+        </w:rPr>
+        <w:t xml:space="preserve"> now ensures that the</w:t>
+      </w:r>
+      <w:r>
+        <w:rPr>
+          <w:rFonts w:ascii="Arial" w:hAnsi="Arial" w:cs="Arial"/>
+          <w:color w:val="1F497D"/>
+          <w:sz w:val="18"/>
+          <w:szCs w:val="18"/>
+        </w:rPr>
+        <w:t xml:space="preserve"> device lists on the other pages are now populated correctly with the required number of (empty) devices.</w:t>
       </w:r>
     </w:p>
     <w:p>
@@ -2377,41 +2176,25 @@
       <w:r>
         <w:rPr>
           <w:rFonts w:ascii="Arial" w:hAnsi="Arial" w:cs="Arial"/>
+          <w:b/>
+          <w:bCs/>
           <w:color w:val="1F497D"/>
           <w:sz w:val="18"/>
           <w:szCs w:val="18"/>
         </w:rPr>
         <w:tab/>
-        <w:t xml:space="preserve">Removed system notifications which were causing </w:t>
-      </w:r>
-      <w:r>
-        <w:rPr>
-          <w:rFonts w:ascii="Arial" w:hAnsi="Arial" w:cs="Arial"/>
-          <w:color w:val="1F497D"/>
-          <w:sz w:val="18"/>
-          <w:szCs w:val="18"/>
-        </w:rPr>
-        <w:t>freezes</w:t>
-      </w:r>
-      <w:r>
-        <w:rPr>
-          <w:rFonts w:ascii="Arial" w:hAnsi="Arial" w:cs="Arial"/>
-          <w:color w:val="1F497D"/>
-          <w:sz w:val="18"/>
-          <w:szCs w:val="18"/>
-        </w:rPr>
-        <w:t xml:space="preserve"> and </w:t>
-      </w:r>
-      <w:r>
-        <w:rPr>
-          <w:rFonts w:ascii="Arial" w:hAnsi="Arial" w:cs="Arial"/>
-          <w:color w:val="1F497D"/>
-          <w:sz w:val="18"/>
-          <w:szCs w:val="18"/>
-        </w:rPr>
-        <w:t>crashes after download/upload.</w:t>
-      </w:r>
-    </w:p>
+      </w:r>
+      <w:r>
+        <w:rPr>
+          <w:rFonts w:ascii="Arial" w:hAnsi="Arial" w:cs="Arial"/>
+          <w:color w:val="1F497D"/>
+          <w:sz w:val="18"/>
+          <w:szCs w:val="18"/>
+        </w:rPr>
+        <w:t xml:space="preserve">Notification popups are shown after each upload and download, indicating completion or otherwise. </w:t>
+      </w:r>
+    </w:p>
+    <w:bookmarkEnd w:id="0"/>
     <w:p>
       <w:pPr>
         <w:tabs>
@@ -2427,73 +2210,124 @@
         <w:contextualSpacing/>
         <w:rPr>
           <w:rFonts w:ascii="Arial" w:hAnsi="Arial" w:cs="Arial"/>
-          <w:color w:val="1F497D"/>
-          <w:sz w:val="18"/>
-          <w:szCs w:val="18"/>
-        </w:rPr>
-      </w:pPr>
-      <w:r>
-        <w:rPr>
-          <w:rFonts w:ascii="Arial" w:hAnsi="Arial" w:cs="Arial"/>
-          <w:color w:val="1F497D"/>
-          <w:sz w:val="18"/>
-          <w:szCs w:val="18"/>
-        </w:rPr>
-        <w:t>-</w:t>
-      </w:r>
-      <w:r>
-        <w:rPr>
-          <w:rFonts w:ascii="Arial" w:hAnsi="Arial" w:cs="Arial"/>
-          <w:color w:val="1F497D"/>
-          <w:sz w:val="18"/>
-          <w:szCs w:val="18"/>
+          <w:b/>
+          <w:bCs/>
+          <w:color w:val="1F497D"/>
+          <w:sz w:val="18"/>
+          <w:szCs w:val="18"/>
+        </w:rPr>
+      </w:pPr>
+    </w:p>
+    <w:p>
+      <w:pPr>
+        <w:tabs>
+          <w:tab w:val="left" w:pos="993"/>
+        </w:tabs>
+        <w:rPr>
+          <w:rFonts w:ascii="Arial" w:hAnsi="Arial" w:cs="Arial"/>
+          <w:color w:val="9CC2E5" w:themeColor="accent1" w:themeTint="99"/>
+          <w:sz w:val="16"/>
+          <w:szCs w:val="16"/>
+        </w:rPr>
+      </w:pPr>
+      <w:r>
+        <w:rPr>
+          <w:rFonts w:ascii="Arial" w:hAnsi="Arial" w:cs="Arial"/>
+          <w:b/>
+          <w:bCs/>
+          <w:color w:val="4472C4" w:themeColor="accent5"/>
+          <w:sz w:val="24"/>
+          <w:szCs w:val="24"/>
+        </w:rPr>
+        <w:t>v8.1.</w:t>
+      </w:r>
+      <w:r>
+        <w:rPr>
+          <w:rFonts w:ascii="Arial" w:hAnsi="Arial" w:cs="Arial"/>
+          <w:b/>
+          <w:bCs/>
+          <w:color w:val="4472C4" w:themeColor="accent5"/>
+          <w:sz w:val="24"/>
+          <w:szCs w:val="24"/>
+        </w:rPr>
+        <w:t>7</w:t>
+      </w:r>
+      <w:r>
+        <w:rPr>
+          <w:rFonts w:ascii="Arial" w:hAnsi="Arial" w:cs="Arial"/>
+          <w:b/>
+          <w:bCs/>
+          <w:color w:val="4472C4" w:themeColor="accent5"/>
+          <w:sz w:val="24"/>
+          <w:szCs w:val="24"/>
         </w:rPr>
         <w:tab/>
       </w:r>
       <w:r>
         <w:rPr>
           <w:rFonts w:ascii="Arial" w:hAnsi="Arial" w:cs="Arial"/>
-          <w:color w:val="1F497D"/>
-          <w:sz w:val="18"/>
-          <w:szCs w:val="18"/>
-        </w:rPr>
-        <w:t xml:space="preserve">Moved Revision History </w:t>
-      </w:r>
-      <w:r>
-        <w:rPr>
-          <w:rFonts w:ascii="Arial" w:hAnsi="Arial" w:cs="Arial"/>
-          <w:color w:val="1F497D"/>
-          <w:sz w:val="18"/>
-          <w:szCs w:val="18"/>
-        </w:rPr>
-        <w:t xml:space="preserve">(this document) </w:t>
-      </w:r>
-      <w:r>
-        <w:rPr>
-          <w:rFonts w:ascii="Arial" w:hAnsi="Arial" w:cs="Arial"/>
-          <w:color w:val="1F497D"/>
-          <w:sz w:val="18"/>
-          <w:szCs w:val="18"/>
-        </w:rPr>
-        <w:t xml:space="preserve">from the </w:t>
-      </w:r>
-      <w:r>
-        <w:rPr>
-          <w:rFonts w:ascii="Arial" w:hAnsi="Arial" w:cs="Arial"/>
-          <w:color w:val="1F497D"/>
-          <w:sz w:val="18"/>
-          <w:szCs w:val="18"/>
-        </w:rPr>
-        <w:t>m</w:t>
-      </w:r>
-      <w:r>
-        <w:rPr>
-          <w:rFonts w:ascii="Arial" w:hAnsi="Arial" w:cs="Arial"/>
-          <w:color w:val="1F497D"/>
-          <w:sz w:val="18"/>
-          <w:szCs w:val="18"/>
-        </w:rPr>
-        <w:t>ain menu to the About box.</w:t>
+          <w:b/>
+          <w:bCs/>
+          <w:color w:val="4472C4" w:themeColor="accent5"/>
+          <w:sz w:val="24"/>
+          <w:szCs w:val="24"/>
+        </w:rPr>
+        <w:t>3</w:t>
+      </w:r>
+      <w:r>
+        <w:rPr>
+          <w:rFonts w:ascii="Arial" w:hAnsi="Arial" w:cs="Arial"/>
+          <w:b/>
+          <w:bCs/>
+          <w:color w:val="4472C4" w:themeColor="accent5"/>
+          <w:sz w:val="24"/>
+          <w:szCs w:val="24"/>
+        </w:rPr>
+        <w:t>1</w:t>
+      </w:r>
+      <w:r>
+        <w:rPr>
+          <w:rFonts w:ascii="Arial" w:hAnsi="Arial" w:cs="Arial"/>
+          <w:b/>
+          <w:bCs/>
+          <w:color w:val="4472C4" w:themeColor="accent5"/>
+          <w:sz w:val="24"/>
+          <w:szCs w:val="24"/>
+        </w:rPr>
+        <w:t>/</w:t>
+      </w:r>
+      <w:r>
+        <w:rPr>
+          <w:rFonts w:ascii="Arial" w:hAnsi="Arial" w:cs="Arial"/>
+          <w:b/>
+          <w:bCs/>
+          <w:color w:val="4472C4" w:themeColor="accent5"/>
+          <w:sz w:val="24"/>
+          <w:szCs w:val="24"/>
+        </w:rPr>
+        <w:t>0</w:t>
+      </w:r>
+      <w:r>
+        <w:rPr>
+          <w:rFonts w:ascii="Arial" w:hAnsi="Arial" w:cs="Arial"/>
+          <w:b/>
+          <w:bCs/>
+          <w:color w:val="4472C4" w:themeColor="accent5"/>
+          <w:sz w:val="24"/>
+          <w:szCs w:val="24"/>
+        </w:rPr>
+        <w:t>7</w:t>
+      </w:r>
+      <w:r>
+        <w:rPr>
+          <w:rFonts w:ascii="Arial" w:hAnsi="Arial" w:cs="Arial"/>
+          <w:b/>
+          <w:bCs/>
+          <w:color w:val="4472C4" w:themeColor="accent5"/>
+          <w:sz w:val="24"/>
+          <w:szCs w:val="24"/>
+        </w:rPr>
+        <w:t>/2025</w:t>
       </w:r>
     </w:p>
     <w:p>
@@ -2533,52 +2367,34 @@
           <w:szCs w:val="18"/>
         </w:rPr>
         <w:tab/>
-        <w:t>Corrected</w:t>
-      </w:r>
-      <w:r>
-        <w:rPr>
-          <w:rFonts w:ascii="Arial" w:hAnsi="Arial" w:cs="Arial"/>
-          <w:color w:val="1F497D"/>
-          <w:sz w:val="18"/>
-          <w:szCs w:val="18"/>
-        </w:rPr>
-        <w:t xml:space="preserve"> </w:t>
-      </w:r>
-      <w:r>
-        <w:rPr>
-          <w:rFonts w:ascii="Arial" w:hAnsi="Arial" w:cs="Arial"/>
-          <w:color w:val="1F497D"/>
-          <w:sz w:val="18"/>
-          <w:szCs w:val="18"/>
-        </w:rPr>
-        <w:t xml:space="preserve">the </w:t>
-      </w:r>
-      <w:r>
-        <w:rPr>
-          <w:rFonts w:ascii="Arial" w:hAnsi="Arial" w:cs="Arial"/>
-          <w:color w:val="1F497D"/>
-          <w:sz w:val="18"/>
-          <w:szCs w:val="18"/>
-        </w:rPr>
-        <w:t xml:space="preserve">Comms Log viewer’s error </w:t>
-      </w:r>
-      <w:r>
-        <w:rPr>
-          <w:rFonts w:ascii="Arial" w:hAnsi="Arial" w:cs="Arial"/>
-          <w:color w:val="1F497D"/>
-          <w:sz w:val="18"/>
-          <w:szCs w:val="18"/>
-        </w:rPr>
-        <w:t>over</w:t>
-      </w:r>
-      <w:r>
-        <w:rPr>
-          <w:rFonts w:ascii="Arial" w:hAnsi="Arial" w:cs="Arial"/>
-          <w:color w:val="1F497D"/>
-          <w:sz w:val="18"/>
-          <w:szCs w:val="18"/>
-        </w:rPr>
-        <w:t>counts.</w:t>
+        <w:t xml:space="preserve">Removed system notifications which were causing </w:t>
+      </w:r>
+      <w:r>
+        <w:rPr>
+          <w:rFonts w:ascii="Arial" w:hAnsi="Arial" w:cs="Arial"/>
+          <w:color w:val="1F497D"/>
+          <w:sz w:val="18"/>
+          <w:szCs w:val="18"/>
+        </w:rPr>
+        <w:t>freezes</w:t>
+      </w:r>
+      <w:r>
+        <w:rPr>
+          <w:rFonts w:ascii="Arial" w:hAnsi="Arial" w:cs="Arial"/>
+          <w:color w:val="1F497D"/>
+          <w:sz w:val="18"/>
+          <w:szCs w:val="18"/>
+        </w:rPr>
+        <w:t xml:space="preserve"> and </w:t>
+      </w:r>
+      <w:r>
+        <w:rPr>
+          <w:rFonts w:ascii="Arial" w:hAnsi="Arial" w:cs="Arial"/>
+          <w:color w:val="1F497D"/>
+          <w:sz w:val="18"/>
+          <w:szCs w:val="18"/>
+        </w:rPr>
+        <w:t>crashes after download/upload.</w:t>
       </w:r>
     </w:p>
     <w:p>
@@ -2601,95 +2417,68 @@
           <w:szCs w:val="18"/>
         </w:rPr>
       </w:pPr>
-    </w:p>
-    <w:p>
-      <w:pPr>
-        <w:tabs>
-          <w:tab w:val="left" w:pos="993"/>
-        </w:tabs>
-        <w:rPr>
-          <w:rFonts w:ascii="Arial" w:hAnsi="Arial" w:cs="Arial"/>
-          <w:color w:val="9CC2E5" w:themeColor="accent1" w:themeTint="99"/>
-          <w:sz w:val="16"/>
-          <w:szCs w:val="16"/>
-        </w:rPr>
-      </w:pPr>
-      <w:r>
-        <w:rPr>
-          <w:rFonts w:ascii="Arial" w:hAnsi="Arial" w:cs="Arial"/>
-          <w:b/>
-          <w:bCs/>
-          <w:color w:val="4472C4" w:themeColor="accent5"/>
-          <w:sz w:val="24"/>
-          <w:szCs w:val="24"/>
-        </w:rPr>
-        <w:t>v8.1.</w:t>
-      </w:r>
-      <w:r>
-        <w:rPr>
-          <w:rFonts w:ascii="Arial" w:hAnsi="Arial" w:cs="Arial"/>
-          <w:b/>
-          <w:bCs/>
-          <w:color w:val="4472C4" w:themeColor="accent5"/>
-          <w:sz w:val="24"/>
-          <w:szCs w:val="24"/>
-        </w:rPr>
-        <w:t>6</w:t>
-      </w:r>
-      <w:r>
-        <w:rPr>
-          <w:rFonts w:ascii="Arial" w:hAnsi="Arial" w:cs="Arial"/>
-          <w:b/>
-          <w:bCs/>
-          <w:color w:val="4472C4" w:themeColor="accent5"/>
-          <w:sz w:val="24"/>
-          <w:szCs w:val="24"/>
+      <w:r>
+        <w:rPr>
+          <w:rFonts w:ascii="Arial" w:hAnsi="Arial" w:cs="Arial"/>
+          <w:color w:val="1F497D"/>
+          <w:sz w:val="18"/>
+          <w:szCs w:val="18"/>
+        </w:rPr>
+        <w:t>-</w:t>
+      </w:r>
+      <w:r>
+        <w:rPr>
+          <w:rFonts w:ascii="Arial" w:hAnsi="Arial" w:cs="Arial"/>
+          <w:color w:val="1F497D"/>
+          <w:sz w:val="18"/>
+          <w:szCs w:val="18"/>
         </w:rPr>
         <w:tab/>
       </w:r>
       <w:r>
         <w:rPr>
           <w:rFonts w:ascii="Arial" w:hAnsi="Arial" w:cs="Arial"/>
-          <w:b/>
-          <w:bCs/>
-          <w:color w:val="4472C4" w:themeColor="accent5"/>
-          <w:sz w:val="24"/>
-          <w:szCs w:val="24"/>
-        </w:rPr>
-        <w:t>30</w:t>
-      </w:r>
-      <w:r>
-        <w:rPr>
-          <w:rFonts w:ascii="Arial" w:hAnsi="Arial" w:cs="Arial"/>
-          <w:b/>
-          <w:bCs/>
-          <w:color w:val="4472C4" w:themeColor="accent5"/>
-          <w:sz w:val="24"/>
-          <w:szCs w:val="24"/>
-        </w:rPr>
-        <w:t>/</w:t>
-      </w:r>
-      <w:r>
-        <w:rPr>
-          <w:rFonts w:ascii="Arial" w:hAnsi="Arial" w:cs="Arial"/>
-          <w:b/>
-          <w:bCs/>
-          <w:color w:val="4472C4" w:themeColor="accent5"/>
-          <w:sz w:val="24"/>
-          <w:szCs w:val="24"/>
-        </w:rPr>
-        <w:t>07</w:t>
-      </w:r>
-      <w:r>
-        <w:rPr>
-          <w:rFonts w:ascii="Arial" w:hAnsi="Arial" w:cs="Arial"/>
-          <w:b/>
-          <w:bCs/>
-          <w:color w:val="4472C4" w:themeColor="accent5"/>
-          <w:sz w:val="24"/>
-          <w:szCs w:val="24"/>
-        </w:rPr>
-        <w:t>/2025</w:t>
+          <w:color w:val="1F497D"/>
+          <w:sz w:val="18"/>
+          <w:szCs w:val="18"/>
+        </w:rPr>
+        <w:t xml:space="preserve">Moved Revision History </w:t>
+      </w:r>
+      <w:r>
+        <w:rPr>
+          <w:rFonts w:ascii="Arial" w:hAnsi="Arial" w:cs="Arial"/>
+          <w:color w:val="1F497D"/>
+          <w:sz w:val="18"/>
+          <w:szCs w:val="18"/>
+        </w:rPr>
+        <w:t xml:space="preserve">(this document) </w:t>
+      </w:r>
+      <w:r>
+        <w:rPr>
+          <w:rFonts w:ascii="Arial" w:hAnsi="Arial" w:cs="Arial"/>
+          <w:color w:val="1F497D"/>
+          <w:sz w:val="18"/>
+          <w:szCs w:val="18"/>
+        </w:rPr>
+        <w:t xml:space="preserve">from the </w:t>
+      </w:r>
+      <w:r>
+        <w:rPr>
+          <w:rFonts w:ascii="Arial" w:hAnsi="Arial" w:cs="Arial"/>
+          <w:color w:val="1F497D"/>
+          <w:sz w:val="18"/>
+          <w:szCs w:val="18"/>
+        </w:rPr>
+        <w:t>m</w:t>
+      </w:r>
+      <w:r>
+        <w:rPr>
+          <w:rFonts w:ascii="Arial" w:hAnsi="Arial" w:cs="Arial"/>
+          <w:color w:val="1F497D"/>
+          <w:sz w:val="18"/>
+          <w:szCs w:val="18"/>
+        </w:rPr>
+        <w:t>ain menu to the About box.</w:t>
       </w:r>
     </w:p>
     <w:p>
@@ -2729,42 +2518,16 @@
           <w:szCs w:val="18"/>
         </w:rPr>
         <w:tab/>
-      </w:r>
-      <w:r>
-        <w:rPr>
-          <w:rFonts w:ascii="Arial" w:hAnsi="Arial" w:cs="Arial"/>
-          <w:color w:val="1F497D"/>
-          <w:sz w:val="18"/>
-          <w:szCs w:val="18"/>
-        </w:rPr>
-        <w:t>Test</w:t>
-      </w:r>
-      <w:r>
-        <w:rPr>
-          <w:rFonts w:ascii="Arial" w:hAnsi="Arial" w:cs="Arial"/>
-          <w:color w:val="1F497D"/>
-          <w:sz w:val="18"/>
-          <w:szCs w:val="18"/>
-        </w:rPr>
-        <w:t xml:space="preserve"> version </w:t>
-      </w:r>
-      <w:r>
-        <w:rPr>
-          <w:rFonts w:ascii="Arial" w:hAnsi="Arial" w:cs="Arial"/>
-          <w:color w:val="1F497D"/>
-          <w:sz w:val="18"/>
-          <w:szCs w:val="18"/>
-        </w:rPr>
-        <w:t xml:space="preserve">to </w:t>
-      </w:r>
-      <w:r>
-        <w:rPr>
-          <w:rFonts w:ascii="Arial" w:hAnsi="Arial" w:cs="Arial"/>
-          <w:color w:val="1F497D"/>
-          <w:sz w:val="18"/>
-          <w:szCs w:val="18"/>
-        </w:rPr>
-        <w:t xml:space="preserve">investigate </w:t>
+        <w:t>Corrected</w:t>
+      </w:r>
+      <w:r>
+        <w:rPr>
+          <w:rFonts w:ascii="Arial" w:hAnsi="Arial" w:cs="Arial"/>
+          <w:color w:val="1F497D"/>
+          <w:sz w:val="18"/>
+          <w:szCs w:val="18"/>
+        </w:rPr>
+        <w:t xml:space="preserve"> </w:t>
       </w:r>
       <w:r>
         <w:rPr>
@@ -2782,61 +2545,25 @@
           <w:sz w:val="18"/>
           <w:szCs w:val="18"/>
         </w:rPr>
-        <w:t>freezes</w:t>
-      </w:r>
-      <w:r>
-        <w:rPr>
-          <w:rFonts w:ascii="Arial" w:hAnsi="Arial" w:cs="Arial"/>
-          <w:color w:val="1F497D"/>
-          <w:sz w:val="18"/>
-          <w:szCs w:val="18"/>
-        </w:rPr>
-        <w:t xml:space="preserve"> and </w:t>
-      </w:r>
-      <w:r>
-        <w:rPr>
-          <w:rFonts w:ascii="Arial" w:hAnsi="Arial" w:cs="Arial"/>
-          <w:color w:val="1F497D"/>
-          <w:sz w:val="18"/>
-          <w:szCs w:val="18"/>
-        </w:rPr>
-        <w:t xml:space="preserve">crashes </w:t>
-      </w:r>
-      <w:r>
-        <w:rPr>
-          <w:rFonts w:ascii="Arial" w:hAnsi="Arial" w:cs="Arial"/>
-          <w:color w:val="1F497D"/>
-          <w:sz w:val="18"/>
-          <w:szCs w:val="18"/>
-        </w:rPr>
-        <w:t xml:space="preserve">that instances of the </w:t>
-      </w:r>
-      <w:r>
-        <w:rPr>
-          <w:rFonts w:ascii="Arial" w:hAnsi="Arial" w:cs="Arial"/>
-          <w:color w:val="1F497D"/>
-          <w:sz w:val="18"/>
-          <w:szCs w:val="18"/>
-        </w:rPr>
-        <w:t>v8.1.5</w:t>
-      </w:r>
-      <w:r>
-        <w:rPr>
-          <w:rFonts w:ascii="Arial" w:hAnsi="Arial" w:cs="Arial"/>
-          <w:color w:val="1F497D"/>
-          <w:sz w:val="18"/>
-          <w:szCs w:val="18"/>
-        </w:rPr>
-        <w:t xml:space="preserve"> MS Store app exhibited </w:t>
-      </w:r>
-      <w:r>
-        <w:rPr>
-          <w:rFonts w:ascii="Arial" w:hAnsi="Arial" w:cs="Arial"/>
-          <w:color w:val="1F497D"/>
-          <w:sz w:val="18"/>
-          <w:szCs w:val="18"/>
-        </w:rPr>
-        <w:t>after download/upload.</w:t>
+        <w:t xml:space="preserve">Comms Log viewer’s error </w:t>
+      </w:r>
+      <w:r>
+        <w:rPr>
+          <w:rFonts w:ascii="Arial" w:hAnsi="Arial" w:cs="Arial"/>
+          <w:color w:val="1F497D"/>
+          <w:sz w:val="18"/>
+          <w:szCs w:val="18"/>
+        </w:rPr>
+        <w:t>over</w:t>
+      </w:r>
+      <w:r>
+        <w:rPr>
+          <w:rFonts w:ascii="Arial" w:hAnsi="Arial" w:cs="Arial"/>
+          <w:color w:val="1F497D"/>
+          <w:sz w:val="18"/>
+          <w:szCs w:val="18"/>
+        </w:rPr>
+        <w:t>counts.</w:t>
       </w:r>
     </w:p>
     <w:p>
@@ -2872,7 +2599,6 @@
           <w:szCs w:val="16"/>
         </w:rPr>
       </w:pPr>
-      <w:bookmarkStart w:id="3" w:name="_Hlk203052739"/>
       <w:r>
         <w:rPr>
           <w:rFonts w:ascii="Arial" w:hAnsi="Arial" w:cs="Arial"/>
@@ -2893,7 +2619,7 @@
           <w:sz w:val="24"/>
           <w:szCs w:val="24"/>
         </w:rPr>
-        <w:t>5</w:t>
+        <w:t>6</w:t>
       </w:r>
       <w:r>
         <w:rPr>
@@ -2915,7 +2641,7 @@
           <w:sz w:val="24"/>
           <w:szCs w:val="24"/>
         </w:rPr>
-        <w:t>28</w:t>
+        <w:t>30</w:t>
       </w:r>
       <w:r>
         <w:rPr>
@@ -2978,7 +2704,6 @@
           <w:sz w:val="18"/>
           <w:szCs w:val="18"/>
         </w:rPr>
-        <w:lastRenderedPageBreak/>
         <w:t>-</w:t>
       </w:r>
       <w:r>
@@ -2997,61 +2722,106 @@
           <w:sz w:val="18"/>
           <w:szCs w:val="18"/>
         </w:rPr>
-        <w:t xml:space="preserve">The panel </w:t>
-      </w:r>
-      <w:r>
-        <w:rPr>
-          <w:rFonts w:ascii="Arial" w:hAnsi="Arial" w:cs="Arial"/>
-          <w:color w:val="1F497D"/>
-          <w:sz w:val="18"/>
-          <w:szCs w:val="18"/>
-        </w:rPr>
-        <w:t xml:space="preserve">upload </w:t>
-      </w:r>
-      <w:r>
-        <w:rPr>
-          <w:rFonts w:ascii="Arial" w:hAnsi="Arial" w:cs="Arial"/>
-          <w:color w:val="1F497D"/>
-          <w:sz w:val="18"/>
-          <w:szCs w:val="18"/>
-        </w:rPr>
-        <w:t xml:space="preserve">has been refined </w:t>
-      </w:r>
-      <w:r>
-        <w:rPr>
-          <w:rFonts w:ascii="Arial" w:hAnsi="Arial" w:cs="Arial"/>
-          <w:color w:val="1F497D"/>
-          <w:sz w:val="18"/>
-          <w:szCs w:val="18"/>
-        </w:rPr>
-        <w:t>so that d</w:t>
-      </w:r>
-      <w:r>
-        <w:rPr>
-          <w:rFonts w:ascii="Arial" w:hAnsi="Arial" w:cs="Arial"/>
-          <w:color w:val="1F497D"/>
-          <w:sz w:val="18"/>
-          <w:szCs w:val="18"/>
-        </w:rPr>
-        <w:t>uplicate data items</w:t>
-      </w:r>
-      <w:r>
-        <w:rPr>
-          <w:rFonts w:ascii="Arial" w:hAnsi="Arial" w:cs="Arial"/>
-          <w:color w:val="1F497D"/>
-          <w:sz w:val="18"/>
-          <w:szCs w:val="18"/>
-        </w:rPr>
-        <w:t xml:space="preserve"> are not sent</w:t>
-      </w:r>
-      <w:r>
-        <w:rPr>
-          <w:rFonts w:ascii="Arial" w:hAnsi="Arial" w:cs="Arial"/>
-          <w:color w:val="1F497D"/>
-          <w:sz w:val="18"/>
-          <w:szCs w:val="18"/>
-        </w:rPr>
-        <w:t>.</w:t>
+        <w:t>Test</w:t>
+      </w:r>
+      <w:r>
+        <w:rPr>
+          <w:rFonts w:ascii="Arial" w:hAnsi="Arial" w:cs="Arial"/>
+          <w:color w:val="1F497D"/>
+          <w:sz w:val="18"/>
+          <w:szCs w:val="18"/>
+        </w:rPr>
+        <w:t xml:space="preserve"> version </w:t>
+      </w:r>
+      <w:r>
+        <w:rPr>
+          <w:rFonts w:ascii="Arial" w:hAnsi="Arial" w:cs="Arial"/>
+          <w:color w:val="1F497D"/>
+          <w:sz w:val="18"/>
+          <w:szCs w:val="18"/>
+        </w:rPr>
+        <w:t xml:space="preserve">to </w:t>
+      </w:r>
+      <w:r>
+        <w:rPr>
+          <w:rFonts w:ascii="Arial" w:hAnsi="Arial" w:cs="Arial"/>
+          <w:color w:val="1F497D"/>
+          <w:sz w:val="18"/>
+          <w:szCs w:val="18"/>
+        </w:rPr>
+        <w:t xml:space="preserve">investigate </w:t>
+      </w:r>
+      <w:r>
+        <w:rPr>
+          <w:rFonts w:ascii="Arial" w:hAnsi="Arial" w:cs="Arial"/>
+          <w:color w:val="1F497D"/>
+          <w:sz w:val="18"/>
+          <w:szCs w:val="18"/>
+        </w:rPr>
+        <w:t xml:space="preserve">the </w:t>
+      </w:r>
+      <w:r>
+        <w:rPr>
+          <w:rFonts w:ascii="Arial" w:hAnsi="Arial" w:cs="Arial"/>
+          <w:color w:val="1F497D"/>
+          <w:sz w:val="18"/>
+          <w:szCs w:val="18"/>
+        </w:rPr>
+        <w:t>freezes</w:t>
+      </w:r>
+      <w:r>
+        <w:rPr>
+          <w:rFonts w:ascii="Arial" w:hAnsi="Arial" w:cs="Arial"/>
+          <w:color w:val="1F497D"/>
+          <w:sz w:val="18"/>
+          <w:szCs w:val="18"/>
+        </w:rPr>
+        <w:t xml:space="preserve"> and </w:t>
+      </w:r>
+      <w:r>
+        <w:rPr>
+          <w:rFonts w:ascii="Arial" w:hAnsi="Arial" w:cs="Arial"/>
+          <w:color w:val="1F497D"/>
+          <w:sz w:val="18"/>
+          <w:szCs w:val="18"/>
+        </w:rPr>
+        <w:t xml:space="preserve">crashes </w:t>
+      </w:r>
+      <w:r>
+        <w:rPr>
+          <w:rFonts w:ascii="Arial" w:hAnsi="Arial" w:cs="Arial"/>
+          <w:color w:val="1F497D"/>
+          <w:sz w:val="18"/>
+          <w:szCs w:val="18"/>
+        </w:rPr>
+        <w:t xml:space="preserve">that instances of the </w:t>
+      </w:r>
+      <w:r>
+        <w:rPr>
+          <w:rFonts w:ascii="Arial" w:hAnsi="Arial" w:cs="Arial"/>
+          <w:color w:val="1F497D"/>
+          <w:sz w:val="18"/>
+          <w:szCs w:val="18"/>
+        </w:rPr>
+        <w:t>v8.1.5</w:t>
+      </w:r>
+      <w:r>
+        <w:rPr>
+          <w:rFonts w:ascii="Arial" w:hAnsi="Arial" w:cs="Arial"/>
+          <w:color w:val="1F497D"/>
+          <w:sz w:val="18"/>
+          <w:szCs w:val="18"/>
+        </w:rPr>
+        <w:t xml:space="preserve"> MS Store app exhibited </w:t>
+      </w:r>
+      <w:r>
+        <w:rPr>
+          <w:rFonts w:ascii="Arial" w:hAnsi="Arial" w:cs="Arial"/>
+          <w:color w:val="1F497D"/>
+          <w:sz w:val="18"/>
+          <w:szCs w:val="18"/>
+        </w:rPr>
+        <w:t>after download/upload.</w:t>
       </w:r>
     </w:p>
     <w:p>
@@ -3074,32 +2844,97 @@
           <w:szCs w:val="18"/>
         </w:rPr>
       </w:pPr>
-      <w:r>
-        <w:rPr>
-          <w:rFonts w:ascii="Arial" w:hAnsi="Arial" w:cs="Arial"/>
-          <w:color w:val="1F497D"/>
-          <w:sz w:val="18"/>
-          <w:szCs w:val="18"/>
-        </w:rPr>
-        <w:t>-</w:t>
-      </w:r>
-      <w:r>
-        <w:rPr>
-          <w:rFonts w:ascii="Arial" w:hAnsi="Arial" w:cs="Arial"/>
-          <w:color w:val="1F497D"/>
-          <w:sz w:val="18"/>
-          <w:szCs w:val="18"/>
+    </w:p>
+    <w:p>
+      <w:pPr>
+        <w:tabs>
+          <w:tab w:val="left" w:pos="993"/>
+        </w:tabs>
+        <w:rPr>
+          <w:rFonts w:ascii="Arial" w:hAnsi="Arial" w:cs="Arial"/>
+          <w:color w:val="9CC2E5" w:themeColor="accent1" w:themeTint="99"/>
+          <w:sz w:val="16"/>
+          <w:szCs w:val="16"/>
+        </w:rPr>
+      </w:pPr>
+      <w:bookmarkStart w:id="3" w:name="_Hlk203052739"/>
+      <w:r>
+        <w:rPr>
+          <w:rFonts w:ascii="Arial" w:hAnsi="Arial" w:cs="Arial"/>
+          <w:b/>
+          <w:bCs/>
+          <w:color w:val="4472C4" w:themeColor="accent5"/>
+          <w:sz w:val="24"/>
+          <w:szCs w:val="24"/>
+        </w:rPr>
+        <w:lastRenderedPageBreak/>
+        <w:t>v8.1.</w:t>
+      </w:r>
+      <w:r>
+        <w:rPr>
+          <w:rFonts w:ascii="Arial" w:hAnsi="Arial" w:cs="Arial"/>
+          <w:b/>
+          <w:bCs/>
+          <w:color w:val="4472C4" w:themeColor="accent5"/>
+          <w:sz w:val="24"/>
+          <w:szCs w:val="24"/>
+        </w:rPr>
+        <w:t>5</w:t>
+      </w:r>
+      <w:r>
+        <w:rPr>
+          <w:rFonts w:ascii="Arial" w:hAnsi="Arial" w:cs="Arial"/>
+          <w:b/>
+          <w:bCs/>
+          <w:color w:val="4472C4" w:themeColor="accent5"/>
+          <w:sz w:val="24"/>
+          <w:szCs w:val="24"/>
         </w:rPr>
         <w:tab/>
       </w:r>
       <w:r>
         <w:rPr>
           <w:rFonts w:ascii="Arial" w:hAnsi="Arial" w:cs="Arial"/>
-          <w:color w:val="1F497D"/>
-          <w:sz w:val="18"/>
-          <w:szCs w:val="18"/>
-        </w:rPr>
-        <w:t>The Validation Window now correctly reports multiple errors on a page instead of only one.</w:t>
+          <w:b/>
+          <w:bCs/>
+          <w:color w:val="4472C4" w:themeColor="accent5"/>
+          <w:sz w:val="24"/>
+          <w:szCs w:val="24"/>
+        </w:rPr>
+        <w:t>28</w:t>
+      </w:r>
+      <w:r>
+        <w:rPr>
+          <w:rFonts w:ascii="Arial" w:hAnsi="Arial" w:cs="Arial"/>
+          <w:b/>
+          <w:bCs/>
+          <w:color w:val="4472C4" w:themeColor="accent5"/>
+          <w:sz w:val="24"/>
+          <w:szCs w:val="24"/>
+        </w:rPr>
+        <w:t>/</w:t>
+      </w:r>
+      <w:r>
+        <w:rPr>
+          <w:rFonts w:ascii="Arial" w:hAnsi="Arial" w:cs="Arial"/>
+          <w:b/>
+          <w:bCs/>
+          <w:color w:val="4472C4" w:themeColor="accent5"/>
+          <w:sz w:val="24"/>
+          <w:szCs w:val="24"/>
+        </w:rPr>
+        <w:t>07</w:t>
+      </w:r>
+      <w:r>
+        <w:rPr>
+          <w:rFonts w:ascii="Arial" w:hAnsi="Arial" w:cs="Arial"/>
+          <w:b/>
+          <w:bCs/>
+          <w:color w:val="4472C4" w:themeColor="accent5"/>
+          <w:sz w:val="24"/>
+          <w:szCs w:val="24"/>
+        </w:rPr>
+        <w:t>/2025</w:t>
       </w:r>
     </w:p>
     <w:p>
@@ -3139,34 +2974,69 @@
           <w:szCs w:val="18"/>
         </w:rPr>
         <w:tab/>
-        <w:t xml:space="preserve">The device </w:t>
-      </w:r>
-      <w:r>
-        <w:rPr>
-          <w:rFonts w:ascii="Arial" w:hAnsi="Arial" w:cs="Arial"/>
-          <w:color w:val="1F497D"/>
-          <w:sz w:val="18"/>
-          <w:szCs w:val="18"/>
-        </w:rPr>
-        <w:t xml:space="preserve">count is </w:t>
-      </w:r>
-      <w:r>
-        <w:rPr>
-          <w:rFonts w:ascii="Arial" w:hAnsi="Arial" w:cs="Arial"/>
-          <w:color w:val="1F497D"/>
-          <w:sz w:val="18"/>
-          <w:szCs w:val="18"/>
-        </w:rPr>
-        <w:t xml:space="preserve">now </w:t>
-      </w:r>
-      <w:r>
-        <w:rPr>
-          <w:rFonts w:ascii="Arial" w:hAnsi="Arial" w:cs="Arial"/>
-          <w:color w:val="1F497D"/>
-          <w:sz w:val="18"/>
-          <w:szCs w:val="18"/>
-        </w:rPr>
-        <w:t>always correct after changing protocol when downloading from a panel or reading from a file.</w:t>
+      </w:r>
+      <w:r>
+        <w:rPr>
+          <w:rFonts w:ascii="Arial" w:hAnsi="Arial" w:cs="Arial"/>
+          <w:color w:val="1F497D"/>
+          <w:sz w:val="18"/>
+          <w:szCs w:val="18"/>
+        </w:rPr>
+        <w:t xml:space="preserve">The panel </w:t>
+      </w:r>
+      <w:r>
+        <w:rPr>
+          <w:rFonts w:ascii="Arial" w:hAnsi="Arial" w:cs="Arial"/>
+          <w:color w:val="1F497D"/>
+          <w:sz w:val="18"/>
+          <w:szCs w:val="18"/>
+        </w:rPr>
+        <w:t xml:space="preserve">upload </w:t>
+      </w:r>
+      <w:r>
+        <w:rPr>
+          <w:rFonts w:ascii="Arial" w:hAnsi="Arial" w:cs="Arial"/>
+          <w:color w:val="1F497D"/>
+          <w:sz w:val="18"/>
+          <w:szCs w:val="18"/>
+        </w:rPr>
+        <w:t xml:space="preserve">has been refined </w:t>
+      </w:r>
+      <w:r>
+        <w:rPr>
+          <w:rFonts w:ascii="Arial" w:hAnsi="Arial" w:cs="Arial"/>
+          <w:color w:val="1F497D"/>
+          <w:sz w:val="18"/>
+          <w:szCs w:val="18"/>
+        </w:rPr>
+        <w:t>so that d</w:t>
+      </w:r>
+      <w:r>
+        <w:rPr>
+          <w:rFonts w:ascii="Arial" w:hAnsi="Arial" w:cs="Arial"/>
+          <w:color w:val="1F497D"/>
+          <w:sz w:val="18"/>
+          <w:szCs w:val="18"/>
+        </w:rPr>
+        <w:t>uplicate data items</w:t>
+      </w:r>
+      <w:r>
+        <w:rPr>
+          <w:rFonts w:ascii="Arial" w:hAnsi="Arial" w:cs="Arial"/>
+          <w:color w:val="1F497D"/>
+          <w:sz w:val="18"/>
+          <w:szCs w:val="18"/>
+        </w:rPr>
+        <w:t xml:space="preserve"> are not sent</w:t>
+      </w:r>
+      <w:r>
+        <w:rPr>
+          <w:rFonts w:ascii="Arial" w:hAnsi="Arial" w:cs="Arial"/>
+          <w:color w:val="1F497D"/>
+          <w:sz w:val="18"/>
+          <w:szCs w:val="18"/>
+        </w:rPr>
+        <w:t>.</w:t>
       </w:r>
     </w:p>
     <w:p>
@@ -3206,7 +3076,15 @@
           <w:szCs w:val="18"/>
         </w:rPr>
         <w:tab/>
-        <w:t>Errors with the Causes &amp; Effects page not updating after downloading or reading from file have been fixed.</w:t>
+      </w:r>
+      <w:r>
+        <w:rPr>
+          <w:rFonts w:ascii="Arial" w:hAnsi="Arial" w:cs="Arial"/>
+          <w:color w:val="1F497D"/>
+          <w:sz w:val="18"/>
+          <w:szCs w:val="18"/>
+        </w:rPr>
+        <w:t>The Validation Window now correctly reports multiple errors on a page instead of only one.</w:t>
       </w:r>
     </w:p>
     <w:p>
@@ -3229,96 +3107,51 @@
           <w:szCs w:val="18"/>
         </w:rPr>
       </w:pPr>
-    </w:p>
-    <w:p>
-      <w:pPr>
-        <w:tabs>
-          <w:tab w:val="left" w:pos="993"/>
-        </w:tabs>
-        <w:rPr>
-          <w:rFonts w:ascii="Arial" w:hAnsi="Arial" w:cs="Arial"/>
-          <w:color w:val="9CC2E5" w:themeColor="accent1" w:themeTint="99"/>
-          <w:sz w:val="16"/>
-          <w:szCs w:val="16"/>
-        </w:rPr>
-      </w:pPr>
-      <w:bookmarkStart w:id="4" w:name="_Hlk199945625"/>
-      <w:r>
-        <w:rPr>
-          <w:rFonts w:ascii="Arial" w:hAnsi="Arial" w:cs="Arial"/>
-          <w:b/>
-          <w:bCs/>
-          <w:color w:val="4472C4" w:themeColor="accent5"/>
-          <w:sz w:val="24"/>
-          <w:szCs w:val="24"/>
-        </w:rPr>
-        <w:t>v8.1.</w:t>
-      </w:r>
-      <w:r>
-        <w:rPr>
-          <w:rFonts w:ascii="Arial" w:hAnsi="Arial" w:cs="Arial"/>
-          <w:b/>
-          <w:bCs/>
-          <w:color w:val="4472C4" w:themeColor="accent5"/>
-          <w:sz w:val="24"/>
-          <w:szCs w:val="24"/>
-        </w:rPr>
-        <w:t>4</w:t>
-      </w:r>
-      <w:r>
-        <w:rPr>
-          <w:rFonts w:ascii="Arial" w:hAnsi="Arial" w:cs="Arial"/>
-          <w:b/>
-          <w:bCs/>
-          <w:color w:val="4472C4" w:themeColor="accent5"/>
-          <w:sz w:val="24"/>
-          <w:szCs w:val="24"/>
+      <w:r>
+        <w:rPr>
+          <w:rFonts w:ascii="Arial" w:hAnsi="Arial" w:cs="Arial"/>
+          <w:color w:val="1F497D"/>
+          <w:sz w:val="18"/>
+          <w:szCs w:val="18"/>
+        </w:rPr>
+        <w:t>-</w:t>
+      </w:r>
+      <w:r>
+        <w:rPr>
+          <w:rFonts w:ascii="Arial" w:hAnsi="Arial" w:cs="Arial"/>
+          <w:color w:val="1F497D"/>
+          <w:sz w:val="18"/>
+          <w:szCs w:val="18"/>
         </w:rPr>
         <w:tab/>
-      </w:r>
-      <w:r>
-        <w:rPr>
-          <w:rFonts w:ascii="Arial" w:hAnsi="Arial" w:cs="Arial"/>
-          <w:b/>
-          <w:bCs/>
-          <w:color w:val="4472C4" w:themeColor="accent5"/>
-          <w:sz w:val="24"/>
-          <w:szCs w:val="24"/>
-        </w:rPr>
-        <w:t>09</w:t>
-      </w:r>
-      <w:r>
-        <w:rPr>
-          <w:rFonts w:ascii="Arial" w:hAnsi="Arial" w:cs="Arial"/>
-          <w:b/>
-          <w:bCs/>
-          <w:color w:val="4472C4" w:themeColor="accent5"/>
-          <w:sz w:val="24"/>
-          <w:szCs w:val="24"/>
-        </w:rPr>
-        <w:t>/</w:t>
-      </w:r>
-      <w:r>
-        <w:rPr>
-          <w:rFonts w:ascii="Arial" w:hAnsi="Arial" w:cs="Arial"/>
-          <w:b/>
-          <w:bCs/>
-          <w:color w:val="4472C4" w:themeColor="accent5"/>
-          <w:sz w:val="24"/>
-          <w:szCs w:val="24"/>
-        </w:rPr>
-        <w:t>07</w:t>
-      </w:r>
-      <w:r>
-        <w:rPr>
-          <w:rFonts w:ascii="Arial" w:hAnsi="Arial" w:cs="Arial"/>
-          <w:b/>
-          <w:bCs/>
-          <w:color w:val="4472C4" w:themeColor="accent5"/>
-          <w:sz w:val="24"/>
-          <w:szCs w:val="24"/>
-        </w:rPr>
-        <w:t>/2025</w:t>
+        <w:t xml:space="preserve">The device </w:t>
+      </w:r>
+      <w:r>
+        <w:rPr>
+          <w:rFonts w:ascii="Arial" w:hAnsi="Arial" w:cs="Arial"/>
+          <w:color w:val="1F497D"/>
+          <w:sz w:val="18"/>
+          <w:szCs w:val="18"/>
+        </w:rPr>
+        <w:t xml:space="preserve">count is </w:t>
+      </w:r>
+      <w:r>
+        <w:rPr>
+          <w:rFonts w:ascii="Arial" w:hAnsi="Arial" w:cs="Arial"/>
+          <w:color w:val="1F497D"/>
+          <w:sz w:val="18"/>
+          <w:szCs w:val="18"/>
+        </w:rPr>
+        <w:t xml:space="preserve">now </w:t>
+      </w:r>
+      <w:r>
+        <w:rPr>
+          <w:rFonts w:ascii="Arial" w:hAnsi="Arial" w:cs="Arial"/>
+          <w:color w:val="1F497D"/>
+          <w:sz w:val="18"/>
+          <w:szCs w:val="18"/>
+        </w:rPr>
+        <w:t>always correct after changing protocol when downloading from a panel or reading from a file.</w:t>
       </w:r>
     </w:p>
     <w:p>
@@ -3358,35 +3191,167 @@
           <w:szCs w:val="18"/>
         </w:rPr>
         <w:tab/>
-      </w:r>
-      <w:r>
-        <w:rPr>
-          <w:rFonts w:ascii="Arial" w:hAnsi="Arial" w:cs="Arial"/>
-          <w:color w:val="1F497D"/>
-          <w:sz w:val="18"/>
-          <w:szCs w:val="18"/>
-        </w:rPr>
-        <w:t>Groups page: Phased Delay can now be disabled by setting it to “</w:t>
-      </w:r>
-      <w:proofErr w:type="gramStart"/>
-      <w:r>
-        <w:rPr>
-          <w:rFonts w:ascii="Arial" w:hAnsi="Arial" w:cs="Arial"/>
-          <w:color w:val="1F497D"/>
-          <w:sz w:val="18"/>
-          <w:szCs w:val="18"/>
-        </w:rPr>
-        <w:t>--:--</w:t>
-      </w:r>
-      <w:proofErr w:type="gramEnd"/>
-      <w:r>
-        <w:rPr>
-          <w:rFonts w:ascii="Arial" w:hAnsi="Arial" w:cs="Arial"/>
-          <w:color w:val="1F497D"/>
-          <w:sz w:val="18"/>
-          <w:szCs w:val="18"/>
-        </w:rPr>
-        <w:t>“.</w:t>
+        <w:t>Errors with the Causes &amp; Effects page not updating after downloading or reading from file have been fixed.</w:t>
+      </w:r>
+    </w:p>
+    <w:p>
+      <w:pPr>
+        <w:tabs>
+          <w:tab w:val="left" w:pos="284"/>
+          <w:tab w:val="left" w:pos="567"/>
+          <w:tab w:val="left" w:pos="993"/>
+          <w:tab w:val="left" w:pos="1418"/>
+          <w:tab w:val="right" w:pos="9000"/>
+        </w:tabs>
+        <w:suppressAutoHyphens/>
+        <w:autoSpaceDN w:val="0"/>
+        <w:ind w:left="284" w:hanging="284"/>
+        <w:contextualSpacing/>
+        <w:rPr>
+          <w:rFonts w:ascii="Arial" w:hAnsi="Arial" w:cs="Arial"/>
+          <w:color w:val="1F497D"/>
+          <w:sz w:val="18"/>
+          <w:szCs w:val="18"/>
+        </w:rPr>
+      </w:pPr>
+    </w:p>
+    <w:p>
+      <w:pPr>
+        <w:tabs>
+          <w:tab w:val="left" w:pos="993"/>
+        </w:tabs>
+        <w:rPr>
+          <w:rFonts w:ascii="Arial" w:hAnsi="Arial" w:cs="Arial"/>
+          <w:color w:val="9CC2E5" w:themeColor="accent1" w:themeTint="99"/>
+          <w:sz w:val="16"/>
+          <w:szCs w:val="16"/>
+        </w:rPr>
+      </w:pPr>
+      <w:bookmarkStart w:id="4" w:name="_Hlk199945625"/>
+      <w:r>
+        <w:rPr>
+          <w:rFonts w:ascii="Arial" w:hAnsi="Arial" w:cs="Arial"/>
+          <w:b/>
+          <w:bCs/>
+          <w:color w:val="4472C4" w:themeColor="accent5"/>
+          <w:sz w:val="24"/>
+          <w:szCs w:val="24"/>
+        </w:rPr>
+        <w:t>v8.1.</w:t>
+      </w:r>
+      <w:r>
+        <w:rPr>
+          <w:rFonts w:ascii="Arial" w:hAnsi="Arial" w:cs="Arial"/>
+          <w:b/>
+          <w:bCs/>
+          <w:color w:val="4472C4" w:themeColor="accent5"/>
+          <w:sz w:val="24"/>
+          <w:szCs w:val="24"/>
+        </w:rPr>
+        <w:t>4</w:t>
+      </w:r>
+      <w:r>
+        <w:rPr>
+          <w:rFonts w:ascii="Arial" w:hAnsi="Arial" w:cs="Arial"/>
+          <w:b/>
+          <w:bCs/>
+          <w:color w:val="4472C4" w:themeColor="accent5"/>
+          <w:sz w:val="24"/>
+          <w:szCs w:val="24"/>
+        </w:rPr>
+        <w:tab/>
+      </w:r>
+      <w:r>
+        <w:rPr>
+          <w:rFonts w:ascii="Arial" w:hAnsi="Arial" w:cs="Arial"/>
+          <w:b/>
+          <w:bCs/>
+          <w:color w:val="4472C4" w:themeColor="accent5"/>
+          <w:sz w:val="24"/>
+          <w:szCs w:val="24"/>
+        </w:rPr>
+        <w:t>09</w:t>
+      </w:r>
+      <w:r>
+        <w:rPr>
+          <w:rFonts w:ascii="Arial" w:hAnsi="Arial" w:cs="Arial"/>
+          <w:b/>
+          <w:bCs/>
+          <w:color w:val="4472C4" w:themeColor="accent5"/>
+          <w:sz w:val="24"/>
+          <w:szCs w:val="24"/>
+        </w:rPr>
+        <w:t>/</w:t>
+      </w:r>
+      <w:r>
+        <w:rPr>
+          <w:rFonts w:ascii="Arial" w:hAnsi="Arial" w:cs="Arial"/>
+          <w:b/>
+          <w:bCs/>
+          <w:color w:val="4472C4" w:themeColor="accent5"/>
+          <w:sz w:val="24"/>
+          <w:szCs w:val="24"/>
+        </w:rPr>
+        <w:t>07</w:t>
+      </w:r>
+      <w:r>
+        <w:rPr>
+          <w:rFonts w:ascii="Arial" w:hAnsi="Arial" w:cs="Arial"/>
+          <w:b/>
+          <w:bCs/>
+          <w:color w:val="4472C4" w:themeColor="accent5"/>
+          <w:sz w:val="24"/>
+          <w:szCs w:val="24"/>
+        </w:rPr>
+        <w:t>/2025</w:t>
+      </w:r>
+    </w:p>
+    <w:p>
+      <w:pPr>
+        <w:tabs>
+          <w:tab w:val="left" w:pos="284"/>
+          <w:tab w:val="left" w:pos="567"/>
+          <w:tab w:val="left" w:pos="993"/>
+          <w:tab w:val="left" w:pos="1418"/>
+          <w:tab w:val="right" w:pos="9000"/>
+        </w:tabs>
+        <w:suppressAutoHyphens/>
+        <w:autoSpaceDN w:val="0"/>
+        <w:ind w:left="284" w:hanging="284"/>
+        <w:contextualSpacing/>
+        <w:rPr>
+          <w:rFonts w:ascii="Arial" w:hAnsi="Arial" w:cs="Arial"/>
+          <w:color w:val="1F497D"/>
+          <w:sz w:val="18"/>
+          <w:szCs w:val="18"/>
+        </w:rPr>
+      </w:pPr>
+      <w:r>
+        <w:rPr>
+          <w:rFonts w:ascii="Arial" w:hAnsi="Arial" w:cs="Arial"/>
+          <w:color w:val="1F497D"/>
+          <w:sz w:val="18"/>
+          <w:szCs w:val="18"/>
+        </w:rPr>
+        <w:t>-</w:t>
+      </w:r>
+      <w:r>
+        <w:rPr>
+          <w:rFonts w:ascii="Arial" w:hAnsi="Arial" w:cs="Arial"/>
+          <w:color w:val="1F497D"/>
+          <w:sz w:val="18"/>
+          <w:szCs w:val="18"/>
+        </w:rPr>
+        <w:tab/>
+      </w:r>
+      <w:r>
+        <w:rPr>
+          <w:rFonts w:ascii="Arial" w:hAnsi="Arial" w:cs="Arial"/>
+          <w:color w:val="1F497D"/>
+          <w:sz w:val="18"/>
+          <w:szCs w:val="18"/>
+        </w:rPr>
+        <w:t>Groups page: Phased Delay can now be disabled by setting it to “--:--“.</w:t>
       </w:r>
     </w:p>
     <w:p>
@@ -5462,6 +5427,7 @@
           <w:sz w:val="18"/>
           <w:szCs w:val="18"/>
         </w:rPr>
+        <w:lastRenderedPageBreak/>
         <w:t>-</w:t>
       </w:r>
       <w:r>
@@ -7465,45 +7431,14 @@
         </w:rPr>
         <w:tab/>
       </w:r>
-      <w:proofErr w:type="spellStart"/>
-      <w:r>
-        <w:rPr>
-          <w:rFonts w:ascii="Arial" w:hAnsi="Arial" w:cs="Arial"/>
-          <w:color w:val="1F4E79" w:themeColor="accent1" w:themeShade="80"/>
-          <w:sz w:val="18"/>
-          <w:szCs w:val="18"/>
-        </w:rPr>
-        <w:t>NumberSpinner</w:t>
-      </w:r>
-      <w:proofErr w:type="spellEnd"/>
-      <w:r>
-        <w:rPr>
-          <w:rFonts w:ascii="Arial" w:hAnsi="Arial" w:cs="Arial"/>
-          <w:color w:val="1F4E79" w:themeColor="accent1" w:themeShade="80"/>
-          <w:sz w:val="18"/>
-          <w:szCs w:val="18"/>
-        </w:rPr>
-        <w:t xml:space="preserve"> control: added </w:t>
-      </w:r>
-      <w:proofErr w:type="spellStart"/>
-      <w:r>
-        <w:rPr>
-          <w:rFonts w:ascii="Arial" w:hAnsi="Arial" w:cs="Arial"/>
-          <w:color w:val="1F4E79" w:themeColor="accent1" w:themeShade="80"/>
-          <w:sz w:val="18"/>
-          <w:szCs w:val="18"/>
-        </w:rPr>
-        <w:t>NumberSet</w:t>
-      </w:r>
-      <w:proofErr w:type="spellEnd"/>
-      <w:r>
-        <w:rPr>
-          <w:rFonts w:ascii="Arial" w:hAnsi="Arial" w:cs="Arial"/>
-          <w:color w:val="1F4E79" w:themeColor="accent1" w:themeShade="80"/>
-          <w:sz w:val="18"/>
-          <w:szCs w:val="18"/>
-        </w:rPr>
-        <w:t xml:space="preserve"> property, that defines the set of valid values for the case when the valid values are not consecutive, and </w:t>
+      <w:r>
+        <w:rPr>
+          <w:rFonts w:ascii="Arial" w:hAnsi="Arial" w:cs="Arial"/>
+          <w:color w:val="1F4E79" w:themeColor="accent1" w:themeShade="80"/>
+          <w:sz w:val="18"/>
+          <w:szCs w:val="18"/>
+        </w:rPr>
+        <w:t xml:space="preserve">NumberSpinner control: added NumberSet property, that defines the set of valid values for the case when the valid values are not consecutive, and </w:t>
       </w:r>
       <w:r>
         <w:rPr>
@@ -7692,6 +7627,7 @@
           <w:sz w:val="18"/>
           <w:szCs w:val="18"/>
         </w:rPr>
+        <w:lastRenderedPageBreak/>
         <w:t>-</w:t>
       </w:r>
       <w:r>
@@ -7791,7 +7727,6 @@
           <w:sz w:val="18"/>
           <w:szCs w:val="18"/>
         </w:rPr>
-        <w:lastRenderedPageBreak/>
         <w:t>-</w:t>
       </w:r>
       <w:r>
@@ -8458,37 +8393,7 @@
           <w:sz w:val="18"/>
           <w:szCs w:val="18"/>
         </w:rPr>
-        <w:t xml:space="preserve">Default </w:t>
-      </w:r>
-      <w:proofErr w:type="spellStart"/>
-      <w:r>
-        <w:rPr>
-          <w:rFonts w:ascii="Arial" w:hAnsi="Arial" w:cs="Arial"/>
-          <w:color w:val="1F4E79" w:themeColor="accent1" w:themeShade="80"/>
-          <w:sz w:val="18"/>
-          <w:szCs w:val="18"/>
-        </w:rPr>
-        <w:t>DeviceData</w:t>
-      </w:r>
-      <w:proofErr w:type="spellEnd"/>
-      <w:r>
-        <w:rPr>
-          <w:rFonts w:ascii="Arial" w:hAnsi="Arial" w:cs="Arial"/>
-          <w:color w:val="1F4E79" w:themeColor="accent1" w:themeShade="80"/>
-          <w:sz w:val="18"/>
-          <w:szCs w:val="18"/>
-        </w:rPr>
-        <w:t xml:space="preserve"> day/night modes are now set according to the device </w:t>
-      </w:r>
-      <w:proofErr w:type="gramStart"/>
-      <w:r>
-        <w:rPr>
-          <w:rFonts w:ascii="Arial" w:hAnsi="Arial" w:cs="Arial"/>
-          <w:color w:val="1F4E79" w:themeColor="accent1" w:themeShade="80"/>
-          <w:sz w:val="18"/>
-          <w:szCs w:val="18"/>
-        </w:rPr>
-        <w:t>type</w:t>
+        <w:t>Default DeviceData day/night modes are now set according to the device type</w:t>
       </w:r>
       <w:r>
         <w:rPr>
@@ -8506,17 +8411,7 @@
           <w:sz w:val="18"/>
           <w:szCs w:val="18"/>
         </w:rPr>
-        <w:t xml:space="preserve"> and</w:t>
-      </w:r>
-      <w:proofErr w:type="gramEnd"/>
-      <w:r>
-        <w:rPr>
-          <w:rFonts w:ascii="Arial" w:hAnsi="Arial" w:cs="Arial"/>
-          <w:color w:val="1F4E79" w:themeColor="accent1" w:themeShade="80"/>
-          <w:sz w:val="18"/>
-          <w:szCs w:val="18"/>
-        </w:rPr>
-        <w:t xml:space="preserve"> are set to default values when a device is changed or added.</w:t>
+        <w:t xml:space="preserve"> and are set to default values when a device is changed or added.</w:t>
       </w:r>
     </w:p>
     <w:p>
@@ -8849,27 +8744,7 @@
           <w:sz w:val="18"/>
           <w:szCs w:val="18"/>
         </w:rPr>
-        <w:t xml:space="preserve">The </w:t>
-      </w:r>
-      <w:proofErr w:type="spellStart"/>
-      <w:r>
-        <w:rPr>
-          <w:rFonts w:ascii="Arial" w:hAnsi="Arial" w:cs="Arial"/>
-          <w:color w:val="1F4E79" w:themeColor="accent1" w:themeShade="80"/>
-          <w:sz w:val="18"/>
-          <w:szCs w:val="18"/>
-        </w:rPr>
-        <w:t>TimePicker</w:t>
-      </w:r>
-      <w:proofErr w:type="spellEnd"/>
-      <w:r>
-        <w:rPr>
-          <w:rFonts w:ascii="Arial" w:hAnsi="Arial" w:cs="Arial"/>
-          <w:color w:val="1F4E79" w:themeColor="accent1" w:themeShade="80"/>
-          <w:sz w:val="18"/>
-          <w:szCs w:val="18"/>
-        </w:rPr>
-        <w:t xml:space="preserve"> control </w:t>
+        <w:t xml:space="preserve">The TimePicker control </w:t>
       </w:r>
       <w:r>
         <w:rPr>
@@ -8905,9 +8780,8 @@
           <w:sz w:val="18"/>
           <w:szCs w:val="18"/>
         </w:rPr>
-        <w:t xml:space="preserve"> “</w:t>
-      </w:r>
-      <w:proofErr w:type="gramStart"/>
+        <w:t xml:space="preserve"> “-</w:t>
+      </w:r>
       <w:r>
         <w:rPr>
           <w:rFonts w:ascii="Arial" w:hAnsi="Arial" w:cs="Arial"/>
@@ -8924,15 +8798,6 @@
           <w:sz w:val="18"/>
           <w:szCs w:val="18"/>
         </w:rPr>
-        <w:t>-</w:t>
-      </w:r>
-      <w:r>
-        <w:rPr>
-          <w:rFonts w:ascii="Arial" w:hAnsi="Arial" w:cs="Arial"/>
-          <w:color w:val="1F4E79" w:themeColor="accent1" w:themeShade="80"/>
-          <w:sz w:val="18"/>
-          <w:szCs w:val="18"/>
-        </w:rPr>
         <w:t>:--“</w:t>
       </w:r>
       <w:r>
@@ -8942,17 +8807,7 @@
           <w:sz w:val="18"/>
           <w:szCs w:val="18"/>
         </w:rPr>
-        <w:t xml:space="preserve"> to</w:t>
-      </w:r>
-      <w:proofErr w:type="gramEnd"/>
-      <w:r>
-        <w:rPr>
-          <w:rFonts w:ascii="Arial" w:hAnsi="Arial" w:cs="Arial"/>
-          <w:color w:val="1F4E79" w:themeColor="accent1" w:themeShade="80"/>
-          <w:sz w:val="18"/>
-          <w:szCs w:val="18"/>
-        </w:rPr>
-        <w:t xml:space="preserve"> indicate Never</w:t>
+        <w:t xml:space="preserve"> to indicate Never</w:t>
       </w:r>
       <w:r>
         <w:rPr>
@@ -9215,27 +9070,7 @@
           <w:sz w:val="18"/>
           <w:szCs w:val="18"/>
         </w:rPr>
-        <w:t xml:space="preserve">; </w:t>
-      </w:r>
-      <w:proofErr w:type="gramStart"/>
-      <w:r>
-        <w:rPr>
-          <w:rFonts w:ascii="Arial" w:hAnsi="Arial" w:cs="Arial"/>
-          <w:color w:val="1F4E79" w:themeColor="accent1" w:themeShade="80"/>
-          <w:sz w:val="18"/>
-          <w:szCs w:val="18"/>
-        </w:rPr>
-        <w:t>also</w:t>
-      </w:r>
-      <w:proofErr w:type="gramEnd"/>
-      <w:r>
-        <w:rPr>
-          <w:rFonts w:ascii="Arial" w:hAnsi="Arial" w:cs="Arial"/>
-          <w:color w:val="1F4E79" w:themeColor="accent1" w:themeShade="80"/>
-          <w:sz w:val="18"/>
-          <w:szCs w:val="18"/>
-        </w:rPr>
-        <w:t xml:space="preserve"> the option to remove it from the Recent Files list</w:t>
+        <w:t>; also the option to remove it from the Recent Files list</w:t>
       </w:r>
       <w:r>
         <w:rPr>
@@ -9343,38 +9178,16 @@
           <w:sz w:val="18"/>
           <w:szCs w:val="18"/>
         </w:rPr>
-        <w:t xml:space="preserve">Importing from </w:t>
-      </w:r>
-      <w:proofErr w:type="gramStart"/>
-      <w:r>
-        <w:rPr>
-          <w:rFonts w:ascii="Arial" w:hAnsi="Arial" w:cs="Arial"/>
-          <w:color w:val="1F4E79" w:themeColor="accent1" w:themeShade="80"/>
-          <w:sz w:val="18"/>
-          <w:szCs w:val="18"/>
-        </w:rPr>
-        <w:t>a .</w:t>
-      </w:r>
-      <w:proofErr w:type="spellStart"/>
-      <w:r>
-        <w:rPr>
-          <w:rFonts w:ascii="Arial" w:hAnsi="Arial" w:cs="Arial"/>
-          <w:color w:val="1F4E79" w:themeColor="accent1" w:themeShade="80"/>
-          <w:sz w:val="18"/>
-          <w:szCs w:val="18"/>
-        </w:rPr>
-        <w:t>xfp</w:t>
-      </w:r>
-      <w:proofErr w:type="spellEnd"/>
-      <w:proofErr w:type="gramEnd"/>
-      <w:r>
-        <w:rPr>
-          <w:rFonts w:ascii="Arial" w:hAnsi="Arial" w:cs="Arial"/>
-          <w:color w:val="1F4E79" w:themeColor="accent1" w:themeShade="80"/>
-          <w:sz w:val="18"/>
-          <w:szCs w:val="18"/>
-        </w:rPr>
-        <w:t xml:space="preserve"> </w:t>
+        <w:t>Importing from a .</w:t>
+      </w:r>
+      <w:r>
+        <w:rPr>
+          <w:rFonts w:ascii="Arial" w:hAnsi="Arial" w:cs="Arial"/>
+          <w:color w:val="1F4E79" w:themeColor="accent1" w:themeShade="80"/>
+          <w:sz w:val="18"/>
+          <w:szCs w:val="18"/>
+        </w:rPr>
+        <w:t xml:space="preserve">xfp </w:t>
       </w:r>
       <w:r>
         <w:rPr>
@@ -9915,27 +9728,7 @@
           <w:sz w:val="18"/>
           <w:szCs w:val="18"/>
         </w:rPr>
-        <w:t xml:space="preserve">Corrected the </w:t>
-      </w:r>
-      <w:proofErr w:type="spellStart"/>
-      <w:r>
-        <w:rPr>
-          <w:rFonts w:ascii="Arial" w:hAnsi="Arial" w:cs="Arial"/>
-          <w:color w:val="1F4E79" w:themeColor="accent1" w:themeShade="80"/>
-          <w:sz w:val="18"/>
-          <w:szCs w:val="18"/>
-        </w:rPr>
-        <w:t>TimePicker</w:t>
-      </w:r>
-      <w:proofErr w:type="spellEnd"/>
-      <w:r>
-        <w:rPr>
-          <w:rFonts w:ascii="Arial" w:hAnsi="Arial" w:cs="Arial"/>
-          <w:color w:val="1F4E79" w:themeColor="accent1" w:themeShade="80"/>
-          <w:sz w:val="18"/>
-          <w:szCs w:val="18"/>
-        </w:rPr>
-        <w:t xml:space="preserve"> control so that its time format now reflects a change of language.</w:t>
+        <w:t>Corrected the TimePicker control so that its time format now reflects a change of language.</w:t>
       </w:r>
     </w:p>
     <w:p>
@@ -9977,6 +9770,7 @@
           <w:sz w:val="24"/>
           <w:szCs w:val="24"/>
         </w:rPr>
+        <w:lastRenderedPageBreak/>
         <w:t>v7.0.5</w:t>
       </w:r>
       <w:r>

</xml_diff>

<commit_message>
260428 updated revision histories
260428 updated revision histories
</commit_message>
<xml_diff>
--- a/XFP/Resources/XFP Revision History[en-GB].docx
+++ b/XFP/Resources/XFP Revision History[en-GB].docx
@@ -47,7 +47,7 @@
           <w:sz w:val="24"/>
           <w:szCs w:val="24"/>
         </w:rPr>
-        <w:t>v8.1.</w:t>
+        <w:t>v8.1.1</w:t>
       </w:r>
       <w:r>
         <w:rPr>
@@ -58,7 +58,7 @@
           <w:sz w:val="24"/>
           <w:szCs w:val="24"/>
         </w:rPr>
-        <w:t>15</w:t>
+        <w:t>6</w:t>
       </w:r>
       <w:r>
         <w:rPr>
@@ -80,7 +80,7 @@
           <w:sz w:val="24"/>
           <w:szCs w:val="24"/>
         </w:rPr>
-        <w:t>14/</w:t>
+        <w:t>29</w:t>
       </w:r>
       <w:r>
         <w:rPr>
@@ -91,7 +91,7 @@
           <w:sz w:val="24"/>
           <w:szCs w:val="24"/>
         </w:rPr>
-        <w:t>04</w:t>
+        <w:t>/04</w:t>
       </w:r>
       <w:r>
         <w:rPr>
@@ -136,7 +136,7 @@
           <w:sz w:val="18"/>
           <w:szCs w:val="18"/>
         </w:rPr>
-        <w:t>New features</w:t>
+        <w:t>Fixes</w:t>
       </w:r>
     </w:p>
     <w:p>
@@ -176,7 +176,141 @@
           <w:szCs w:val="18"/>
         </w:rPr>
         <w:tab/>
-        <w:t>The feature for custom icons and title bar colour has been added to the popup message box. For example, error and warning messages now use red and orange title bars respectively.</w:t>
+      </w:r>
+      <w:r>
+        <w:rPr>
+          <w:rFonts w:ascii="Arial" w:hAnsi="Arial" w:cs="Arial"/>
+          <w:color w:val="1F497D"/>
+          <w:sz w:val="18"/>
+          <w:szCs w:val="18"/>
+        </w:rPr>
+        <w:t xml:space="preserve">The fault that caused the app to shut down when opening the </w:t>
+      </w:r>
+      <w:r>
+        <w:rPr>
+          <w:rFonts w:ascii="Arial" w:hAnsi="Arial" w:cs="Arial"/>
+          <w:color w:val="1F497D"/>
+          <w:sz w:val="18"/>
+          <w:szCs w:val="18"/>
+        </w:rPr>
+        <w:t>print options window</w:t>
+      </w:r>
+      <w:r>
+        <w:rPr>
+          <w:rFonts w:ascii="Arial" w:hAnsi="Arial" w:cs="Arial"/>
+          <w:color w:val="1F497D"/>
+          <w:sz w:val="18"/>
+          <w:szCs w:val="18"/>
+        </w:rPr>
+        <w:t xml:space="preserve"> has been corrected</w:t>
+      </w:r>
+      <w:r>
+        <w:rPr>
+          <w:rFonts w:ascii="Arial" w:hAnsi="Arial" w:cs="Arial"/>
+          <w:color w:val="1F497D"/>
+          <w:sz w:val="18"/>
+          <w:szCs w:val="18"/>
+        </w:rPr>
+        <w:t>.</w:t>
+      </w:r>
+    </w:p>
+    <w:p>
+      <w:pPr>
+        <w:tabs>
+          <w:tab w:val="left" w:pos="284"/>
+          <w:tab w:val="left" w:pos="567"/>
+          <w:tab w:val="left" w:pos="993"/>
+          <w:tab w:val="left" w:pos="1418"/>
+          <w:tab w:val="right" w:pos="9000"/>
+        </w:tabs>
+        <w:suppressAutoHyphens/>
+        <w:autoSpaceDN w:val="0"/>
+        <w:contextualSpacing/>
+        <w:rPr>
+          <w:rFonts w:ascii="Arial" w:hAnsi="Arial" w:cs="Arial"/>
+          <w:color w:val="1F497D"/>
+          <w:sz w:val="18"/>
+          <w:szCs w:val="18"/>
+        </w:rPr>
+      </w:pPr>
+    </w:p>
+    <w:p>
+      <w:pPr>
+        <w:tabs>
+          <w:tab w:val="left" w:pos="993"/>
+        </w:tabs>
+        <w:rPr>
+          <w:rFonts w:ascii="Arial" w:hAnsi="Arial" w:cs="Arial"/>
+          <w:color w:val="9CC2E5" w:themeColor="accent1" w:themeTint="99"/>
+          <w:sz w:val="16"/>
+          <w:szCs w:val="16"/>
+        </w:rPr>
+      </w:pPr>
+      <w:r>
+        <w:rPr>
+          <w:rFonts w:ascii="Arial" w:hAnsi="Arial" w:cs="Arial"/>
+          <w:b/>
+          <w:bCs/>
+          <w:color w:val="4472C4" w:themeColor="accent5"/>
+          <w:sz w:val="24"/>
+          <w:szCs w:val="24"/>
+        </w:rPr>
+        <w:t>v8.1.</w:t>
+      </w:r>
+      <w:r>
+        <w:rPr>
+          <w:rFonts w:ascii="Arial" w:hAnsi="Arial" w:cs="Arial"/>
+          <w:b/>
+          <w:bCs/>
+          <w:color w:val="4472C4" w:themeColor="accent5"/>
+          <w:sz w:val="24"/>
+          <w:szCs w:val="24"/>
+        </w:rPr>
+        <w:t>15</w:t>
+      </w:r>
+      <w:r>
+        <w:rPr>
+          <w:rFonts w:ascii="Arial" w:hAnsi="Arial" w:cs="Arial"/>
+          <w:b/>
+          <w:bCs/>
+          <w:color w:val="4472C4" w:themeColor="accent5"/>
+          <w:sz w:val="24"/>
+          <w:szCs w:val="24"/>
+        </w:rPr>
+        <w:tab/>
+      </w:r>
+      <w:r>
+        <w:rPr>
+          <w:rFonts w:ascii="Arial" w:hAnsi="Arial" w:cs="Arial"/>
+          <w:b/>
+          <w:bCs/>
+          <w:color w:val="4472C4" w:themeColor="accent5"/>
+          <w:sz w:val="24"/>
+          <w:szCs w:val="24"/>
+        </w:rPr>
+        <w:t>14/</w:t>
+      </w:r>
+      <w:r>
+        <w:rPr>
+          <w:rFonts w:ascii="Arial" w:hAnsi="Arial" w:cs="Arial"/>
+          <w:b/>
+          <w:bCs/>
+          <w:color w:val="4472C4" w:themeColor="accent5"/>
+          <w:sz w:val="24"/>
+          <w:szCs w:val="24"/>
+        </w:rPr>
+        <w:t>04</w:t>
+      </w:r>
+      <w:r>
+        <w:rPr>
+          <w:rFonts w:ascii="Arial" w:hAnsi="Arial" w:cs="Arial"/>
+          <w:b/>
+          <w:bCs/>
+          <w:color w:val="4472C4" w:themeColor="accent5"/>
+          <w:sz w:val="24"/>
+          <w:szCs w:val="24"/>
+        </w:rPr>
+        <w:t>/2026</w:t>
       </w:r>
     </w:p>
     <w:p>
@@ -194,11 +328,24 @@
         <w:contextualSpacing/>
         <w:rPr>
           <w:rFonts w:ascii="Arial" w:hAnsi="Arial" w:cs="Arial"/>
-          <w:color w:val="1F497D"/>
-          <w:sz w:val="18"/>
-          <w:szCs w:val="18"/>
-        </w:rPr>
-      </w:pPr>
+          <w:b/>
+          <w:bCs/>
+          <w:color w:val="1F497D"/>
+          <w:sz w:val="18"/>
+          <w:szCs w:val="18"/>
+        </w:rPr>
+      </w:pPr>
+      <w:r>
+        <w:rPr>
+          <w:rFonts w:ascii="Arial" w:hAnsi="Arial" w:cs="Arial"/>
+          <w:b/>
+          <w:bCs/>
+          <w:color w:val="1F497D"/>
+          <w:sz w:val="18"/>
+          <w:szCs w:val="18"/>
+        </w:rPr>
+        <w:t>New features</w:t>
+      </w:r>
     </w:p>
     <w:p>
       <w:pPr>
@@ -215,23 +362,29 @@
         <w:contextualSpacing/>
         <w:rPr>
           <w:rFonts w:ascii="Arial" w:hAnsi="Arial" w:cs="Arial"/>
-          <w:b/>
-          <w:bCs/>
-          <w:color w:val="1F497D"/>
-          <w:sz w:val="18"/>
-          <w:szCs w:val="18"/>
-        </w:rPr>
-      </w:pPr>
-      <w:r>
-        <w:rPr>
-          <w:rFonts w:ascii="Arial" w:hAnsi="Arial" w:cs="Arial"/>
-          <w:b/>
-          <w:bCs/>
-          <w:color w:val="1F497D"/>
-          <w:sz w:val="18"/>
-          <w:szCs w:val="18"/>
-        </w:rPr>
-        <w:t>Fixes</w:t>
+          <w:color w:val="1F497D"/>
+          <w:sz w:val="18"/>
+          <w:szCs w:val="18"/>
+        </w:rPr>
+      </w:pPr>
+      <w:r>
+        <w:rPr>
+          <w:rFonts w:ascii="Arial" w:hAnsi="Arial" w:cs="Arial"/>
+          <w:color w:val="1F497D"/>
+          <w:sz w:val="18"/>
+          <w:szCs w:val="18"/>
+        </w:rPr>
+        <w:t>•</w:t>
+      </w:r>
+      <w:r>
+        <w:rPr>
+          <w:rFonts w:ascii="Arial" w:hAnsi="Arial" w:cs="Arial"/>
+          <w:color w:val="1F497D"/>
+          <w:sz w:val="18"/>
+          <w:szCs w:val="18"/>
+        </w:rPr>
+        <w:tab/>
+        <w:t>The feature for custom icons and title bar colour has been added to the popup message box. For example, error and warning messages now use red and orange title bars respectively.</w:t>
       </w:r>
     </w:p>
     <w:p>
@@ -254,69 +407,6 @@
           <w:szCs w:val="18"/>
         </w:rPr>
       </w:pPr>
-      <w:r>
-        <w:rPr>
-          <w:rFonts w:ascii="Arial" w:hAnsi="Arial" w:cs="Arial"/>
-          <w:color w:val="1F497D"/>
-          <w:sz w:val="18"/>
-          <w:szCs w:val="18"/>
-        </w:rPr>
-        <w:t>•</w:t>
-      </w:r>
-      <w:r>
-        <w:rPr>
-          <w:rFonts w:ascii="Arial" w:hAnsi="Arial" w:cs="Arial"/>
-          <w:color w:val="1F497D"/>
-          <w:sz w:val="18"/>
-          <w:szCs w:val="18"/>
-        </w:rPr>
-        <w:tab/>
-      </w:r>
-      <w:r>
-        <w:rPr>
-          <w:rFonts w:ascii="Arial" w:hAnsi="Arial" w:cs="Arial"/>
-          <w:color w:val="1F497D"/>
-          <w:sz w:val="18"/>
-          <w:szCs w:val="18"/>
-        </w:rPr>
-        <w:t xml:space="preserve">Zone </w:t>
-      </w:r>
-      <w:r>
-        <w:rPr>
-          <w:rFonts w:ascii="Arial" w:hAnsi="Arial" w:cs="Arial"/>
-          <w:color w:val="1F497D"/>
-          <w:sz w:val="18"/>
-          <w:szCs w:val="18"/>
-        </w:rPr>
-        <w:t xml:space="preserve">names sent to the XFP panel being </w:t>
-      </w:r>
-      <w:r>
-        <w:rPr>
-          <w:rFonts w:ascii="Arial" w:hAnsi="Arial" w:cs="Arial"/>
-          <w:color w:val="1F497D"/>
-          <w:sz w:val="18"/>
-          <w:szCs w:val="18"/>
-        </w:rPr>
-        <w:t>assigned to</w:t>
-      </w:r>
-      <w:r>
-        <w:rPr>
-          <w:rFonts w:ascii="Arial" w:hAnsi="Arial" w:cs="Arial"/>
-          <w:color w:val="1F497D"/>
-          <w:sz w:val="18"/>
-          <w:szCs w:val="18"/>
-        </w:rPr>
-        <w:t xml:space="preserve"> the wrong zone has been corrected</w:t>
-      </w:r>
-      <w:r>
-        <w:rPr>
-          <w:rFonts w:ascii="Arial" w:hAnsi="Arial" w:cs="Arial"/>
-          <w:color w:val="1F497D"/>
-          <w:sz w:val="18"/>
-          <w:szCs w:val="18"/>
-        </w:rPr>
-        <w:t>.</w:t>
-      </w:r>
     </w:p>
     <w:p>
       <w:pPr>
@@ -333,56 +423,23 @@
         <w:contextualSpacing/>
         <w:rPr>
           <w:rFonts w:ascii="Arial" w:hAnsi="Arial" w:cs="Arial"/>
-          <w:color w:val="1F497D"/>
-          <w:sz w:val="18"/>
-          <w:szCs w:val="18"/>
-        </w:rPr>
-      </w:pPr>
-      <w:r>
-        <w:rPr>
-          <w:rFonts w:ascii="Arial" w:hAnsi="Arial" w:cs="Arial"/>
-          <w:color w:val="1F497D"/>
-          <w:sz w:val="18"/>
-          <w:szCs w:val="18"/>
-        </w:rPr>
-        <w:t>•</w:t>
-      </w:r>
-      <w:r>
-        <w:rPr>
-          <w:rFonts w:ascii="Arial" w:hAnsi="Arial" w:cs="Arial"/>
-          <w:color w:val="1F497D"/>
-          <w:sz w:val="18"/>
-          <w:szCs w:val="18"/>
-        </w:rPr>
-        <w:tab/>
-        <w:t xml:space="preserve">The available Day/Night mode options have been corrected for </w:t>
-      </w:r>
-      <w:r>
-        <w:rPr>
-          <w:rFonts w:ascii="Arial" w:hAnsi="Arial" w:cs="Arial"/>
-          <w:color w:val="1F497D"/>
-          <w:sz w:val="18"/>
-          <w:szCs w:val="18"/>
-        </w:rPr>
-        <w:t xml:space="preserve">CAST Pro </w:t>
-      </w:r>
-      <w:r>
-        <w:rPr>
-          <w:rFonts w:ascii="Arial" w:hAnsi="Arial" w:cs="Arial"/>
-          <w:color w:val="1F497D"/>
-          <w:sz w:val="18"/>
-          <w:szCs w:val="18"/>
-        </w:rPr>
-        <w:t>multi detectors</w:t>
-      </w:r>
-      <w:r>
-        <w:rPr>
-          <w:rFonts w:ascii="Arial" w:hAnsi="Arial" w:cs="Arial"/>
-          <w:color w:val="1F497D"/>
-          <w:sz w:val="18"/>
-          <w:szCs w:val="18"/>
-        </w:rPr>
-        <w:t>.</w:t>
+          <w:b/>
+          <w:bCs/>
+          <w:color w:val="1F497D"/>
+          <w:sz w:val="18"/>
+          <w:szCs w:val="18"/>
+        </w:rPr>
+      </w:pPr>
+      <w:r>
+        <w:rPr>
+          <w:rFonts w:ascii="Arial" w:hAnsi="Arial" w:cs="Arial"/>
+          <w:b/>
+          <w:bCs/>
+          <w:color w:val="1F497D"/>
+          <w:sz w:val="18"/>
+          <w:szCs w:val="18"/>
+        </w:rPr>
+        <w:t>Fixes</w:t>
       </w:r>
     </w:p>
     <w:p>
@@ -422,25 +479,51 @@
           <w:szCs w:val="18"/>
         </w:rPr>
         <w:tab/>
-        <w:t xml:space="preserve">The </w:t>
-      </w:r>
-      <w:r>
-        <w:rPr>
-          <w:rFonts w:ascii="Arial" w:hAnsi="Arial" w:cs="Arial"/>
-          <w:color w:val="1F497D"/>
-          <w:sz w:val="18"/>
-          <w:szCs w:val="18"/>
-        </w:rPr>
-        <w:t>app’s Maximise W</w:t>
-      </w:r>
-      <w:r>
-        <w:rPr>
-          <w:rFonts w:ascii="Arial" w:hAnsi="Arial" w:cs="Arial"/>
-          <w:color w:val="1F497D"/>
-          <w:sz w:val="18"/>
-          <w:szCs w:val="18"/>
-        </w:rPr>
-        <w:t>indow button now works correctly.</w:t>
+      </w:r>
+      <w:r>
+        <w:rPr>
+          <w:rFonts w:ascii="Arial" w:hAnsi="Arial" w:cs="Arial"/>
+          <w:color w:val="1F497D"/>
+          <w:sz w:val="18"/>
+          <w:szCs w:val="18"/>
+        </w:rPr>
+        <w:t xml:space="preserve">Zone </w:t>
+      </w:r>
+      <w:r>
+        <w:rPr>
+          <w:rFonts w:ascii="Arial" w:hAnsi="Arial" w:cs="Arial"/>
+          <w:color w:val="1F497D"/>
+          <w:sz w:val="18"/>
+          <w:szCs w:val="18"/>
+        </w:rPr>
+        <w:t xml:space="preserve">names sent to the XFP panel being </w:t>
+      </w:r>
+      <w:r>
+        <w:rPr>
+          <w:rFonts w:ascii="Arial" w:hAnsi="Arial" w:cs="Arial"/>
+          <w:color w:val="1F497D"/>
+          <w:sz w:val="18"/>
+          <w:szCs w:val="18"/>
+        </w:rPr>
+        <w:t>assigned to</w:t>
+      </w:r>
+      <w:r>
+        <w:rPr>
+          <w:rFonts w:ascii="Arial" w:hAnsi="Arial" w:cs="Arial"/>
+          <w:color w:val="1F497D"/>
+          <w:sz w:val="18"/>
+          <w:szCs w:val="18"/>
+        </w:rPr>
+        <w:t xml:space="preserve"> the wrong zone has been corrected</w:t>
+      </w:r>
+      <w:r>
+        <w:rPr>
+          <w:rFonts w:ascii="Arial" w:hAnsi="Arial" w:cs="Arial"/>
+          <w:color w:val="1F497D"/>
+          <w:sz w:val="18"/>
+          <w:szCs w:val="18"/>
+        </w:rPr>
+        <w:t>.</w:t>
       </w:r>
     </w:p>
     <w:p>
@@ -463,128 +546,51 @@
           <w:szCs w:val="18"/>
         </w:rPr>
       </w:pPr>
-    </w:p>
-    <w:p>
-      <w:pPr>
-        <w:tabs>
-          <w:tab w:val="left" w:pos="993"/>
-        </w:tabs>
-        <w:rPr>
-          <w:rFonts w:ascii="Arial" w:hAnsi="Arial" w:cs="Arial"/>
-          <w:color w:val="9CC2E5" w:themeColor="accent1" w:themeTint="99"/>
-          <w:sz w:val="16"/>
-          <w:szCs w:val="16"/>
-        </w:rPr>
-      </w:pPr>
-      <w:r>
-        <w:rPr>
-          <w:rFonts w:ascii="Arial" w:hAnsi="Arial" w:cs="Arial"/>
-          <w:b/>
-          <w:bCs/>
-          <w:color w:val="4472C4" w:themeColor="accent5"/>
-          <w:sz w:val="24"/>
-          <w:szCs w:val="24"/>
-        </w:rPr>
-        <w:t>v8.1.</w:t>
-      </w:r>
-      <w:r>
-        <w:rPr>
-          <w:rFonts w:ascii="Arial" w:hAnsi="Arial" w:cs="Arial"/>
-          <w:b/>
-          <w:bCs/>
-          <w:color w:val="4472C4" w:themeColor="accent5"/>
-          <w:sz w:val="24"/>
-          <w:szCs w:val="24"/>
-        </w:rPr>
-        <w:t>1</w:t>
-      </w:r>
-      <w:r>
-        <w:rPr>
-          <w:rFonts w:ascii="Arial" w:hAnsi="Arial" w:cs="Arial"/>
-          <w:b/>
-          <w:bCs/>
-          <w:color w:val="4472C4" w:themeColor="accent5"/>
-          <w:sz w:val="24"/>
-          <w:szCs w:val="24"/>
-        </w:rPr>
-        <w:t>4</w:t>
-      </w:r>
-      <w:r>
-        <w:rPr>
-          <w:rFonts w:ascii="Arial" w:hAnsi="Arial" w:cs="Arial"/>
-          <w:b/>
-          <w:bCs/>
-          <w:color w:val="4472C4" w:themeColor="accent5"/>
-          <w:sz w:val="24"/>
-          <w:szCs w:val="24"/>
+      <w:r>
+        <w:rPr>
+          <w:rFonts w:ascii="Arial" w:hAnsi="Arial" w:cs="Arial"/>
+          <w:color w:val="1F497D"/>
+          <w:sz w:val="18"/>
+          <w:szCs w:val="18"/>
+        </w:rPr>
+        <w:t>•</w:t>
+      </w:r>
+      <w:r>
+        <w:rPr>
+          <w:rFonts w:ascii="Arial" w:hAnsi="Arial" w:cs="Arial"/>
+          <w:color w:val="1F497D"/>
+          <w:sz w:val="18"/>
+          <w:szCs w:val="18"/>
         </w:rPr>
         <w:tab/>
-      </w:r>
-      <w:r>
-        <w:rPr>
-          <w:rFonts w:ascii="Arial" w:hAnsi="Arial" w:cs="Arial"/>
-          <w:b/>
-          <w:bCs/>
-          <w:color w:val="4472C4" w:themeColor="accent5"/>
-          <w:sz w:val="24"/>
-          <w:szCs w:val="24"/>
-        </w:rPr>
-        <w:t>01</w:t>
-      </w:r>
-      <w:r>
-        <w:rPr>
-          <w:rFonts w:ascii="Arial" w:hAnsi="Arial" w:cs="Arial"/>
-          <w:b/>
-          <w:bCs/>
-          <w:color w:val="4472C4" w:themeColor="accent5"/>
-          <w:sz w:val="24"/>
-          <w:szCs w:val="24"/>
-        </w:rPr>
-        <w:t>/</w:t>
-      </w:r>
-      <w:r>
-        <w:rPr>
-          <w:rFonts w:ascii="Arial" w:hAnsi="Arial" w:cs="Arial"/>
-          <w:b/>
-          <w:bCs/>
-          <w:color w:val="4472C4" w:themeColor="accent5"/>
-          <w:sz w:val="24"/>
-          <w:szCs w:val="24"/>
-        </w:rPr>
-        <w:t>0</w:t>
-      </w:r>
-      <w:r>
-        <w:rPr>
-          <w:rFonts w:ascii="Arial" w:hAnsi="Arial" w:cs="Arial"/>
-          <w:b/>
-          <w:bCs/>
-          <w:color w:val="4472C4" w:themeColor="accent5"/>
-          <w:sz w:val="24"/>
-          <w:szCs w:val="24"/>
-        </w:rPr>
-        <w:t>4</w:t>
-      </w:r>
-      <w:r>
-        <w:rPr>
-          <w:rFonts w:ascii="Arial" w:hAnsi="Arial" w:cs="Arial"/>
-          <w:b/>
-          <w:bCs/>
-          <w:color w:val="4472C4" w:themeColor="accent5"/>
-          <w:sz w:val="24"/>
-          <w:szCs w:val="24"/>
-        </w:rPr>
-        <w:t>/202</w:t>
-      </w:r>
-      <w:r>
-        <w:rPr>
-          <w:rFonts w:ascii="Arial" w:hAnsi="Arial" w:cs="Arial"/>
-          <w:b/>
-          <w:bCs/>
-          <w:color w:val="4472C4" w:themeColor="accent5"/>
-          <w:sz w:val="24"/>
-          <w:szCs w:val="24"/>
-        </w:rPr>
-        <w:t>6</w:t>
+        <w:t xml:space="preserve">The available Day/Night mode options have been corrected for </w:t>
+      </w:r>
+      <w:r>
+        <w:rPr>
+          <w:rFonts w:ascii="Arial" w:hAnsi="Arial" w:cs="Arial"/>
+          <w:color w:val="1F497D"/>
+          <w:sz w:val="18"/>
+          <w:szCs w:val="18"/>
+        </w:rPr>
+        <w:t xml:space="preserve">CAST Pro </w:t>
+      </w:r>
+      <w:r>
+        <w:rPr>
+          <w:rFonts w:ascii="Arial" w:hAnsi="Arial" w:cs="Arial"/>
+          <w:color w:val="1F497D"/>
+          <w:sz w:val="18"/>
+          <w:szCs w:val="18"/>
+        </w:rPr>
+        <w:t>multi detectors</w:t>
+      </w:r>
+      <w:r>
+        <w:rPr>
+          <w:rFonts w:ascii="Arial" w:hAnsi="Arial" w:cs="Arial"/>
+          <w:color w:val="1F497D"/>
+          <w:sz w:val="18"/>
+          <w:szCs w:val="18"/>
+        </w:rPr>
+        <w:t>.</w:t>
       </w:r>
     </w:p>
     <w:p>
@@ -602,23 +608,47 @@
         <w:contextualSpacing/>
         <w:rPr>
           <w:rFonts w:ascii="Arial" w:hAnsi="Arial" w:cs="Arial"/>
-          <w:b/>
-          <w:bCs/>
-          <w:color w:val="1F497D"/>
-          <w:sz w:val="18"/>
-          <w:szCs w:val="18"/>
-        </w:rPr>
-      </w:pPr>
-      <w:r>
-        <w:rPr>
-          <w:rFonts w:ascii="Arial" w:hAnsi="Arial" w:cs="Arial"/>
-          <w:b/>
-          <w:bCs/>
-          <w:color w:val="1F497D"/>
-          <w:sz w:val="18"/>
-          <w:szCs w:val="18"/>
-        </w:rPr>
-        <w:t>Fixes</w:t>
+          <w:color w:val="1F497D"/>
+          <w:sz w:val="18"/>
+          <w:szCs w:val="18"/>
+        </w:rPr>
+      </w:pPr>
+      <w:r>
+        <w:rPr>
+          <w:rFonts w:ascii="Arial" w:hAnsi="Arial" w:cs="Arial"/>
+          <w:color w:val="1F497D"/>
+          <w:sz w:val="18"/>
+          <w:szCs w:val="18"/>
+        </w:rPr>
+        <w:t>•</w:t>
+      </w:r>
+      <w:r>
+        <w:rPr>
+          <w:rFonts w:ascii="Arial" w:hAnsi="Arial" w:cs="Arial"/>
+          <w:color w:val="1F497D"/>
+          <w:sz w:val="18"/>
+          <w:szCs w:val="18"/>
+        </w:rPr>
+        <w:tab/>
+        <w:t xml:space="preserve">The </w:t>
+      </w:r>
+      <w:r>
+        <w:rPr>
+          <w:rFonts w:ascii="Arial" w:hAnsi="Arial" w:cs="Arial"/>
+          <w:color w:val="1F497D"/>
+          <w:sz w:val="18"/>
+          <w:szCs w:val="18"/>
+        </w:rPr>
+        <w:t>app’s Maximise W</w:t>
+      </w:r>
+      <w:r>
+        <w:rPr>
+          <w:rFonts w:ascii="Arial" w:hAnsi="Arial" w:cs="Arial"/>
+          <w:color w:val="1F497D"/>
+          <w:sz w:val="18"/>
+          <w:szCs w:val="18"/>
+        </w:rPr>
+        <w:t>indow button now works correctly.</w:t>
       </w:r>
     </w:p>
     <w:p>
@@ -641,113 +671,128 @@
           <w:szCs w:val="18"/>
         </w:rPr>
       </w:pPr>
-      <w:r>
-        <w:rPr>
-          <w:rFonts w:ascii="Arial" w:hAnsi="Arial" w:cs="Arial"/>
-          <w:color w:val="1F497D"/>
-          <w:sz w:val="18"/>
-          <w:szCs w:val="18"/>
-        </w:rPr>
-        <w:t>•</w:t>
-      </w:r>
-      <w:r>
-        <w:rPr>
-          <w:rFonts w:ascii="Arial" w:hAnsi="Arial" w:cs="Arial"/>
-          <w:color w:val="1F497D"/>
-          <w:sz w:val="18"/>
-          <w:szCs w:val="18"/>
+    </w:p>
+    <w:p>
+      <w:pPr>
+        <w:tabs>
+          <w:tab w:val="left" w:pos="993"/>
+        </w:tabs>
+        <w:rPr>
+          <w:rFonts w:ascii="Arial" w:hAnsi="Arial" w:cs="Arial"/>
+          <w:color w:val="9CC2E5" w:themeColor="accent1" w:themeTint="99"/>
+          <w:sz w:val="16"/>
+          <w:szCs w:val="16"/>
+        </w:rPr>
+      </w:pPr>
+      <w:r>
+        <w:rPr>
+          <w:rFonts w:ascii="Arial" w:hAnsi="Arial" w:cs="Arial"/>
+          <w:b/>
+          <w:bCs/>
+          <w:color w:val="4472C4" w:themeColor="accent5"/>
+          <w:sz w:val="24"/>
+          <w:szCs w:val="24"/>
+        </w:rPr>
+        <w:t>v8.1.</w:t>
+      </w:r>
+      <w:r>
+        <w:rPr>
+          <w:rFonts w:ascii="Arial" w:hAnsi="Arial" w:cs="Arial"/>
+          <w:b/>
+          <w:bCs/>
+          <w:color w:val="4472C4" w:themeColor="accent5"/>
+          <w:sz w:val="24"/>
+          <w:szCs w:val="24"/>
+        </w:rPr>
+        <w:t>1</w:t>
+      </w:r>
+      <w:r>
+        <w:rPr>
+          <w:rFonts w:ascii="Arial" w:hAnsi="Arial" w:cs="Arial"/>
+          <w:b/>
+          <w:bCs/>
+          <w:color w:val="4472C4" w:themeColor="accent5"/>
+          <w:sz w:val="24"/>
+          <w:szCs w:val="24"/>
+        </w:rPr>
+        <w:t>4</w:t>
+      </w:r>
+      <w:r>
+        <w:rPr>
+          <w:rFonts w:ascii="Arial" w:hAnsi="Arial" w:cs="Arial"/>
+          <w:b/>
+          <w:bCs/>
+          <w:color w:val="4472C4" w:themeColor="accent5"/>
+          <w:sz w:val="24"/>
+          <w:szCs w:val="24"/>
         </w:rPr>
         <w:tab/>
       </w:r>
       <w:r>
         <w:rPr>
           <w:rFonts w:ascii="Arial" w:hAnsi="Arial" w:cs="Arial"/>
-          <w:color w:val="1F497D"/>
-          <w:sz w:val="18"/>
-          <w:szCs w:val="18"/>
-        </w:rPr>
-        <w:t xml:space="preserve">The data for </w:t>
-      </w:r>
-      <w:r>
-        <w:rPr>
-          <w:rFonts w:ascii="Arial" w:hAnsi="Arial" w:cs="Arial"/>
-          <w:color w:val="1F497D"/>
-          <w:sz w:val="18"/>
-          <w:szCs w:val="18"/>
-        </w:rPr>
-        <w:t>‘</w:t>
-      </w:r>
-      <w:r>
-        <w:rPr>
-          <w:rFonts w:ascii="Arial" w:hAnsi="Arial" w:cs="Arial"/>
-          <w:color w:val="1F497D"/>
-          <w:sz w:val="18"/>
-          <w:szCs w:val="18"/>
-        </w:rPr>
-        <w:t>e</w:t>
-      </w:r>
-      <w:r>
-        <w:rPr>
-          <w:rFonts w:ascii="Arial" w:hAnsi="Arial" w:cs="Arial"/>
-          <w:color w:val="1F497D"/>
-          <w:sz w:val="18"/>
-          <w:szCs w:val="18"/>
-        </w:rPr>
-        <w:t xml:space="preserve">mpty’ device slots are now set with </w:t>
-      </w:r>
-      <w:r>
-        <w:rPr>
-          <w:rFonts w:ascii="Arial" w:hAnsi="Arial" w:cs="Arial"/>
-          <w:color w:val="1F497D"/>
-          <w:sz w:val="18"/>
-          <w:szCs w:val="18"/>
-        </w:rPr>
-        <w:t>specified</w:t>
-      </w:r>
-      <w:r>
-        <w:rPr>
-          <w:rFonts w:ascii="Arial" w:hAnsi="Arial" w:cs="Arial"/>
-          <w:color w:val="1F497D"/>
-          <w:sz w:val="18"/>
-          <w:szCs w:val="18"/>
-        </w:rPr>
-        <w:t xml:space="preserve"> default values.  This</w:t>
-      </w:r>
-      <w:r>
-        <w:rPr>
-          <w:rFonts w:ascii="Arial" w:hAnsi="Arial" w:cs="Arial"/>
-          <w:color w:val="1F497D"/>
-          <w:sz w:val="18"/>
-          <w:szCs w:val="18"/>
-        </w:rPr>
-        <w:t xml:space="preserve"> is to correct </w:t>
-      </w:r>
-      <w:r>
-        <w:rPr>
-          <w:rFonts w:ascii="Arial" w:hAnsi="Arial" w:cs="Arial"/>
-          <w:color w:val="1F497D"/>
-          <w:sz w:val="18"/>
-          <w:szCs w:val="18"/>
-        </w:rPr>
-        <w:t xml:space="preserve">an issue where Apollo I/O units were </w:t>
-      </w:r>
-      <w:r>
-        <w:rPr>
-          <w:rFonts w:ascii="Arial" w:hAnsi="Arial" w:cs="Arial"/>
-          <w:color w:val="1F497D"/>
-          <w:sz w:val="18"/>
-          <w:szCs w:val="18"/>
-        </w:rPr>
-        <w:t xml:space="preserve">incorrectly </w:t>
-      </w:r>
-      <w:r>
-        <w:rPr>
-          <w:rFonts w:ascii="Arial" w:hAnsi="Arial" w:cs="Arial"/>
-          <w:color w:val="1F497D"/>
-          <w:sz w:val="18"/>
-          <w:szCs w:val="18"/>
-        </w:rPr>
-        <w:t>resetting on Silence.</w:t>
+          <w:b/>
+          <w:bCs/>
+          <w:color w:val="4472C4" w:themeColor="accent5"/>
+          <w:sz w:val="24"/>
+          <w:szCs w:val="24"/>
+        </w:rPr>
+        <w:t>01</w:t>
+      </w:r>
+      <w:r>
+        <w:rPr>
+          <w:rFonts w:ascii="Arial" w:hAnsi="Arial" w:cs="Arial"/>
+          <w:b/>
+          <w:bCs/>
+          <w:color w:val="4472C4" w:themeColor="accent5"/>
+          <w:sz w:val="24"/>
+          <w:szCs w:val="24"/>
+        </w:rPr>
+        <w:t>/</w:t>
+      </w:r>
+      <w:r>
+        <w:rPr>
+          <w:rFonts w:ascii="Arial" w:hAnsi="Arial" w:cs="Arial"/>
+          <w:b/>
+          <w:bCs/>
+          <w:color w:val="4472C4" w:themeColor="accent5"/>
+          <w:sz w:val="24"/>
+          <w:szCs w:val="24"/>
+        </w:rPr>
+        <w:t>0</w:t>
+      </w:r>
+      <w:r>
+        <w:rPr>
+          <w:rFonts w:ascii="Arial" w:hAnsi="Arial" w:cs="Arial"/>
+          <w:b/>
+          <w:bCs/>
+          <w:color w:val="4472C4" w:themeColor="accent5"/>
+          <w:sz w:val="24"/>
+          <w:szCs w:val="24"/>
+        </w:rPr>
+        <w:t>4</w:t>
+      </w:r>
+      <w:r>
+        <w:rPr>
+          <w:rFonts w:ascii="Arial" w:hAnsi="Arial" w:cs="Arial"/>
+          <w:b/>
+          <w:bCs/>
+          <w:color w:val="4472C4" w:themeColor="accent5"/>
+          <w:sz w:val="24"/>
+          <w:szCs w:val="24"/>
+        </w:rPr>
+        <w:t>/202</w:t>
+      </w:r>
+      <w:r>
+        <w:rPr>
+          <w:rFonts w:ascii="Arial" w:hAnsi="Arial" w:cs="Arial"/>
+          <w:b/>
+          <w:bCs/>
+          <w:color w:val="4472C4" w:themeColor="accent5"/>
+          <w:sz w:val="24"/>
+          <w:szCs w:val="24"/>
+        </w:rPr>
+        <w:t>6</w:t>
       </w:r>
     </w:p>
     <w:p>
@@ -765,46 +810,23 @@
         <w:contextualSpacing/>
         <w:rPr>
           <w:rFonts w:ascii="Arial" w:hAnsi="Arial" w:cs="Arial"/>
-          <w:color w:val="1F497D"/>
-          <w:sz w:val="18"/>
-          <w:szCs w:val="18"/>
-        </w:rPr>
-      </w:pPr>
-      <w:r>
-        <w:rPr>
-          <w:rFonts w:ascii="Arial" w:hAnsi="Arial" w:cs="Arial"/>
-          <w:color w:val="1F497D"/>
-          <w:sz w:val="18"/>
-          <w:szCs w:val="18"/>
-        </w:rPr>
-        <w:t>•</w:t>
-      </w:r>
-      <w:r>
-        <w:rPr>
-          <w:rFonts w:ascii="Arial" w:hAnsi="Arial" w:cs="Arial"/>
-          <w:color w:val="1F497D"/>
-          <w:sz w:val="18"/>
-          <w:szCs w:val="18"/>
-        </w:rPr>
-        <w:tab/>
-      </w:r>
-      <w:r>
-        <w:rPr>
-          <w:rFonts w:ascii="Arial" w:hAnsi="Arial" w:cs="Arial"/>
-          <w:color w:val="1F497D"/>
-          <w:sz w:val="18"/>
-          <w:szCs w:val="18"/>
-        </w:rPr>
-        <w:t>The Site Details page was not showing recalibration or day/night times when reading from a config that was created by the old XFP tools</w:t>
-      </w:r>
-      <w:r>
-        <w:rPr>
-          <w:rFonts w:ascii="Arial" w:hAnsi="Arial" w:cs="Arial"/>
-          <w:color w:val="1F497D"/>
-          <w:sz w:val="18"/>
-          <w:szCs w:val="18"/>
-        </w:rPr>
-        <w:t>.</w:t>
+          <w:b/>
+          <w:bCs/>
+          <w:color w:val="1F497D"/>
+          <w:sz w:val="18"/>
+          <w:szCs w:val="18"/>
+        </w:rPr>
+      </w:pPr>
+      <w:r>
+        <w:rPr>
+          <w:rFonts w:ascii="Arial" w:hAnsi="Arial" w:cs="Arial"/>
+          <w:b/>
+          <w:bCs/>
+          <w:color w:val="1F497D"/>
+          <w:sz w:val="18"/>
+          <w:szCs w:val="18"/>
+        </w:rPr>
+        <w:t>Fixes</w:t>
       </w:r>
     </w:p>
     <w:p>
@@ -827,106 +849,113 @@
           <w:szCs w:val="18"/>
         </w:rPr>
       </w:pPr>
-    </w:p>
-    <w:p>
-      <w:pPr>
-        <w:tabs>
-          <w:tab w:val="left" w:pos="993"/>
-        </w:tabs>
-        <w:rPr>
-          <w:rFonts w:ascii="Arial" w:hAnsi="Arial" w:cs="Arial"/>
-          <w:color w:val="9CC2E5" w:themeColor="accent1" w:themeTint="99"/>
-          <w:sz w:val="16"/>
-          <w:szCs w:val="16"/>
-        </w:rPr>
-      </w:pPr>
-      <w:r>
-        <w:rPr>
-          <w:rFonts w:ascii="Arial" w:hAnsi="Arial" w:cs="Arial"/>
-          <w:b/>
-          <w:bCs/>
-          <w:color w:val="4472C4" w:themeColor="accent5"/>
-          <w:sz w:val="24"/>
-          <w:szCs w:val="24"/>
-        </w:rPr>
-        <w:t>v8.1.</w:t>
-      </w:r>
-      <w:r>
-        <w:rPr>
-          <w:rFonts w:ascii="Arial" w:hAnsi="Arial" w:cs="Arial"/>
-          <w:b/>
-          <w:bCs/>
-          <w:color w:val="4472C4" w:themeColor="accent5"/>
-          <w:sz w:val="24"/>
-          <w:szCs w:val="24"/>
-        </w:rPr>
-        <w:t>10</w:t>
-      </w:r>
-      <w:r>
-        <w:rPr>
-          <w:rFonts w:ascii="Arial" w:hAnsi="Arial" w:cs="Arial"/>
-          <w:b/>
-          <w:bCs/>
-          <w:color w:val="4472C4" w:themeColor="accent5"/>
-          <w:sz w:val="24"/>
-          <w:szCs w:val="24"/>
+      <w:r>
+        <w:rPr>
+          <w:rFonts w:ascii="Arial" w:hAnsi="Arial" w:cs="Arial"/>
+          <w:color w:val="1F497D"/>
+          <w:sz w:val="18"/>
+          <w:szCs w:val="18"/>
+        </w:rPr>
+        <w:t>•</w:t>
+      </w:r>
+      <w:r>
+        <w:rPr>
+          <w:rFonts w:ascii="Arial" w:hAnsi="Arial" w:cs="Arial"/>
+          <w:color w:val="1F497D"/>
+          <w:sz w:val="18"/>
+          <w:szCs w:val="18"/>
         </w:rPr>
         <w:tab/>
       </w:r>
       <w:r>
         <w:rPr>
           <w:rFonts w:ascii="Arial" w:hAnsi="Arial" w:cs="Arial"/>
-          <w:b/>
-          <w:bCs/>
-          <w:color w:val="4472C4" w:themeColor="accent5"/>
-          <w:sz w:val="24"/>
-          <w:szCs w:val="24"/>
-        </w:rPr>
-        <w:t>16</w:t>
-      </w:r>
-      <w:r>
-        <w:rPr>
-          <w:rFonts w:ascii="Arial" w:hAnsi="Arial" w:cs="Arial"/>
-          <w:b/>
-          <w:bCs/>
-          <w:color w:val="4472C4" w:themeColor="accent5"/>
-          <w:sz w:val="24"/>
-          <w:szCs w:val="24"/>
-        </w:rPr>
-        <w:t>/</w:t>
-      </w:r>
-      <w:r>
-        <w:rPr>
-          <w:rFonts w:ascii="Arial" w:hAnsi="Arial" w:cs="Arial"/>
-          <w:b/>
-          <w:bCs/>
-          <w:color w:val="4472C4" w:themeColor="accent5"/>
-          <w:sz w:val="24"/>
-          <w:szCs w:val="24"/>
-        </w:rPr>
-        <w:t>02</w:t>
-      </w:r>
-      <w:r>
-        <w:rPr>
-          <w:rFonts w:ascii="Arial" w:hAnsi="Arial" w:cs="Arial"/>
-          <w:b/>
-          <w:bCs/>
-          <w:color w:val="4472C4" w:themeColor="accent5"/>
-          <w:sz w:val="24"/>
-          <w:szCs w:val="24"/>
-        </w:rPr>
-        <w:t>/202</w:t>
-      </w:r>
-      <w:r>
-        <w:rPr>
-          <w:rFonts w:ascii="Arial" w:hAnsi="Arial" w:cs="Arial"/>
-          <w:b/>
-          <w:bCs/>
-          <w:color w:val="4472C4" w:themeColor="accent5"/>
-          <w:sz w:val="24"/>
-          <w:szCs w:val="24"/>
-        </w:rPr>
-        <w:t>6</w:t>
+          <w:color w:val="1F497D"/>
+          <w:sz w:val="18"/>
+          <w:szCs w:val="18"/>
+        </w:rPr>
+        <w:t xml:space="preserve">The data for </w:t>
+      </w:r>
+      <w:r>
+        <w:rPr>
+          <w:rFonts w:ascii="Arial" w:hAnsi="Arial" w:cs="Arial"/>
+          <w:color w:val="1F497D"/>
+          <w:sz w:val="18"/>
+          <w:szCs w:val="18"/>
+        </w:rPr>
+        <w:t>‘</w:t>
+      </w:r>
+      <w:r>
+        <w:rPr>
+          <w:rFonts w:ascii="Arial" w:hAnsi="Arial" w:cs="Arial"/>
+          <w:color w:val="1F497D"/>
+          <w:sz w:val="18"/>
+          <w:szCs w:val="18"/>
+        </w:rPr>
+        <w:t>e</w:t>
+      </w:r>
+      <w:r>
+        <w:rPr>
+          <w:rFonts w:ascii="Arial" w:hAnsi="Arial" w:cs="Arial"/>
+          <w:color w:val="1F497D"/>
+          <w:sz w:val="18"/>
+          <w:szCs w:val="18"/>
+        </w:rPr>
+        <w:t xml:space="preserve">mpty’ device slots are now set with </w:t>
+      </w:r>
+      <w:r>
+        <w:rPr>
+          <w:rFonts w:ascii="Arial" w:hAnsi="Arial" w:cs="Arial"/>
+          <w:color w:val="1F497D"/>
+          <w:sz w:val="18"/>
+          <w:szCs w:val="18"/>
+        </w:rPr>
+        <w:t>specified</w:t>
+      </w:r>
+      <w:r>
+        <w:rPr>
+          <w:rFonts w:ascii="Arial" w:hAnsi="Arial" w:cs="Arial"/>
+          <w:color w:val="1F497D"/>
+          <w:sz w:val="18"/>
+          <w:szCs w:val="18"/>
+        </w:rPr>
+        <w:t xml:space="preserve"> default values.  This</w:t>
+      </w:r>
+      <w:r>
+        <w:rPr>
+          <w:rFonts w:ascii="Arial" w:hAnsi="Arial" w:cs="Arial"/>
+          <w:color w:val="1F497D"/>
+          <w:sz w:val="18"/>
+          <w:szCs w:val="18"/>
+        </w:rPr>
+        <w:t xml:space="preserve"> is to correct </w:t>
+      </w:r>
+      <w:r>
+        <w:rPr>
+          <w:rFonts w:ascii="Arial" w:hAnsi="Arial" w:cs="Arial"/>
+          <w:color w:val="1F497D"/>
+          <w:sz w:val="18"/>
+          <w:szCs w:val="18"/>
+        </w:rPr>
+        <w:t xml:space="preserve">an issue where Apollo I/O units were </w:t>
+      </w:r>
+      <w:r>
+        <w:rPr>
+          <w:rFonts w:ascii="Arial" w:hAnsi="Arial" w:cs="Arial"/>
+          <w:color w:val="1F497D"/>
+          <w:sz w:val="18"/>
+          <w:szCs w:val="18"/>
+        </w:rPr>
+        <w:t xml:space="preserve">incorrectly </w:t>
+      </w:r>
+      <w:r>
+        <w:rPr>
+          <w:rFonts w:ascii="Arial" w:hAnsi="Arial" w:cs="Arial"/>
+          <w:color w:val="1F497D"/>
+          <w:sz w:val="18"/>
+          <w:szCs w:val="18"/>
+        </w:rPr>
+        <w:t>resetting on Silence.</w:t>
       </w:r>
     </w:p>
     <w:p>
@@ -944,23 +973,46 @@
         <w:contextualSpacing/>
         <w:rPr>
           <w:rFonts w:ascii="Arial" w:hAnsi="Arial" w:cs="Arial"/>
-          <w:b/>
-          <w:bCs/>
-          <w:color w:val="1F497D"/>
-          <w:sz w:val="18"/>
-          <w:szCs w:val="18"/>
-        </w:rPr>
-      </w:pPr>
-      <w:r>
-        <w:rPr>
-          <w:rFonts w:ascii="Arial" w:hAnsi="Arial" w:cs="Arial"/>
-          <w:b/>
-          <w:bCs/>
-          <w:color w:val="1F497D"/>
-          <w:sz w:val="18"/>
-          <w:szCs w:val="18"/>
-        </w:rPr>
-        <w:t>New features</w:t>
+          <w:color w:val="1F497D"/>
+          <w:sz w:val="18"/>
+          <w:szCs w:val="18"/>
+        </w:rPr>
+      </w:pPr>
+      <w:r>
+        <w:rPr>
+          <w:rFonts w:ascii="Arial" w:hAnsi="Arial" w:cs="Arial"/>
+          <w:color w:val="1F497D"/>
+          <w:sz w:val="18"/>
+          <w:szCs w:val="18"/>
+        </w:rPr>
+        <w:t>•</w:t>
+      </w:r>
+      <w:r>
+        <w:rPr>
+          <w:rFonts w:ascii="Arial" w:hAnsi="Arial" w:cs="Arial"/>
+          <w:color w:val="1F497D"/>
+          <w:sz w:val="18"/>
+          <w:szCs w:val="18"/>
+        </w:rPr>
+        <w:tab/>
+      </w:r>
+      <w:r>
+        <w:rPr>
+          <w:rFonts w:ascii="Arial" w:hAnsi="Arial" w:cs="Arial"/>
+          <w:color w:val="1F497D"/>
+          <w:sz w:val="18"/>
+          <w:szCs w:val="18"/>
+        </w:rPr>
+        <w:t>The Site Details page was not showing recalibration or day/night times when reading from a config that was created by the old XFP tools</w:t>
+      </w:r>
+      <w:r>
+        <w:rPr>
+          <w:rFonts w:ascii="Arial" w:hAnsi="Arial" w:cs="Arial"/>
+          <w:color w:val="1F497D"/>
+          <w:sz w:val="18"/>
+          <w:szCs w:val="18"/>
+        </w:rPr>
+        <w:t>.</w:t>
       </w:r>
     </w:p>
     <w:p>
@@ -983,41 +1035,106 @@
           <w:szCs w:val="18"/>
         </w:rPr>
       </w:pPr>
-      <w:r>
-        <w:rPr>
-          <w:rFonts w:ascii="Arial" w:hAnsi="Arial" w:cs="Arial"/>
-          <w:color w:val="1F497D"/>
-          <w:sz w:val="18"/>
-          <w:szCs w:val="18"/>
-        </w:rPr>
-        <w:t>•</w:t>
-      </w:r>
-      <w:r>
-        <w:rPr>
-          <w:rFonts w:ascii="Arial" w:hAnsi="Arial" w:cs="Arial"/>
-          <w:color w:val="1F497D"/>
-          <w:sz w:val="18"/>
-          <w:szCs w:val="18"/>
+    </w:p>
+    <w:p>
+      <w:pPr>
+        <w:tabs>
+          <w:tab w:val="left" w:pos="993"/>
+        </w:tabs>
+        <w:rPr>
+          <w:rFonts w:ascii="Arial" w:hAnsi="Arial" w:cs="Arial"/>
+          <w:color w:val="9CC2E5" w:themeColor="accent1" w:themeTint="99"/>
+          <w:sz w:val="16"/>
+          <w:szCs w:val="16"/>
+        </w:rPr>
+      </w:pPr>
+      <w:r>
+        <w:rPr>
+          <w:rFonts w:ascii="Arial" w:hAnsi="Arial" w:cs="Arial"/>
+          <w:b/>
+          <w:bCs/>
+          <w:color w:val="4472C4" w:themeColor="accent5"/>
+          <w:sz w:val="24"/>
+          <w:szCs w:val="24"/>
+        </w:rPr>
+        <w:t>v8.1.</w:t>
+      </w:r>
+      <w:r>
+        <w:rPr>
+          <w:rFonts w:ascii="Arial" w:hAnsi="Arial" w:cs="Arial"/>
+          <w:b/>
+          <w:bCs/>
+          <w:color w:val="4472C4" w:themeColor="accent5"/>
+          <w:sz w:val="24"/>
+          <w:szCs w:val="24"/>
+        </w:rPr>
+        <w:t>10</w:t>
+      </w:r>
+      <w:r>
+        <w:rPr>
+          <w:rFonts w:ascii="Arial" w:hAnsi="Arial" w:cs="Arial"/>
+          <w:b/>
+          <w:bCs/>
+          <w:color w:val="4472C4" w:themeColor="accent5"/>
+          <w:sz w:val="24"/>
+          <w:szCs w:val="24"/>
         </w:rPr>
         <w:tab/>
       </w:r>
       <w:r>
         <w:rPr>
           <w:rFonts w:ascii="Arial" w:hAnsi="Arial" w:cs="Arial"/>
-          <w:color w:val="1F497D"/>
-          <w:sz w:val="18"/>
-          <w:szCs w:val="18"/>
-        </w:rPr>
-        <w:t>Support for Spanish language has</w:t>
-      </w:r>
-      <w:r>
-        <w:rPr>
-          <w:rFonts w:ascii="Arial" w:hAnsi="Arial" w:cs="Arial"/>
-          <w:color w:val="1F497D"/>
-          <w:sz w:val="18"/>
-          <w:szCs w:val="18"/>
-        </w:rPr>
-        <w:t xml:space="preserve"> been added.</w:t>
+          <w:b/>
+          <w:bCs/>
+          <w:color w:val="4472C4" w:themeColor="accent5"/>
+          <w:sz w:val="24"/>
+          <w:szCs w:val="24"/>
+        </w:rPr>
+        <w:t>16</w:t>
+      </w:r>
+      <w:r>
+        <w:rPr>
+          <w:rFonts w:ascii="Arial" w:hAnsi="Arial" w:cs="Arial"/>
+          <w:b/>
+          <w:bCs/>
+          <w:color w:val="4472C4" w:themeColor="accent5"/>
+          <w:sz w:val="24"/>
+          <w:szCs w:val="24"/>
+        </w:rPr>
+        <w:t>/</w:t>
+      </w:r>
+      <w:r>
+        <w:rPr>
+          <w:rFonts w:ascii="Arial" w:hAnsi="Arial" w:cs="Arial"/>
+          <w:b/>
+          <w:bCs/>
+          <w:color w:val="4472C4" w:themeColor="accent5"/>
+          <w:sz w:val="24"/>
+          <w:szCs w:val="24"/>
+        </w:rPr>
+        <w:t>02</w:t>
+      </w:r>
+      <w:r>
+        <w:rPr>
+          <w:rFonts w:ascii="Arial" w:hAnsi="Arial" w:cs="Arial"/>
+          <w:b/>
+          <w:bCs/>
+          <w:color w:val="4472C4" w:themeColor="accent5"/>
+          <w:sz w:val="24"/>
+          <w:szCs w:val="24"/>
+        </w:rPr>
+        <w:t>/202</w:t>
+      </w:r>
+      <w:r>
+        <w:rPr>
+          <w:rFonts w:ascii="Arial" w:hAnsi="Arial" w:cs="Arial"/>
+          <w:b/>
+          <w:bCs/>
+          <w:color w:val="4472C4" w:themeColor="accent5"/>
+          <w:sz w:val="24"/>
+          <w:szCs w:val="24"/>
+        </w:rPr>
+        <w:t>6</w:t>
       </w:r>
     </w:p>
     <w:p>
@@ -1035,111 +1152,23 @@
         <w:contextualSpacing/>
         <w:rPr>
           <w:rFonts w:ascii="Arial" w:hAnsi="Arial" w:cs="Arial"/>
-          <w:color w:val="1F497D"/>
-          <w:sz w:val="18"/>
-          <w:szCs w:val="18"/>
-        </w:rPr>
-      </w:pPr>
-    </w:p>
-    <w:p>
-      <w:pPr>
-        <w:tabs>
-          <w:tab w:val="left" w:pos="993"/>
-        </w:tabs>
-        <w:rPr>
-          <w:rFonts w:ascii="Arial" w:hAnsi="Arial" w:cs="Arial"/>
-          <w:color w:val="9CC2E5" w:themeColor="accent1" w:themeTint="99"/>
-          <w:sz w:val="16"/>
-          <w:szCs w:val="16"/>
-        </w:rPr>
-      </w:pPr>
-      <w:r>
-        <w:rPr>
-          <w:rFonts w:ascii="Arial" w:hAnsi="Arial" w:cs="Arial"/>
-          <w:b/>
-          <w:bCs/>
-          <w:color w:val="4472C4" w:themeColor="accent5"/>
-          <w:sz w:val="24"/>
-          <w:szCs w:val="24"/>
-        </w:rPr>
-        <w:t>v8.1.</w:t>
-      </w:r>
-      <w:r>
-        <w:rPr>
-          <w:rFonts w:ascii="Arial" w:hAnsi="Arial" w:cs="Arial"/>
-          <w:b/>
-          <w:bCs/>
-          <w:color w:val="4472C4" w:themeColor="accent5"/>
-          <w:sz w:val="24"/>
-          <w:szCs w:val="24"/>
-        </w:rPr>
-        <w:t>9</w:t>
-      </w:r>
-      <w:r>
-        <w:rPr>
-          <w:rFonts w:ascii="Arial" w:hAnsi="Arial" w:cs="Arial"/>
-          <w:b/>
-          <w:bCs/>
-          <w:color w:val="4472C4" w:themeColor="accent5"/>
-          <w:sz w:val="24"/>
-          <w:szCs w:val="24"/>
-        </w:rPr>
-        <w:tab/>
-      </w:r>
-      <w:r>
-        <w:rPr>
-          <w:rFonts w:ascii="Arial" w:hAnsi="Arial" w:cs="Arial"/>
-          <w:b/>
-          <w:bCs/>
-          <w:color w:val="4472C4" w:themeColor="accent5"/>
-          <w:sz w:val="24"/>
-          <w:szCs w:val="24"/>
-        </w:rPr>
-        <w:t>2</w:t>
-      </w:r>
-      <w:r>
-        <w:rPr>
-          <w:rFonts w:ascii="Arial" w:hAnsi="Arial" w:cs="Arial"/>
-          <w:b/>
-          <w:bCs/>
-          <w:color w:val="4472C4" w:themeColor="accent5"/>
-          <w:sz w:val="24"/>
-          <w:szCs w:val="24"/>
-        </w:rPr>
-        <w:t>4</w:t>
-      </w:r>
-      <w:r>
-        <w:rPr>
-          <w:rFonts w:ascii="Arial" w:hAnsi="Arial" w:cs="Arial"/>
-          <w:b/>
-          <w:bCs/>
-          <w:color w:val="4472C4" w:themeColor="accent5"/>
-          <w:sz w:val="24"/>
-          <w:szCs w:val="24"/>
-        </w:rPr>
-        <w:t>/</w:t>
-      </w:r>
-      <w:r>
-        <w:rPr>
-          <w:rFonts w:ascii="Arial" w:hAnsi="Arial" w:cs="Arial"/>
-          <w:b/>
-          <w:bCs/>
-          <w:color w:val="4472C4" w:themeColor="accent5"/>
-          <w:sz w:val="24"/>
-          <w:szCs w:val="24"/>
-        </w:rPr>
-        <w:t>12</w:t>
-      </w:r>
-      <w:r>
-        <w:rPr>
-          <w:rFonts w:ascii="Arial" w:hAnsi="Arial" w:cs="Arial"/>
-          <w:b/>
-          <w:bCs/>
-          <w:color w:val="4472C4" w:themeColor="accent5"/>
-          <w:sz w:val="24"/>
-          <w:szCs w:val="24"/>
-        </w:rPr>
-        <w:t>/2025</w:t>
+          <w:b/>
+          <w:bCs/>
+          <w:color w:val="1F497D"/>
+          <w:sz w:val="18"/>
+          <w:szCs w:val="18"/>
+        </w:rPr>
+      </w:pPr>
+      <w:r>
+        <w:rPr>
+          <w:rFonts w:ascii="Arial" w:hAnsi="Arial" w:cs="Arial"/>
+          <w:b/>
+          <w:bCs/>
+          <w:color w:val="1F497D"/>
+          <w:sz w:val="18"/>
+          <w:szCs w:val="18"/>
+        </w:rPr>
+        <w:t>New features</w:t>
       </w:r>
     </w:p>
     <w:p>
@@ -1157,23 +1186,46 @@
         <w:contextualSpacing/>
         <w:rPr>
           <w:rFonts w:ascii="Arial" w:hAnsi="Arial" w:cs="Arial"/>
-          <w:b/>
-          <w:bCs/>
-          <w:color w:val="1F497D"/>
-          <w:sz w:val="18"/>
-          <w:szCs w:val="18"/>
-        </w:rPr>
-      </w:pPr>
-      <w:r>
-        <w:rPr>
-          <w:rFonts w:ascii="Arial" w:hAnsi="Arial" w:cs="Arial"/>
-          <w:b/>
-          <w:bCs/>
-          <w:color w:val="1F497D"/>
-          <w:sz w:val="18"/>
-          <w:szCs w:val="18"/>
-        </w:rPr>
-        <w:t>New features</w:t>
+          <w:color w:val="1F497D"/>
+          <w:sz w:val="18"/>
+          <w:szCs w:val="18"/>
+        </w:rPr>
+      </w:pPr>
+      <w:r>
+        <w:rPr>
+          <w:rFonts w:ascii="Arial" w:hAnsi="Arial" w:cs="Arial"/>
+          <w:color w:val="1F497D"/>
+          <w:sz w:val="18"/>
+          <w:szCs w:val="18"/>
+        </w:rPr>
+        <w:t>•</w:t>
+      </w:r>
+      <w:r>
+        <w:rPr>
+          <w:rFonts w:ascii="Arial" w:hAnsi="Arial" w:cs="Arial"/>
+          <w:color w:val="1F497D"/>
+          <w:sz w:val="18"/>
+          <w:szCs w:val="18"/>
+        </w:rPr>
+        <w:tab/>
+      </w:r>
+      <w:r>
+        <w:rPr>
+          <w:rFonts w:ascii="Arial" w:hAnsi="Arial" w:cs="Arial"/>
+          <w:color w:val="1F497D"/>
+          <w:sz w:val="18"/>
+          <w:szCs w:val="18"/>
+        </w:rPr>
+        <w:t>Support for Spanish language has</w:t>
+      </w:r>
+      <w:r>
+        <w:rPr>
+          <w:rFonts w:ascii="Arial" w:hAnsi="Arial" w:cs="Arial"/>
+          <w:color w:val="1F497D"/>
+          <w:sz w:val="18"/>
+          <w:szCs w:val="18"/>
+        </w:rPr>
+        <w:t xml:space="preserve"> been added.</w:t>
       </w:r>
     </w:p>
     <w:p>
@@ -1196,24 +1248,106 @@
           <w:szCs w:val="18"/>
         </w:rPr>
       </w:pPr>
-      <w:r>
-        <w:rPr>
-          <w:rFonts w:ascii="Arial" w:hAnsi="Arial" w:cs="Arial"/>
-          <w:color w:val="1F497D"/>
-          <w:sz w:val="18"/>
-          <w:szCs w:val="18"/>
-        </w:rPr>
-        <w:t>•</w:t>
-      </w:r>
-      <w:r>
-        <w:rPr>
-          <w:rFonts w:ascii="Arial" w:hAnsi="Arial" w:cs="Arial"/>
-          <w:color w:val="1F497D"/>
-          <w:sz w:val="18"/>
-          <w:szCs w:val="18"/>
+    </w:p>
+    <w:p>
+      <w:pPr>
+        <w:tabs>
+          <w:tab w:val="left" w:pos="993"/>
+        </w:tabs>
+        <w:rPr>
+          <w:rFonts w:ascii="Arial" w:hAnsi="Arial" w:cs="Arial"/>
+          <w:color w:val="9CC2E5" w:themeColor="accent1" w:themeTint="99"/>
+          <w:sz w:val="16"/>
+          <w:szCs w:val="16"/>
+        </w:rPr>
+      </w:pPr>
+      <w:r>
+        <w:rPr>
+          <w:rFonts w:ascii="Arial" w:hAnsi="Arial" w:cs="Arial"/>
+          <w:b/>
+          <w:bCs/>
+          <w:color w:val="4472C4" w:themeColor="accent5"/>
+          <w:sz w:val="24"/>
+          <w:szCs w:val="24"/>
+        </w:rPr>
+        <w:t>v8.1.</w:t>
+      </w:r>
+      <w:r>
+        <w:rPr>
+          <w:rFonts w:ascii="Arial" w:hAnsi="Arial" w:cs="Arial"/>
+          <w:b/>
+          <w:bCs/>
+          <w:color w:val="4472C4" w:themeColor="accent5"/>
+          <w:sz w:val="24"/>
+          <w:szCs w:val="24"/>
+        </w:rPr>
+        <w:t>9</w:t>
+      </w:r>
+      <w:r>
+        <w:rPr>
+          <w:rFonts w:ascii="Arial" w:hAnsi="Arial" w:cs="Arial"/>
+          <w:b/>
+          <w:bCs/>
+          <w:color w:val="4472C4" w:themeColor="accent5"/>
+          <w:sz w:val="24"/>
+          <w:szCs w:val="24"/>
         </w:rPr>
         <w:tab/>
-        <w:t>The new CAST Pro devices have been added.</w:t>
+      </w:r>
+      <w:r>
+        <w:rPr>
+          <w:rFonts w:ascii="Arial" w:hAnsi="Arial" w:cs="Arial"/>
+          <w:b/>
+          <w:bCs/>
+          <w:color w:val="4472C4" w:themeColor="accent5"/>
+          <w:sz w:val="24"/>
+          <w:szCs w:val="24"/>
+        </w:rPr>
+        <w:t>2</w:t>
+      </w:r>
+      <w:r>
+        <w:rPr>
+          <w:rFonts w:ascii="Arial" w:hAnsi="Arial" w:cs="Arial"/>
+          <w:b/>
+          <w:bCs/>
+          <w:color w:val="4472C4" w:themeColor="accent5"/>
+          <w:sz w:val="24"/>
+          <w:szCs w:val="24"/>
+        </w:rPr>
+        <w:t>4</w:t>
+      </w:r>
+      <w:r>
+        <w:rPr>
+          <w:rFonts w:ascii="Arial" w:hAnsi="Arial" w:cs="Arial"/>
+          <w:b/>
+          <w:bCs/>
+          <w:color w:val="4472C4" w:themeColor="accent5"/>
+          <w:sz w:val="24"/>
+          <w:szCs w:val="24"/>
+        </w:rPr>
+        <w:t>/</w:t>
+      </w:r>
+      <w:r>
+        <w:rPr>
+          <w:rFonts w:ascii="Arial" w:hAnsi="Arial" w:cs="Arial"/>
+          <w:b/>
+          <w:bCs/>
+          <w:color w:val="4472C4" w:themeColor="accent5"/>
+          <w:sz w:val="24"/>
+          <w:szCs w:val="24"/>
+        </w:rPr>
+        <w:t>12</w:t>
+      </w:r>
+      <w:r>
+        <w:rPr>
+          <w:rFonts w:ascii="Arial" w:hAnsi="Arial" w:cs="Arial"/>
+          <w:b/>
+          <w:bCs/>
+          <w:color w:val="4472C4" w:themeColor="accent5"/>
+          <w:sz w:val="24"/>
+          <w:szCs w:val="24"/>
+        </w:rPr>
+        <w:t>/2025</w:t>
       </w:r>
     </w:p>
     <w:p>
@@ -1231,29 +1365,23 @@
         <w:contextualSpacing/>
         <w:rPr>
           <w:rFonts w:ascii="Arial" w:hAnsi="Arial" w:cs="Arial"/>
-          <w:color w:val="1F497D"/>
-          <w:sz w:val="18"/>
-          <w:szCs w:val="18"/>
-        </w:rPr>
-      </w:pPr>
-      <w:r>
-        <w:rPr>
-          <w:rFonts w:ascii="Arial" w:hAnsi="Arial" w:cs="Arial"/>
-          <w:color w:val="1F497D"/>
-          <w:sz w:val="18"/>
-          <w:szCs w:val="18"/>
-        </w:rPr>
-        <w:t>•</w:t>
-      </w:r>
-      <w:r>
-        <w:rPr>
-          <w:rFonts w:ascii="Arial" w:hAnsi="Arial" w:cs="Arial"/>
-          <w:color w:val="1F497D"/>
-          <w:sz w:val="18"/>
-          <w:szCs w:val="18"/>
-        </w:rPr>
-        <w:tab/>
-        <w:t>The facility to print the settings has been added.</w:t>
+          <w:b/>
+          <w:bCs/>
+          <w:color w:val="1F497D"/>
+          <w:sz w:val="18"/>
+          <w:szCs w:val="18"/>
+        </w:rPr>
+      </w:pPr>
+      <w:r>
+        <w:rPr>
+          <w:rFonts w:ascii="Arial" w:hAnsi="Arial" w:cs="Arial"/>
+          <w:b/>
+          <w:bCs/>
+          <w:color w:val="1F497D"/>
+          <w:sz w:val="18"/>
+          <w:szCs w:val="18"/>
+        </w:rPr>
+        <w:t>New features</w:t>
       </w:r>
     </w:p>
     <w:p>
@@ -1293,7 +1421,7 @@
           <w:szCs w:val="18"/>
         </w:rPr>
         <w:tab/>
-        <w:t>Device day &amp; night modes are now always set to their default values when a device type is changed.</w:t>
+        <w:t>The new CAST Pro devices have been added.</w:t>
       </w:r>
     </w:p>
     <w:p>
@@ -1333,7 +1461,7 @@
           <w:szCs w:val="18"/>
         </w:rPr>
         <w:tab/>
-        <w:t>A newly-added second loop is now correctly filled with empty device slots and the device pages are updated correspondingly.</w:t>
+        <w:t>The facility to print the settings has been added.</w:t>
       </w:r>
     </w:p>
     <w:p>
@@ -1373,16 +1501,7 @@
           <w:szCs w:val="18"/>
         </w:rPr>
         <w:tab/>
-        <w:t>Envision support for Apollo systems</w:t>
-      </w:r>
-      <w:r>
-        <w:rPr>
-          <w:rFonts w:ascii="Arial" w:hAnsi="Arial" w:cs="Arial"/>
-          <w:color w:val="1F497D"/>
-          <w:sz w:val="18"/>
-          <w:szCs w:val="18"/>
-        </w:rPr>
-        <w:t>:</w:t>
+        <w:t>Device day &amp; night modes are now always set to their default values when a device type is changed.</w:t>
       </w:r>
     </w:p>
     <w:p>
@@ -1412,73 +1531,17 @@
           <w:sz w:val="18"/>
           <w:szCs w:val="18"/>
         </w:rPr>
+        <w:t>•</w:t>
+      </w:r>
+      <w:r>
+        <w:rPr>
+          <w:rFonts w:ascii="Arial" w:hAnsi="Arial" w:cs="Arial"/>
+          <w:color w:val="1F497D"/>
+          <w:sz w:val="18"/>
+          <w:szCs w:val="18"/>
+        </w:rPr>
         <w:tab/>
-      </w:r>
-      <w:r>
-        <w:rPr>
-          <w:rFonts w:ascii="Arial" w:hAnsi="Arial" w:cs="Arial"/>
-          <w:i/>
-          <w:iCs/>
-          <w:color w:val="1F497D"/>
-          <w:sz w:val="18"/>
-          <w:szCs w:val="18"/>
-        </w:rPr>
-        <w:t>For this, device names and zone descriptions are prefixed with type codes and zone numbers respectively.  If not already prefixed, before uploading the user is asked whether the pane</w:t>
-      </w:r>
-      <w:r>
-        <w:rPr>
-          <w:rFonts w:ascii="Arial" w:hAnsi="Arial" w:cs="Arial"/>
-          <w:i/>
-          <w:iCs/>
-          <w:color w:val="1F497D"/>
-          <w:sz w:val="18"/>
-          <w:szCs w:val="18"/>
-        </w:rPr>
-        <w:t>l</w:t>
-      </w:r>
-      <w:r>
-        <w:rPr>
-          <w:rFonts w:ascii="Arial" w:hAnsi="Arial" w:cs="Arial"/>
-          <w:i/>
-          <w:iCs/>
-          <w:color w:val="1F497D"/>
-          <w:sz w:val="18"/>
-          <w:szCs w:val="18"/>
-        </w:rPr>
-        <w:t xml:space="preserve"> is for Envision and, if </w:t>
-      </w:r>
-      <w:proofErr w:type="gramStart"/>
-      <w:r>
-        <w:rPr>
-          <w:rFonts w:ascii="Arial" w:hAnsi="Arial" w:cs="Arial"/>
-          <w:i/>
-          <w:iCs/>
-          <w:color w:val="1F497D"/>
-          <w:sz w:val="18"/>
-          <w:szCs w:val="18"/>
-        </w:rPr>
-        <w:t>Yes</w:t>
-      </w:r>
-      <w:proofErr w:type="gramEnd"/>
-      <w:r>
-        <w:rPr>
-          <w:rFonts w:ascii="Arial" w:hAnsi="Arial" w:cs="Arial"/>
-          <w:i/>
-          <w:iCs/>
-          <w:color w:val="1F497D"/>
-          <w:sz w:val="18"/>
-          <w:szCs w:val="18"/>
-        </w:rPr>
-        <w:t>, the prefixes are added.</w:t>
-      </w:r>
-      <w:r>
-        <w:rPr>
-          <w:rFonts w:ascii="Arial" w:hAnsi="Arial" w:cs="Arial"/>
-          <w:color w:val="1F497D"/>
-          <w:sz w:val="18"/>
-          <w:szCs w:val="18"/>
-        </w:rPr>
-        <w:br/>
+        <w:t>A newly-added second loop is now correctly filled with empty device slots and the device pages are updated correspondingly.</w:t>
       </w:r>
     </w:p>
     <w:p>
@@ -1496,23 +1559,38 @@
         <w:contextualSpacing/>
         <w:rPr>
           <w:rFonts w:ascii="Arial" w:hAnsi="Arial" w:cs="Arial"/>
-          <w:b/>
-          <w:bCs/>
-          <w:color w:val="1F497D"/>
-          <w:sz w:val="18"/>
-          <w:szCs w:val="18"/>
-        </w:rPr>
-      </w:pPr>
-      <w:r>
-        <w:rPr>
-          <w:rFonts w:ascii="Arial" w:hAnsi="Arial" w:cs="Arial"/>
-          <w:b/>
-          <w:bCs/>
-          <w:color w:val="1F497D"/>
-          <w:sz w:val="18"/>
-          <w:szCs w:val="18"/>
-        </w:rPr>
-        <w:t>Fixes</w:t>
+          <w:color w:val="1F497D"/>
+          <w:sz w:val="18"/>
+          <w:szCs w:val="18"/>
+        </w:rPr>
+      </w:pPr>
+      <w:r>
+        <w:rPr>
+          <w:rFonts w:ascii="Arial" w:hAnsi="Arial" w:cs="Arial"/>
+          <w:color w:val="1F497D"/>
+          <w:sz w:val="18"/>
+          <w:szCs w:val="18"/>
+        </w:rPr>
+        <w:t>•</w:t>
+      </w:r>
+      <w:r>
+        <w:rPr>
+          <w:rFonts w:ascii="Arial" w:hAnsi="Arial" w:cs="Arial"/>
+          <w:color w:val="1F497D"/>
+          <w:sz w:val="18"/>
+          <w:szCs w:val="18"/>
+        </w:rPr>
+        <w:tab/>
+        <w:t>Envision support for Apollo systems</w:t>
+      </w:r>
+      <w:r>
+        <w:rPr>
+          <w:rFonts w:ascii="Arial" w:hAnsi="Arial" w:cs="Arial"/>
+          <w:color w:val="1F497D"/>
+          <w:sz w:val="18"/>
+          <w:szCs w:val="18"/>
+        </w:rPr>
+        <w:t>:</w:t>
       </w:r>
     </w:p>
     <w:p>
@@ -1542,162 +1620,49 @@
           <w:sz w:val="18"/>
           <w:szCs w:val="18"/>
         </w:rPr>
-        <w:t>•</w:t>
-      </w:r>
-      <w:r>
-        <w:rPr>
-          <w:rFonts w:ascii="Arial" w:hAnsi="Arial" w:cs="Arial"/>
-          <w:color w:val="1F497D"/>
-          <w:sz w:val="18"/>
-          <w:szCs w:val="18"/>
-        </w:rPr>
         <w:tab/>
       </w:r>
       <w:r>
         <w:rPr>
           <w:rFonts w:ascii="Arial" w:hAnsi="Arial" w:cs="Arial"/>
-          <w:color w:val="1F497D"/>
-          <w:sz w:val="18"/>
-          <w:szCs w:val="18"/>
-        </w:rPr>
-        <w:t>Two faults that would cause the app to shut down have been corrected: s</w:t>
-      </w:r>
-      <w:r>
-        <w:rPr>
-          <w:rFonts w:ascii="Arial" w:hAnsi="Arial" w:cs="Arial"/>
-          <w:color w:val="1F497D"/>
-          <w:sz w:val="18"/>
-          <w:szCs w:val="18"/>
-        </w:rPr>
-        <w:t>end</w:t>
-      </w:r>
-      <w:r>
-        <w:rPr>
-          <w:rFonts w:ascii="Arial" w:hAnsi="Arial" w:cs="Arial"/>
-          <w:color w:val="1F497D"/>
-          <w:sz w:val="18"/>
-          <w:szCs w:val="18"/>
-        </w:rPr>
-        <w:t>ing</w:t>
-      </w:r>
-      <w:r>
-        <w:rPr>
-          <w:rFonts w:ascii="Arial" w:hAnsi="Arial" w:cs="Arial"/>
-          <w:color w:val="1F497D"/>
-          <w:sz w:val="18"/>
-          <w:szCs w:val="18"/>
-        </w:rPr>
-        <w:t xml:space="preserve"> </w:t>
-      </w:r>
-      <w:r>
-        <w:rPr>
-          <w:rFonts w:ascii="Arial" w:hAnsi="Arial" w:cs="Arial"/>
-          <w:color w:val="1F497D"/>
-          <w:sz w:val="18"/>
-          <w:szCs w:val="18"/>
-        </w:rPr>
-        <w:t>single-</w:t>
-      </w:r>
-      <w:r>
-        <w:rPr>
-          <w:rFonts w:ascii="Arial" w:hAnsi="Arial" w:cs="Arial"/>
-          <w:color w:val="1F497D"/>
-          <w:sz w:val="18"/>
-          <w:szCs w:val="18"/>
-        </w:rPr>
-        <w:t xml:space="preserve">loop </w:t>
-      </w:r>
-      <w:r>
-        <w:rPr>
-          <w:rFonts w:ascii="Arial" w:hAnsi="Arial" w:cs="Arial"/>
-          <w:color w:val="1F497D"/>
-          <w:sz w:val="18"/>
-          <w:szCs w:val="18"/>
-        </w:rPr>
-        <w:t>data to a</w:t>
-      </w:r>
-      <w:r>
-        <w:rPr>
-          <w:rFonts w:ascii="Arial" w:hAnsi="Arial" w:cs="Arial"/>
-          <w:color w:val="1F497D"/>
-          <w:sz w:val="18"/>
-          <w:szCs w:val="18"/>
-        </w:rPr>
-        <w:t xml:space="preserve"> 2-loop </w:t>
-      </w:r>
-      <w:proofErr w:type="gramStart"/>
-      <w:r>
-        <w:rPr>
-          <w:rFonts w:ascii="Arial" w:hAnsi="Arial" w:cs="Arial"/>
-          <w:color w:val="1F497D"/>
-          <w:sz w:val="18"/>
-          <w:szCs w:val="18"/>
-        </w:rPr>
-        <w:t>panel</w:t>
-      </w:r>
-      <w:r>
-        <w:rPr>
-          <w:rFonts w:ascii="Arial" w:hAnsi="Arial" w:cs="Arial"/>
-          <w:color w:val="1F497D"/>
-          <w:sz w:val="18"/>
-          <w:szCs w:val="18"/>
-        </w:rPr>
-        <w:t>,</w:t>
-      </w:r>
-      <w:r>
-        <w:rPr>
-          <w:rFonts w:ascii="Arial" w:hAnsi="Arial" w:cs="Arial"/>
-          <w:color w:val="1F497D"/>
-          <w:sz w:val="18"/>
-          <w:szCs w:val="18"/>
-        </w:rPr>
-        <w:t xml:space="preserve"> </w:t>
-      </w:r>
-      <w:r>
-        <w:rPr>
-          <w:rFonts w:ascii="Arial" w:hAnsi="Arial" w:cs="Arial"/>
-          <w:color w:val="1F497D"/>
-          <w:sz w:val="18"/>
-          <w:szCs w:val="18"/>
-        </w:rPr>
-        <w:t>and</w:t>
-      </w:r>
-      <w:proofErr w:type="gramEnd"/>
-      <w:r>
-        <w:rPr>
-          <w:rFonts w:ascii="Arial" w:hAnsi="Arial" w:cs="Arial"/>
-          <w:color w:val="1F497D"/>
-          <w:sz w:val="18"/>
-          <w:szCs w:val="18"/>
-        </w:rPr>
-        <w:t xml:space="preserve"> </w:t>
-      </w:r>
-      <w:r>
-        <w:rPr>
-          <w:rFonts w:ascii="Arial" w:hAnsi="Arial" w:cs="Arial"/>
-          <w:color w:val="1F497D"/>
-          <w:sz w:val="18"/>
-          <w:szCs w:val="18"/>
-        </w:rPr>
-        <w:t>opening a file wh</w:t>
-      </w:r>
-      <w:r>
-        <w:rPr>
-          <w:rFonts w:ascii="Arial" w:hAnsi="Arial" w:cs="Arial"/>
-          <w:color w:val="1F497D"/>
-          <w:sz w:val="18"/>
-          <w:szCs w:val="18"/>
-        </w:rPr>
-        <w:t xml:space="preserve">ich does not contain any panel numbers the same as the </w:t>
-      </w:r>
-      <w:r>
-        <w:rPr>
-          <w:rFonts w:ascii="Arial" w:hAnsi="Arial" w:cs="Arial"/>
-          <w:color w:val="1F497D"/>
-          <w:sz w:val="18"/>
-          <w:szCs w:val="18"/>
-        </w:rPr>
-        <w:t>current panel.</w:t>
+          <w:i/>
+          <w:iCs/>
+          <w:color w:val="1F497D"/>
+          <w:sz w:val="18"/>
+          <w:szCs w:val="18"/>
+        </w:rPr>
+        <w:t>For this, device names and zone descriptions are prefixed with type codes and zone numbers respectively.  If not already prefixed, before uploading the user is asked whether the pane</w:t>
+      </w:r>
+      <w:r>
+        <w:rPr>
+          <w:rFonts w:ascii="Arial" w:hAnsi="Arial" w:cs="Arial"/>
+          <w:i/>
+          <w:iCs/>
+          <w:color w:val="1F497D"/>
+          <w:sz w:val="18"/>
+          <w:szCs w:val="18"/>
+        </w:rPr>
+        <w:t>l</w:t>
+      </w:r>
+      <w:r>
+        <w:rPr>
+          <w:rFonts w:ascii="Arial" w:hAnsi="Arial" w:cs="Arial"/>
+          <w:i/>
+          <w:iCs/>
+          <w:color w:val="1F497D"/>
+          <w:sz w:val="18"/>
+          <w:szCs w:val="18"/>
+        </w:rPr>
+        <w:t xml:space="preserve"> is for Envision and, if Yes, the prefixes are added.</w:t>
+      </w:r>
+      <w:r>
+        <w:rPr>
+          <w:rFonts w:ascii="Arial" w:hAnsi="Arial" w:cs="Arial"/>
+          <w:color w:val="1F497D"/>
+          <w:sz w:val="18"/>
+          <w:szCs w:val="18"/>
+        </w:rPr>
+        <w:br/>
       </w:r>
     </w:p>
     <w:p>
@@ -1715,64 +1680,23 @@
         <w:contextualSpacing/>
         <w:rPr>
           <w:rFonts w:ascii="Arial" w:hAnsi="Arial" w:cs="Arial"/>
-          <w:color w:val="1F497D"/>
-          <w:sz w:val="18"/>
-          <w:szCs w:val="18"/>
-        </w:rPr>
-      </w:pPr>
-      <w:r>
-        <w:rPr>
-          <w:rFonts w:ascii="Arial" w:hAnsi="Arial" w:cs="Arial"/>
-          <w:color w:val="1F497D"/>
-          <w:sz w:val="18"/>
-          <w:szCs w:val="18"/>
-        </w:rPr>
-        <w:t>•</w:t>
-      </w:r>
-      <w:r>
-        <w:rPr>
-          <w:rFonts w:ascii="Arial" w:hAnsi="Arial" w:cs="Arial"/>
-          <w:color w:val="1F497D"/>
-          <w:sz w:val="18"/>
-          <w:szCs w:val="18"/>
-        </w:rPr>
-        <w:tab/>
-      </w:r>
-      <w:r>
-        <w:rPr>
-          <w:rFonts w:ascii="Arial" w:hAnsi="Arial" w:cs="Arial"/>
-          <w:color w:val="1F497D"/>
-          <w:sz w:val="18"/>
-          <w:szCs w:val="18"/>
-        </w:rPr>
-        <w:t>The displaying of e</w:t>
-      </w:r>
-      <w:r>
-        <w:rPr>
-          <w:rFonts w:ascii="Arial" w:hAnsi="Arial" w:cs="Arial"/>
-          <w:color w:val="1F497D"/>
-          <w:sz w:val="18"/>
-          <w:szCs w:val="18"/>
-        </w:rPr>
-        <w:t xml:space="preserve">rror boxes on invalid items </w:t>
-      </w:r>
-      <w:r>
-        <w:rPr>
-          <w:rFonts w:ascii="Arial" w:hAnsi="Arial" w:cs="Arial"/>
-          <w:color w:val="1F497D"/>
-          <w:sz w:val="18"/>
-          <w:szCs w:val="18"/>
-        </w:rPr>
-        <w:t>has been made more consistent</w:t>
-      </w:r>
-      <w:r>
-        <w:rPr>
-          <w:rFonts w:ascii="Arial" w:hAnsi="Arial" w:cs="Arial"/>
-          <w:color w:val="1F497D"/>
-          <w:sz w:val="18"/>
-          <w:szCs w:val="18"/>
-        </w:rPr>
-        <w:t>.</w:t>
+          <w:b/>
+          <w:bCs/>
+          <w:color w:val="1F497D"/>
+          <w:sz w:val="18"/>
+          <w:szCs w:val="18"/>
+        </w:rPr>
+      </w:pPr>
+      <w:r>
+        <w:rPr>
+          <w:rFonts w:ascii="Arial" w:hAnsi="Arial" w:cs="Arial"/>
+          <w:b/>
+          <w:bCs/>
+          <w:color w:val="1F497D"/>
+          <w:sz w:val="18"/>
+          <w:szCs w:val="18"/>
+        </w:rPr>
+        <w:t>Fixes</w:t>
       </w:r>
     </w:p>
     <w:p>
@@ -1812,43 +1736,132 @@
           <w:szCs w:val="18"/>
         </w:rPr>
         <w:tab/>
-        <w:t xml:space="preserve">The Validation Window no longer </w:t>
-      </w:r>
-      <w:r>
-        <w:rPr>
-          <w:rFonts w:ascii="Arial" w:hAnsi="Arial" w:cs="Arial"/>
-          <w:color w:val="1F497D"/>
-          <w:sz w:val="18"/>
-          <w:szCs w:val="18"/>
-        </w:rPr>
-        <w:t>indicate</w:t>
-      </w:r>
-      <w:r>
-        <w:rPr>
-          <w:rFonts w:ascii="Arial" w:hAnsi="Arial" w:cs="Arial"/>
-          <w:color w:val="1F497D"/>
-          <w:sz w:val="18"/>
-          <w:szCs w:val="18"/>
-        </w:rPr>
-        <w:t xml:space="preserve">s Loop 2 for </w:t>
-      </w:r>
-      <w:r>
-        <w:rPr>
-          <w:rFonts w:ascii="Arial" w:hAnsi="Arial" w:cs="Arial"/>
-          <w:color w:val="1F497D"/>
-          <w:sz w:val="18"/>
-          <w:szCs w:val="18"/>
-        </w:rPr>
-        <w:t xml:space="preserve">a </w:t>
-      </w:r>
-      <w:r>
-        <w:rPr>
-          <w:rFonts w:ascii="Arial" w:hAnsi="Arial" w:cs="Arial"/>
-          <w:color w:val="1F497D"/>
-          <w:sz w:val="18"/>
-          <w:szCs w:val="18"/>
-        </w:rPr>
-        <w:t>single-loop panel.</w:t>
+      </w:r>
+      <w:r>
+        <w:rPr>
+          <w:rFonts w:ascii="Arial" w:hAnsi="Arial" w:cs="Arial"/>
+          <w:color w:val="1F497D"/>
+          <w:sz w:val="18"/>
+          <w:szCs w:val="18"/>
+        </w:rPr>
+        <w:t>Two faults that would cause the app to shut down have been corrected: s</w:t>
+      </w:r>
+      <w:r>
+        <w:rPr>
+          <w:rFonts w:ascii="Arial" w:hAnsi="Arial" w:cs="Arial"/>
+          <w:color w:val="1F497D"/>
+          <w:sz w:val="18"/>
+          <w:szCs w:val="18"/>
+        </w:rPr>
+        <w:t>end</w:t>
+      </w:r>
+      <w:r>
+        <w:rPr>
+          <w:rFonts w:ascii="Arial" w:hAnsi="Arial" w:cs="Arial"/>
+          <w:color w:val="1F497D"/>
+          <w:sz w:val="18"/>
+          <w:szCs w:val="18"/>
+        </w:rPr>
+        <w:t>ing</w:t>
+      </w:r>
+      <w:r>
+        <w:rPr>
+          <w:rFonts w:ascii="Arial" w:hAnsi="Arial" w:cs="Arial"/>
+          <w:color w:val="1F497D"/>
+          <w:sz w:val="18"/>
+          <w:szCs w:val="18"/>
+        </w:rPr>
+        <w:t xml:space="preserve"> </w:t>
+      </w:r>
+      <w:r>
+        <w:rPr>
+          <w:rFonts w:ascii="Arial" w:hAnsi="Arial" w:cs="Arial"/>
+          <w:color w:val="1F497D"/>
+          <w:sz w:val="18"/>
+          <w:szCs w:val="18"/>
+        </w:rPr>
+        <w:t>single-</w:t>
+      </w:r>
+      <w:r>
+        <w:rPr>
+          <w:rFonts w:ascii="Arial" w:hAnsi="Arial" w:cs="Arial"/>
+          <w:color w:val="1F497D"/>
+          <w:sz w:val="18"/>
+          <w:szCs w:val="18"/>
+        </w:rPr>
+        <w:t xml:space="preserve">loop </w:t>
+      </w:r>
+      <w:r>
+        <w:rPr>
+          <w:rFonts w:ascii="Arial" w:hAnsi="Arial" w:cs="Arial"/>
+          <w:color w:val="1F497D"/>
+          <w:sz w:val="18"/>
+          <w:szCs w:val="18"/>
+        </w:rPr>
+        <w:t>data to a</w:t>
+      </w:r>
+      <w:r>
+        <w:rPr>
+          <w:rFonts w:ascii="Arial" w:hAnsi="Arial" w:cs="Arial"/>
+          <w:color w:val="1F497D"/>
+          <w:sz w:val="18"/>
+          <w:szCs w:val="18"/>
+        </w:rPr>
+        <w:t xml:space="preserve"> 2-loop panel</w:t>
+      </w:r>
+      <w:r>
+        <w:rPr>
+          <w:rFonts w:ascii="Arial" w:hAnsi="Arial" w:cs="Arial"/>
+          <w:color w:val="1F497D"/>
+          <w:sz w:val="18"/>
+          <w:szCs w:val="18"/>
+        </w:rPr>
+        <w:t>,</w:t>
+      </w:r>
+      <w:r>
+        <w:rPr>
+          <w:rFonts w:ascii="Arial" w:hAnsi="Arial" w:cs="Arial"/>
+          <w:color w:val="1F497D"/>
+          <w:sz w:val="18"/>
+          <w:szCs w:val="18"/>
+        </w:rPr>
+        <w:t xml:space="preserve"> </w:t>
+      </w:r>
+      <w:r>
+        <w:rPr>
+          <w:rFonts w:ascii="Arial" w:hAnsi="Arial" w:cs="Arial"/>
+          <w:color w:val="1F497D"/>
+          <w:sz w:val="18"/>
+          <w:szCs w:val="18"/>
+        </w:rPr>
+        <w:t xml:space="preserve">and </w:t>
+      </w:r>
+      <w:r>
+        <w:rPr>
+          <w:rFonts w:ascii="Arial" w:hAnsi="Arial" w:cs="Arial"/>
+          <w:color w:val="1F497D"/>
+          <w:sz w:val="18"/>
+          <w:szCs w:val="18"/>
+        </w:rPr>
+        <w:t>opening a file wh</w:t>
+      </w:r>
+      <w:r>
+        <w:rPr>
+          <w:rFonts w:ascii="Arial" w:hAnsi="Arial" w:cs="Arial"/>
+          <w:color w:val="1F497D"/>
+          <w:sz w:val="18"/>
+          <w:szCs w:val="18"/>
+        </w:rPr>
+        <w:t xml:space="preserve">ich does not contain any panel numbers the same as the </w:t>
+      </w:r>
+      <w:r>
+        <w:rPr>
+          <w:rFonts w:ascii="Arial" w:hAnsi="Arial" w:cs="Arial"/>
+          <w:color w:val="1F497D"/>
+          <w:sz w:val="18"/>
+          <w:szCs w:val="18"/>
+        </w:rPr>
+        <w:t>current panel.</w:t>
       </w:r>
     </w:p>
     <w:p>
@@ -1896,25 +1909,25 @@
           <w:sz w:val="18"/>
           <w:szCs w:val="18"/>
         </w:rPr>
-        <w:t xml:space="preserve">On the </w:t>
-      </w:r>
-      <w:r>
-        <w:rPr>
-          <w:rFonts w:ascii="Arial" w:hAnsi="Arial" w:cs="Arial"/>
-          <w:color w:val="1F497D"/>
-          <w:sz w:val="18"/>
-          <w:szCs w:val="18"/>
-        </w:rPr>
-        <w:t>Causes &amp; Effects page</w:t>
-      </w:r>
-      <w:r>
-        <w:rPr>
-          <w:rFonts w:ascii="Arial" w:hAnsi="Arial" w:cs="Arial"/>
-          <w:color w:val="1F497D"/>
-          <w:sz w:val="18"/>
-          <w:szCs w:val="18"/>
-        </w:rPr>
-        <w:t>, data that has been read from a file is now updated correctly on all lines</w:t>
+        <w:t>The displaying of e</w:t>
+      </w:r>
+      <w:r>
+        <w:rPr>
+          <w:rFonts w:ascii="Arial" w:hAnsi="Arial" w:cs="Arial"/>
+          <w:color w:val="1F497D"/>
+          <w:sz w:val="18"/>
+          <w:szCs w:val="18"/>
+        </w:rPr>
+        <w:t xml:space="preserve">rror boxes on invalid items </w:t>
+      </w:r>
+      <w:r>
+        <w:rPr>
+          <w:rFonts w:ascii="Arial" w:hAnsi="Arial" w:cs="Arial"/>
+          <w:color w:val="1F497D"/>
+          <w:sz w:val="18"/>
+          <w:szCs w:val="18"/>
+        </w:rPr>
+        <w:t>has been made more consistent</w:t>
       </w:r>
       <w:r>
         <w:rPr>
@@ -1946,95 +1959,60 @@
           <w:szCs w:val="18"/>
         </w:rPr>
       </w:pPr>
-    </w:p>
-    <w:p>
-      <w:pPr>
-        <w:tabs>
-          <w:tab w:val="left" w:pos="993"/>
-        </w:tabs>
-        <w:rPr>
-          <w:rFonts w:ascii="Arial" w:hAnsi="Arial" w:cs="Arial"/>
-          <w:color w:val="9CC2E5" w:themeColor="accent1" w:themeTint="99"/>
-          <w:sz w:val="16"/>
-          <w:szCs w:val="16"/>
-        </w:rPr>
-      </w:pPr>
-      <w:r>
-        <w:rPr>
-          <w:rFonts w:ascii="Arial" w:hAnsi="Arial" w:cs="Arial"/>
-          <w:b/>
-          <w:bCs/>
-          <w:color w:val="4472C4" w:themeColor="accent5"/>
-          <w:sz w:val="24"/>
-          <w:szCs w:val="24"/>
-        </w:rPr>
-        <w:t>v8.1.</w:t>
-      </w:r>
-      <w:r>
-        <w:rPr>
-          <w:rFonts w:ascii="Arial" w:hAnsi="Arial" w:cs="Arial"/>
-          <w:b/>
-          <w:bCs/>
-          <w:color w:val="4472C4" w:themeColor="accent5"/>
-          <w:sz w:val="24"/>
-          <w:szCs w:val="24"/>
-        </w:rPr>
-        <w:t>8</w:t>
-      </w:r>
-      <w:r>
-        <w:rPr>
-          <w:rFonts w:ascii="Arial" w:hAnsi="Arial" w:cs="Arial"/>
-          <w:b/>
-          <w:bCs/>
-          <w:color w:val="4472C4" w:themeColor="accent5"/>
-          <w:sz w:val="24"/>
-          <w:szCs w:val="24"/>
+      <w:r>
+        <w:rPr>
+          <w:rFonts w:ascii="Arial" w:hAnsi="Arial" w:cs="Arial"/>
+          <w:color w:val="1F497D"/>
+          <w:sz w:val="18"/>
+          <w:szCs w:val="18"/>
+        </w:rPr>
+        <w:t>•</w:t>
+      </w:r>
+      <w:r>
+        <w:rPr>
+          <w:rFonts w:ascii="Arial" w:hAnsi="Arial" w:cs="Arial"/>
+          <w:color w:val="1F497D"/>
+          <w:sz w:val="18"/>
+          <w:szCs w:val="18"/>
         </w:rPr>
         <w:tab/>
-      </w:r>
-      <w:r>
-        <w:rPr>
-          <w:rFonts w:ascii="Arial" w:hAnsi="Arial" w:cs="Arial"/>
-          <w:b/>
-          <w:bCs/>
-          <w:color w:val="4472C4" w:themeColor="accent5"/>
-          <w:sz w:val="24"/>
-          <w:szCs w:val="24"/>
-        </w:rPr>
-        <w:t>26</w:t>
-      </w:r>
-      <w:r>
-        <w:rPr>
-          <w:rFonts w:ascii="Arial" w:hAnsi="Arial" w:cs="Arial"/>
-          <w:b/>
-          <w:bCs/>
-          <w:color w:val="4472C4" w:themeColor="accent5"/>
-          <w:sz w:val="24"/>
-          <w:szCs w:val="24"/>
-        </w:rPr>
-        <w:t>/</w:t>
-      </w:r>
-      <w:r>
-        <w:rPr>
-          <w:rFonts w:ascii="Arial" w:hAnsi="Arial" w:cs="Arial"/>
-          <w:b/>
-          <w:bCs/>
-          <w:color w:val="4472C4" w:themeColor="accent5"/>
-          <w:sz w:val="24"/>
-          <w:szCs w:val="24"/>
-        </w:rPr>
-        <w:t>09</w:t>
-      </w:r>
-      <w:r>
-        <w:rPr>
-          <w:rFonts w:ascii="Arial" w:hAnsi="Arial" w:cs="Arial"/>
-          <w:b/>
-          <w:bCs/>
-          <w:color w:val="4472C4" w:themeColor="accent5"/>
-          <w:sz w:val="24"/>
-          <w:szCs w:val="24"/>
-        </w:rPr>
-        <w:t>/2025</w:t>
+        <w:t xml:space="preserve">The Validation Window no longer </w:t>
+      </w:r>
+      <w:r>
+        <w:rPr>
+          <w:rFonts w:ascii="Arial" w:hAnsi="Arial" w:cs="Arial"/>
+          <w:color w:val="1F497D"/>
+          <w:sz w:val="18"/>
+          <w:szCs w:val="18"/>
+        </w:rPr>
+        <w:t>indicate</w:t>
+      </w:r>
+      <w:r>
+        <w:rPr>
+          <w:rFonts w:ascii="Arial" w:hAnsi="Arial" w:cs="Arial"/>
+          <w:color w:val="1F497D"/>
+          <w:sz w:val="18"/>
+          <w:szCs w:val="18"/>
+        </w:rPr>
+        <w:t xml:space="preserve">s Loop 2 for </w:t>
+      </w:r>
+      <w:r>
+        <w:rPr>
+          <w:rFonts w:ascii="Arial" w:hAnsi="Arial" w:cs="Arial"/>
+          <w:color w:val="1F497D"/>
+          <w:sz w:val="18"/>
+          <w:szCs w:val="18"/>
+        </w:rPr>
+        <w:t xml:space="preserve">a </w:t>
+      </w:r>
+      <w:r>
+        <w:rPr>
+          <w:rFonts w:ascii="Arial" w:hAnsi="Arial" w:cs="Arial"/>
+          <w:color w:val="1F497D"/>
+          <w:sz w:val="18"/>
+          <w:szCs w:val="18"/>
+        </w:rPr>
+        <w:t>single-loop panel.</w:t>
       </w:r>
     </w:p>
     <w:p>
@@ -2064,7 +2042,7 @@
           <w:sz w:val="18"/>
           <w:szCs w:val="18"/>
         </w:rPr>
-        <w:t>-</w:t>
+        <w:t>•</w:t>
       </w:r>
       <w:r>
         <w:rPr>
@@ -2082,79 +2060,25 @@
           <w:sz w:val="18"/>
           <w:szCs w:val="18"/>
         </w:rPr>
-        <w:t>Correction:</w:t>
-      </w:r>
-      <w:r>
-        <w:rPr>
-          <w:rFonts w:ascii="Arial" w:hAnsi="Arial" w:cs="Arial"/>
-          <w:color w:val="1F497D"/>
-          <w:sz w:val="18"/>
-          <w:szCs w:val="18"/>
-        </w:rPr>
-        <w:t xml:space="preserve"> device I/O configuration </w:t>
-      </w:r>
-      <w:r>
-        <w:rPr>
-          <w:rFonts w:ascii="Arial" w:hAnsi="Arial" w:cs="Arial"/>
-          <w:color w:val="1F497D"/>
-          <w:sz w:val="18"/>
-          <w:szCs w:val="18"/>
-        </w:rPr>
-        <w:t xml:space="preserve">item </w:t>
-      </w:r>
-      <w:r>
-        <w:rPr>
-          <w:rFonts w:ascii="Arial" w:hAnsi="Arial" w:cs="Arial"/>
-          <w:color w:val="1F497D"/>
-          <w:sz w:val="18"/>
-          <w:szCs w:val="18"/>
-        </w:rPr>
-        <w:t>description</w:t>
-      </w:r>
-      <w:r>
-        <w:rPr>
-          <w:rFonts w:ascii="Arial" w:hAnsi="Arial" w:cs="Arial"/>
-          <w:color w:val="1F497D"/>
-          <w:sz w:val="18"/>
-          <w:szCs w:val="18"/>
-        </w:rPr>
-        <w:t xml:space="preserve"> edit</w:t>
-      </w:r>
-      <w:r>
-        <w:rPr>
-          <w:rFonts w:ascii="Arial" w:hAnsi="Arial" w:cs="Arial"/>
-          <w:color w:val="1F497D"/>
-          <w:sz w:val="18"/>
-          <w:szCs w:val="18"/>
-        </w:rPr>
-        <w:t xml:space="preserve">s </w:t>
-      </w:r>
-      <w:r>
-        <w:rPr>
-          <w:rFonts w:ascii="Arial" w:hAnsi="Arial" w:cs="Arial"/>
-          <w:color w:val="1F497D"/>
-          <w:sz w:val="18"/>
-          <w:szCs w:val="18"/>
-        </w:rPr>
-        <w:t xml:space="preserve">have been corrected so that </w:t>
-      </w:r>
-      <w:r>
-        <w:rPr>
-          <w:rFonts w:ascii="Arial" w:hAnsi="Arial" w:cs="Arial"/>
-          <w:color w:val="1F497D"/>
-          <w:sz w:val="18"/>
-          <w:szCs w:val="18"/>
-        </w:rPr>
-        <w:t>descriptions and/or device names on other devices</w:t>
-      </w:r>
-      <w:r>
-        <w:rPr>
-          <w:rFonts w:ascii="Arial" w:hAnsi="Arial" w:cs="Arial"/>
-          <w:color w:val="1F497D"/>
-          <w:sz w:val="18"/>
-          <w:szCs w:val="18"/>
-        </w:rPr>
-        <w:t xml:space="preserve"> are not affected</w:t>
+        <w:t xml:space="preserve">On the </w:t>
+      </w:r>
+      <w:r>
+        <w:rPr>
+          <w:rFonts w:ascii="Arial" w:hAnsi="Arial" w:cs="Arial"/>
+          <w:color w:val="1F497D"/>
+          <w:sz w:val="18"/>
+          <w:szCs w:val="18"/>
+        </w:rPr>
+        <w:t>Causes &amp; Effects page</w:t>
+      </w:r>
+      <w:r>
+        <w:rPr>
+          <w:rFonts w:ascii="Arial" w:hAnsi="Arial" w:cs="Arial"/>
+          <w:color w:val="1F497D"/>
+          <w:sz w:val="18"/>
+          <w:szCs w:val="18"/>
+        </w:rPr>
+        <w:t>, data that has been read from a file is now updated correctly on all lines</w:t>
       </w:r>
       <w:r>
         <w:rPr>
@@ -2186,51 +2110,95 @@
           <w:szCs w:val="18"/>
         </w:rPr>
       </w:pPr>
-      <w:r>
-        <w:rPr>
-          <w:rFonts w:ascii="Arial" w:hAnsi="Arial" w:cs="Arial"/>
-          <w:color w:val="1F497D"/>
-          <w:sz w:val="18"/>
-          <w:szCs w:val="18"/>
-        </w:rPr>
-        <w:t>-</w:t>
-      </w:r>
-      <w:r>
-        <w:rPr>
-          <w:rFonts w:ascii="Arial" w:hAnsi="Arial" w:cs="Arial"/>
-          <w:color w:val="1F497D"/>
-          <w:sz w:val="18"/>
-          <w:szCs w:val="18"/>
+    </w:p>
+    <w:p>
+      <w:pPr>
+        <w:tabs>
+          <w:tab w:val="left" w:pos="993"/>
+        </w:tabs>
+        <w:rPr>
+          <w:rFonts w:ascii="Arial" w:hAnsi="Arial" w:cs="Arial"/>
+          <w:color w:val="9CC2E5" w:themeColor="accent1" w:themeTint="99"/>
+          <w:sz w:val="16"/>
+          <w:szCs w:val="16"/>
+        </w:rPr>
+      </w:pPr>
+      <w:r>
+        <w:rPr>
+          <w:rFonts w:ascii="Arial" w:hAnsi="Arial" w:cs="Arial"/>
+          <w:b/>
+          <w:bCs/>
+          <w:color w:val="4472C4" w:themeColor="accent5"/>
+          <w:sz w:val="24"/>
+          <w:szCs w:val="24"/>
+        </w:rPr>
+        <w:t>v8.1.</w:t>
+      </w:r>
+      <w:r>
+        <w:rPr>
+          <w:rFonts w:ascii="Arial" w:hAnsi="Arial" w:cs="Arial"/>
+          <w:b/>
+          <w:bCs/>
+          <w:color w:val="4472C4" w:themeColor="accent5"/>
+          <w:sz w:val="24"/>
+          <w:szCs w:val="24"/>
+        </w:rPr>
+        <w:t>8</w:t>
+      </w:r>
+      <w:r>
+        <w:rPr>
+          <w:rFonts w:ascii="Arial" w:hAnsi="Arial" w:cs="Arial"/>
+          <w:b/>
+          <w:bCs/>
+          <w:color w:val="4472C4" w:themeColor="accent5"/>
+          <w:sz w:val="24"/>
+          <w:szCs w:val="24"/>
         </w:rPr>
         <w:tab/>
-        <w:t>Correction:</w:t>
-      </w:r>
-      <w:r>
-        <w:rPr>
-          <w:rFonts w:ascii="Arial" w:hAnsi="Arial" w:cs="Arial"/>
-          <w:color w:val="1F497D"/>
-          <w:sz w:val="18"/>
-          <w:szCs w:val="18"/>
-        </w:rPr>
-        <w:t xml:space="preserve"> the Add Second Loop option for single-loop panels</w:t>
-      </w:r>
-      <w:r>
-        <w:rPr>
-          <w:rFonts w:ascii="Arial" w:hAnsi="Arial" w:cs="Arial"/>
-          <w:color w:val="1F497D"/>
-          <w:sz w:val="18"/>
-          <w:szCs w:val="18"/>
-        </w:rPr>
-        <w:t xml:space="preserve"> now ensures that the</w:t>
-      </w:r>
-      <w:r>
-        <w:rPr>
-          <w:rFonts w:ascii="Arial" w:hAnsi="Arial" w:cs="Arial"/>
-          <w:color w:val="1F497D"/>
-          <w:sz w:val="18"/>
-          <w:szCs w:val="18"/>
-        </w:rPr>
-        <w:t xml:space="preserve"> device lists on the other pages are now populated correctly with the required number of (empty) devices.</w:t>
+      </w:r>
+      <w:r>
+        <w:rPr>
+          <w:rFonts w:ascii="Arial" w:hAnsi="Arial" w:cs="Arial"/>
+          <w:b/>
+          <w:bCs/>
+          <w:color w:val="4472C4" w:themeColor="accent5"/>
+          <w:sz w:val="24"/>
+          <w:szCs w:val="24"/>
+        </w:rPr>
+        <w:t>26</w:t>
+      </w:r>
+      <w:r>
+        <w:rPr>
+          <w:rFonts w:ascii="Arial" w:hAnsi="Arial" w:cs="Arial"/>
+          <w:b/>
+          <w:bCs/>
+          <w:color w:val="4472C4" w:themeColor="accent5"/>
+          <w:sz w:val="24"/>
+          <w:szCs w:val="24"/>
+        </w:rPr>
+        <w:t>/</w:t>
+      </w:r>
+      <w:r>
+        <w:rPr>
+          <w:rFonts w:ascii="Arial" w:hAnsi="Arial" w:cs="Arial"/>
+          <w:b/>
+          <w:bCs/>
+          <w:color w:val="4472C4" w:themeColor="accent5"/>
+          <w:sz w:val="24"/>
+          <w:szCs w:val="24"/>
+        </w:rPr>
+        <w:t>09</w:t>
+      </w:r>
+      <w:r>
+        <w:rPr>
+          <w:rFonts w:ascii="Arial" w:hAnsi="Arial" w:cs="Arial"/>
+          <w:b/>
+          <w:bCs/>
+          <w:color w:val="4472C4" w:themeColor="accent5"/>
+          <w:sz w:val="24"/>
+          <w:szCs w:val="24"/>
+        </w:rPr>
+        <w:t>/2025</w:t>
       </w:r>
     </w:p>
     <w:p>
@@ -2265,8 +2233,6 @@
       <w:r>
         <w:rPr>
           <w:rFonts w:ascii="Arial" w:hAnsi="Arial" w:cs="Arial"/>
-          <w:b/>
-          <w:bCs/>
           <w:color w:val="1F497D"/>
           <w:sz w:val="18"/>
           <w:szCs w:val="18"/>
@@ -2280,10 +2246,90 @@
           <w:sz w:val="18"/>
           <w:szCs w:val="18"/>
         </w:rPr>
-        <w:t xml:space="preserve">Notification popups are shown after each upload and download, indicating completion or otherwise. </w:t>
-      </w:r>
-    </w:p>
-    <w:bookmarkEnd w:id="0"/>
+        <w:t>Correction:</w:t>
+      </w:r>
+      <w:r>
+        <w:rPr>
+          <w:rFonts w:ascii="Arial" w:hAnsi="Arial" w:cs="Arial"/>
+          <w:color w:val="1F497D"/>
+          <w:sz w:val="18"/>
+          <w:szCs w:val="18"/>
+        </w:rPr>
+        <w:t xml:space="preserve"> device I/O configuration </w:t>
+      </w:r>
+      <w:r>
+        <w:rPr>
+          <w:rFonts w:ascii="Arial" w:hAnsi="Arial" w:cs="Arial"/>
+          <w:color w:val="1F497D"/>
+          <w:sz w:val="18"/>
+          <w:szCs w:val="18"/>
+        </w:rPr>
+        <w:t xml:space="preserve">item </w:t>
+      </w:r>
+      <w:r>
+        <w:rPr>
+          <w:rFonts w:ascii="Arial" w:hAnsi="Arial" w:cs="Arial"/>
+          <w:color w:val="1F497D"/>
+          <w:sz w:val="18"/>
+          <w:szCs w:val="18"/>
+        </w:rPr>
+        <w:t>description</w:t>
+      </w:r>
+      <w:r>
+        <w:rPr>
+          <w:rFonts w:ascii="Arial" w:hAnsi="Arial" w:cs="Arial"/>
+          <w:color w:val="1F497D"/>
+          <w:sz w:val="18"/>
+          <w:szCs w:val="18"/>
+        </w:rPr>
+        <w:t xml:space="preserve"> edit</w:t>
+      </w:r>
+      <w:r>
+        <w:rPr>
+          <w:rFonts w:ascii="Arial" w:hAnsi="Arial" w:cs="Arial"/>
+          <w:color w:val="1F497D"/>
+          <w:sz w:val="18"/>
+          <w:szCs w:val="18"/>
+        </w:rPr>
+        <w:t xml:space="preserve">s </w:t>
+      </w:r>
+      <w:r>
+        <w:rPr>
+          <w:rFonts w:ascii="Arial" w:hAnsi="Arial" w:cs="Arial"/>
+          <w:color w:val="1F497D"/>
+          <w:sz w:val="18"/>
+          <w:szCs w:val="18"/>
+        </w:rPr>
+        <w:t xml:space="preserve">have been corrected so that </w:t>
+      </w:r>
+      <w:r>
+        <w:rPr>
+          <w:rFonts w:ascii="Arial" w:hAnsi="Arial" w:cs="Arial"/>
+          <w:color w:val="1F497D"/>
+          <w:sz w:val="18"/>
+          <w:szCs w:val="18"/>
+        </w:rPr>
+        <w:t>descriptions and/or device names on other devices</w:t>
+      </w:r>
+      <w:r>
+        <w:rPr>
+          <w:rFonts w:ascii="Arial" w:hAnsi="Arial" w:cs="Arial"/>
+          <w:color w:val="1F497D"/>
+          <w:sz w:val="18"/>
+          <w:szCs w:val="18"/>
+        </w:rPr>
+        <w:t xml:space="preserve"> are not affected</w:t>
+      </w:r>
+      <w:r>
+        <w:rPr>
+          <w:rFonts w:ascii="Arial" w:hAnsi="Arial" w:cs="Arial"/>
+          <w:color w:val="1F497D"/>
+          <w:sz w:val="18"/>
+          <w:szCs w:val="18"/>
+        </w:rPr>
+        <w:t>.</w:t>
+      </w:r>
+    </w:p>
     <w:p>
       <w:pPr>
         <w:tabs>
@@ -2299,124 +2345,56 @@
         <w:contextualSpacing/>
         <w:rPr>
           <w:rFonts w:ascii="Arial" w:hAnsi="Arial" w:cs="Arial"/>
-          <w:b/>
-          <w:bCs/>
-          <w:color w:val="1F497D"/>
-          <w:sz w:val="18"/>
-          <w:szCs w:val="18"/>
-        </w:rPr>
-      </w:pPr>
-    </w:p>
-    <w:p>
-      <w:pPr>
-        <w:tabs>
-          <w:tab w:val="left" w:pos="993"/>
-        </w:tabs>
-        <w:rPr>
-          <w:rFonts w:ascii="Arial" w:hAnsi="Arial" w:cs="Arial"/>
-          <w:color w:val="9CC2E5" w:themeColor="accent1" w:themeTint="99"/>
-          <w:sz w:val="16"/>
-          <w:szCs w:val="16"/>
-        </w:rPr>
-      </w:pPr>
-      <w:r>
-        <w:rPr>
-          <w:rFonts w:ascii="Arial" w:hAnsi="Arial" w:cs="Arial"/>
-          <w:b/>
-          <w:bCs/>
-          <w:color w:val="4472C4" w:themeColor="accent5"/>
-          <w:sz w:val="24"/>
-          <w:szCs w:val="24"/>
-        </w:rPr>
-        <w:t>v8.1.</w:t>
-      </w:r>
-      <w:r>
-        <w:rPr>
-          <w:rFonts w:ascii="Arial" w:hAnsi="Arial" w:cs="Arial"/>
-          <w:b/>
-          <w:bCs/>
-          <w:color w:val="4472C4" w:themeColor="accent5"/>
-          <w:sz w:val="24"/>
-          <w:szCs w:val="24"/>
-        </w:rPr>
-        <w:t>7</w:t>
-      </w:r>
-      <w:r>
-        <w:rPr>
-          <w:rFonts w:ascii="Arial" w:hAnsi="Arial" w:cs="Arial"/>
-          <w:b/>
-          <w:bCs/>
-          <w:color w:val="4472C4" w:themeColor="accent5"/>
-          <w:sz w:val="24"/>
-          <w:szCs w:val="24"/>
+          <w:color w:val="1F497D"/>
+          <w:sz w:val="18"/>
+          <w:szCs w:val="18"/>
+        </w:rPr>
+      </w:pPr>
+      <w:r>
+        <w:rPr>
+          <w:rFonts w:ascii="Arial" w:hAnsi="Arial" w:cs="Arial"/>
+          <w:color w:val="1F497D"/>
+          <w:sz w:val="18"/>
+          <w:szCs w:val="18"/>
+        </w:rPr>
+        <w:t>-</w:t>
+      </w:r>
+      <w:r>
+        <w:rPr>
+          <w:rFonts w:ascii="Arial" w:hAnsi="Arial" w:cs="Arial"/>
+          <w:color w:val="1F497D"/>
+          <w:sz w:val="18"/>
+          <w:szCs w:val="18"/>
         </w:rPr>
         <w:tab/>
-      </w:r>
-      <w:r>
-        <w:rPr>
-          <w:rFonts w:ascii="Arial" w:hAnsi="Arial" w:cs="Arial"/>
-          <w:b/>
-          <w:bCs/>
-          <w:color w:val="4472C4" w:themeColor="accent5"/>
-          <w:sz w:val="24"/>
-          <w:szCs w:val="24"/>
-        </w:rPr>
-        <w:t>3</w:t>
-      </w:r>
-      <w:r>
-        <w:rPr>
-          <w:rFonts w:ascii="Arial" w:hAnsi="Arial" w:cs="Arial"/>
-          <w:b/>
-          <w:bCs/>
-          <w:color w:val="4472C4" w:themeColor="accent5"/>
-          <w:sz w:val="24"/>
-          <w:szCs w:val="24"/>
-        </w:rPr>
-        <w:t>1</w:t>
-      </w:r>
-      <w:r>
-        <w:rPr>
-          <w:rFonts w:ascii="Arial" w:hAnsi="Arial" w:cs="Arial"/>
-          <w:b/>
-          <w:bCs/>
-          <w:color w:val="4472C4" w:themeColor="accent5"/>
-          <w:sz w:val="24"/>
-          <w:szCs w:val="24"/>
-        </w:rPr>
-        <w:t>/</w:t>
-      </w:r>
-      <w:r>
-        <w:rPr>
-          <w:rFonts w:ascii="Arial" w:hAnsi="Arial" w:cs="Arial"/>
-          <w:b/>
-          <w:bCs/>
-          <w:color w:val="4472C4" w:themeColor="accent5"/>
-          <w:sz w:val="24"/>
-          <w:szCs w:val="24"/>
-        </w:rPr>
-        <w:t>0</w:t>
-      </w:r>
-      <w:r>
-        <w:rPr>
-          <w:rFonts w:ascii="Arial" w:hAnsi="Arial" w:cs="Arial"/>
-          <w:b/>
-          <w:bCs/>
-          <w:color w:val="4472C4" w:themeColor="accent5"/>
-          <w:sz w:val="24"/>
-          <w:szCs w:val="24"/>
-        </w:rPr>
-        <w:t>7</w:t>
-      </w:r>
-      <w:r>
-        <w:rPr>
-          <w:rFonts w:ascii="Arial" w:hAnsi="Arial" w:cs="Arial"/>
-          <w:b/>
-          <w:bCs/>
-          <w:color w:val="4472C4" w:themeColor="accent5"/>
-          <w:sz w:val="24"/>
-          <w:szCs w:val="24"/>
-        </w:rPr>
-        <w:t>/2025</w:t>
+        <w:t>Correction:</w:t>
+      </w:r>
+      <w:r>
+        <w:rPr>
+          <w:rFonts w:ascii="Arial" w:hAnsi="Arial" w:cs="Arial"/>
+          <w:color w:val="1F497D"/>
+          <w:sz w:val="18"/>
+          <w:szCs w:val="18"/>
+        </w:rPr>
+        <w:t xml:space="preserve"> the Add Second Loop option for single-loop panels</w:t>
+      </w:r>
+      <w:r>
+        <w:rPr>
+          <w:rFonts w:ascii="Arial" w:hAnsi="Arial" w:cs="Arial"/>
+          <w:color w:val="1F497D"/>
+          <w:sz w:val="18"/>
+          <w:szCs w:val="18"/>
+        </w:rPr>
+        <w:t xml:space="preserve"> now ensures that the</w:t>
+      </w:r>
+      <w:r>
+        <w:rPr>
+          <w:rFonts w:ascii="Arial" w:hAnsi="Arial" w:cs="Arial"/>
+          <w:color w:val="1F497D"/>
+          <w:sz w:val="18"/>
+          <w:szCs w:val="18"/>
+        </w:rPr>
+        <w:t xml:space="preserve"> device lists on the other pages are now populated correctly with the required number of (empty) devices.</w:t>
       </w:r>
     </w:p>
     <w:p>
@@ -2451,41 +2429,25 @@
       <w:r>
         <w:rPr>
           <w:rFonts w:ascii="Arial" w:hAnsi="Arial" w:cs="Arial"/>
+          <w:b/>
+          <w:bCs/>
           <w:color w:val="1F497D"/>
           <w:sz w:val="18"/>
           <w:szCs w:val="18"/>
         </w:rPr>
         <w:tab/>
-        <w:t xml:space="preserve">Removed system notifications which were causing </w:t>
-      </w:r>
-      <w:r>
-        <w:rPr>
-          <w:rFonts w:ascii="Arial" w:hAnsi="Arial" w:cs="Arial"/>
-          <w:color w:val="1F497D"/>
-          <w:sz w:val="18"/>
-          <w:szCs w:val="18"/>
-        </w:rPr>
-        <w:t>freezes</w:t>
-      </w:r>
-      <w:r>
-        <w:rPr>
-          <w:rFonts w:ascii="Arial" w:hAnsi="Arial" w:cs="Arial"/>
-          <w:color w:val="1F497D"/>
-          <w:sz w:val="18"/>
-          <w:szCs w:val="18"/>
-        </w:rPr>
-        <w:t xml:space="preserve"> and </w:t>
-      </w:r>
-      <w:r>
-        <w:rPr>
-          <w:rFonts w:ascii="Arial" w:hAnsi="Arial" w:cs="Arial"/>
-          <w:color w:val="1F497D"/>
-          <w:sz w:val="18"/>
-          <w:szCs w:val="18"/>
-        </w:rPr>
-        <w:t>crashes after download/upload.</w:t>
-      </w:r>
-    </w:p>
+      </w:r>
+      <w:r>
+        <w:rPr>
+          <w:rFonts w:ascii="Arial" w:hAnsi="Arial" w:cs="Arial"/>
+          <w:color w:val="1F497D"/>
+          <w:sz w:val="18"/>
+          <w:szCs w:val="18"/>
+        </w:rPr>
+        <w:t xml:space="preserve">Notification popups are shown after each upload and download, indicating completion or otherwise. </w:t>
+      </w:r>
+    </w:p>
+    <w:bookmarkEnd w:id="0"/>
     <w:p>
       <w:pPr>
         <w:tabs>
@@ -2501,73 +2463,124 @@
         <w:contextualSpacing/>
         <w:rPr>
           <w:rFonts w:ascii="Arial" w:hAnsi="Arial" w:cs="Arial"/>
-          <w:color w:val="1F497D"/>
-          <w:sz w:val="18"/>
-          <w:szCs w:val="18"/>
-        </w:rPr>
-      </w:pPr>
-      <w:r>
-        <w:rPr>
-          <w:rFonts w:ascii="Arial" w:hAnsi="Arial" w:cs="Arial"/>
-          <w:color w:val="1F497D"/>
-          <w:sz w:val="18"/>
-          <w:szCs w:val="18"/>
-        </w:rPr>
-        <w:t>-</w:t>
-      </w:r>
-      <w:r>
-        <w:rPr>
-          <w:rFonts w:ascii="Arial" w:hAnsi="Arial" w:cs="Arial"/>
-          <w:color w:val="1F497D"/>
-          <w:sz w:val="18"/>
-          <w:szCs w:val="18"/>
+          <w:b/>
+          <w:bCs/>
+          <w:color w:val="1F497D"/>
+          <w:sz w:val="18"/>
+          <w:szCs w:val="18"/>
+        </w:rPr>
+      </w:pPr>
+    </w:p>
+    <w:p>
+      <w:pPr>
+        <w:tabs>
+          <w:tab w:val="left" w:pos="993"/>
+        </w:tabs>
+        <w:rPr>
+          <w:rFonts w:ascii="Arial" w:hAnsi="Arial" w:cs="Arial"/>
+          <w:color w:val="9CC2E5" w:themeColor="accent1" w:themeTint="99"/>
+          <w:sz w:val="16"/>
+          <w:szCs w:val="16"/>
+        </w:rPr>
+      </w:pPr>
+      <w:r>
+        <w:rPr>
+          <w:rFonts w:ascii="Arial" w:hAnsi="Arial" w:cs="Arial"/>
+          <w:b/>
+          <w:bCs/>
+          <w:color w:val="4472C4" w:themeColor="accent5"/>
+          <w:sz w:val="24"/>
+          <w:szCs w:val="24"/>
+        </w:rPr>
+        <w:t>v8.1.</w:t>
+      </w:r>
+      <w:r>
+        <w:rPr>
+          <w:rFonts w:ascii="Arial" w:hAnsi="Arial" w:cs="Arial"/>
+          <w:b/>
+          <w:bCs/>
+          <w:color w:val="4472C4" w:themeColor="accent5"/>
+          <w:sz w:val="24"/>
+          <w:szCs w:val="24"/>
+        </w:rPr>
+        <w:t>7</w:t>
+      </w:r>
+      <w:r>
+        <w:rPr>
+          <w:rFonts w:ascii="Arial" w:hAnsi="Arial" w:cs="Arial"/>
+          <w:b/>
+          <w:bCs/>
+          <w:color w:val="4472C4" w:themeColor="accent5"/>
+          <w:sz w:val="24"/>
+          <w:szCs w:val="24"/>
         </w:rPr>
         <w:tab/>
       </w:r>
       <w:r>
         <w:rPr>
           <w:rFonts w:ascii="Arial" w:hAnsi="Arial" w:cs="Arial"/>
-          <w:color w:val="1F497D"/>
-          <w:sz w:val="18"/>
-          <w:szCs w:val="18"/>
-        </w:rPr>
-        <w:t xml:space="preserve">Moved Revision History </w:t>
-      </w:r>
-      <w:r>
-        <w:rPr>
-          <w:rFonts w:ascii="Arial" w:hAnsi="Arial" w:cs="Arial"/>
-          <w:color w:val="1F497D"/>
-          <w:sz w:val="18"/>
-          <w:szCs w:val="18"/>
-        </w:rPr>
-        <w:t xml:space="preserve">(this document) </w:t>
-      </w:r>
-      <w:r>
-        <w:rPr>
-          <w:rFonts w:ascii="Arial" w:hAnsi="Arial" w:cs="Arial"/>
-          <w:color w:val="1F497D"/>
-          <w:sz w:val="18"/>
-          <w:szCs w:val="18"/>
-        </w:rPr>
-        <w:t xml:space="preserve">from the </w:t>
-      </w:r>
-      <w:r>
-        <w:rPr>
-          <w:rFonts w:ascii="Arial" w:hAnsi="Arial" w:cs="Arial"/>
-          <w:color w:val="1F497D"/>
-          <w:sz w:val="18"/>
-          <w:szCs w:val="18"/>
-        </w:rPr>
-        <w:t>m</w:t>
-      </w:r>
-      <w:r>
-        <w:rPr>
-          <w:rFonts w:ascii="Arial" w:hAnsi="Arial" w:cs="Arial"/>
-          <w:color w:val="1F497D"/>
-          <w:sz w:val="18"/>
-          <w:szCs w:val="18"/>
-        </w:rPr>
-        <w:t>ain menu to the About box.</w:t>
+          <w:b/>
+          <w:bCs/>
+          <w:color w:val="4472C4" w:themeColor="accent5"/>
+          <w:sz w:val="24"/>
+          <w:szCs w:val="24"/>
+        </w:rPr>
+        <w:t>3</w:t>
+      </w:r>
+      <w:r>
+        <w:rPr>
+          <w:rFonts w:ascii="Arial" w:hAnsi="Arial" w:cs="Arial"/>
+          <w:b/>
+          <w:bCs/>
+          <w:color w:val="4472C4" w:themeColor="accent5"/>
+          <w:sz w:val="24"/>
+          <w:szCs w:val="24"/>
+        </w:rPr>
+        <w:t>1</w:t>
+      </w:r>
+      <w:r>
+        <w:rPr>
+          <w:rFonts w:ascii="Arial" w:hAnsi="Arial" w:cs="Arial"/>
+          <w:b/>
+          <w:bCs/>
+          <w:color w:val="4472C4" w:themeColor="accent5"/>
+          <w:sz w:val="24"/>
+          <w:szCs w:val="24"/>
+        </w:rPr>
+        <w:t>/</w:t>
+      </w:r>
+      <w:r>
+        <w:rPr>
+          <w:rFonts w:ascii="Arial" w:hAnsi="Arial" w:cs="Arial"/>
+          <w:b/>
+          <w:bCs/>
+          <w:color w:val="4472C4" w:themeColor="accent5"/>
+          <w:sz w:val="24"/>
+          <w:szCs w:val="24"/>
+        </w:rPr>
+        <w:t>0</w:t>
+      </w:r>
+      <w:r>
+        <w:rPr>
+          <w:rFonts w:ascii="Arial" w:hAnsi="Arial" w:cs="Arial"/>
+          <w:b/>
+          <w:bCs/>
+          <w:color w:val="4472C4" w:themeColor="accent5"/>
+          <w:sz w:val="24"/>
+          <w:szCs w:val="24"/>
+        </w:rPr>
+        <w:t>7</w:t>
+      </w:r>
+      <w:r>
+        <w:rPr>
+          <w:rFonts w:ascii="Arial" w:hAnsi="Arial" w:cs="Arial"/>
+          <w:b/>
+          <w:bCs/>
+          <w:color w:val="4472C4" w:themeColor="accent5"/>
+          <w:sz w:val="24"/>
+          <w:szCs w:val="24"/>
+        </w:rPr>
+        <w:t>/2025</w:t>
       </w:r>
     </w:p>
     <w:p>
@@ -2607,52 +2620,34 @@
           <w:szCs w:val="18"/>
         </w:rPr>
         <w:tab/>
-        <w:t>Corrected</w:t>
-      </w:r>
-      <w:r>
-        <w:rPr>
-          <w:rFonts w:ascii="Arial" w:hAnsi="Arial" w:cs="Arial"/>
-          <w:color w:val="1F497D"/>
-          <w:sz w:val="18"/>
-          <w:szCs w:val="18"/>
-        </w:rPr>
-        <w:t xml:space="preserve"> </w:t>
-      </w:r>
-      <w:r>
-        <w:rPr>
-          <w:rFonts w:ascii="Arial" w:hAnsi="Arial" w:cs="Arial"/>
-          <w:color w:val="1F497D"/>
-          <w:sz w:val="18"/>
-          <w:szCs w:val="18"/>
-        </w:rPr>
-        <w:t xml:space="preserve">the </w:t>
-      </w:r>
-      <w:r>
-        <w:rPr>
-          <w:rFonts w:ascii="Arial" w:hAnsi="Arial" w:cs="Arial"/>
-          <w:color w:val="1F497D"/>
-          <w:sz w:val="18"/>
-          <w:szCs w:val="18"/>
-        </w:rPr>
-        <w:t xml:space="preserve">Comms Log viewer’s error </w:t>
-      </w:r>
-      <w:r>
-        <w:rPr>
-          <w:rFonts w:ascii="Arial" w:hAnsi="Arial" w:cs="Arial"/>
-          <w:color w:val="1F497D"/>
-          <w:sz w:val="18"/>
-          <w:szCs w:val="18"/>
-        </w:rPr>
-        <w:t>over</w:t>
-      </w:r>
-      <w:r>
-        <w:rPr>
-          <w:rFonts w:ascii="Arial" w:hAnsi="Arial" w:cs="Arial"/>
-          <w:color w:val="1F497D"/>
-          <w:sz w:val="18"/>
-          <w:szCs w:val="18"/>
-        </w:rPr>
-        <w:t>counts.</w:t>
+        <w:t xml:space="preserve">Removed system notifications which were causing </w:t>
+      </w:r>
+      <w:r>
+        <w:rPr>
+          <w:rFonts w:ascii="Arial" w:hAnsi="Arial" w:cs="Arial"/>
+          <w:color w:val="1F497D"/>
+          <w:sz w:val="18"/>
+          <w:szCs w:val="18"/>
+        </w:rPr>
+        <w:t>freezes</w:t>
+      </w:r>
+      <w:r>
+        <w:rPr>
+          <w:rFonts w:ascii="Arial" w:hAnsi="Arial" w:cs="Arial"/>
+          <w:color w:val="1F497D"/>
+          <w:sz w:val="18"/>
+          <w:szCs w:val="18"/>
+        </w:rPr>
+        <w:t xml:space="preserve"> and </w:t>
+      </w:r>
+      <w:r>
+        <w:rPr>
+          <w:rFonts w:ascii="Arial" w:hAnsi="Arial" w:cs="Arial"/>
+          <w:color w:val="1F497D"/>
+          <w:sz w:val="18"/>
+          <w:szCs w:val="18"/>
+        </w:rPr>
+        <w:t>crashes after download/upload.</w:t>
       </w:r>
     </w:p>
     <w:p>
@@ -2675,95 +2670,68 @@
           <w:szCs w:val="18"/>
         </w:rPr>
       </w:pPr>
-    </w:p>
-    <w:p>
-      <w:pPr>
-        <w:tabs>
-          <w:tab w:val="left" w:pos="993"/>
-        </w:tabs>
-        <w:rPr>
-          <w:rFonts w:ascii="Arial" w:hAnsi="Arial" w:cs="Arial"/>
-          <w:color w:val="9CC2E5" w:themeColor="accent1" w:themeTint="99"/>
-          <w:sz w:val="16"/>
-          <w:szCs w:val="16"/>
-        </w:rPr>
-      </w:pPr>
-      <w:r>
-        <w:rPr>
-          <w:rFonts w:ascii="Arial" w:hAnsi="Arial" w:cs="Arial"/>
-          <w:b/>
-          <w:bCs/>
-          <w:color w:val="4472C4" w:themeColor="accent5"/>
-          <w:sz w:val="24"/>
-          <w:szCs w:val="24"/>
-        </w:rPr>
-        <w:t>v8.1.</w:t>
-      </w:r>
-      <w:r>
-        <w:rPr>
-          <w:rFonts w:ascii="Arial" w:hAnsi="Arial" w:cs="Arial"/>
-          <w:b/>
-          <w:bCs/>
-          <w:color w:val="4472C4" w:themeColor="accent5"/>
-          <w:sz w:val="24"/>
-          <w:szCs w:val="24"/>
-        </w:rPr>
-        <w:t>6</w:t>
-      </w:r>
-      <w:r>
-        <w:rPr>
-          <w:rFonts w:ascii="Arial" w:hAnsi="Arial" w:cs="Arial"/>
-          <w:b/>
-          <w:bCs/>
-          <w:color w:val="4472C4" w:themeColor="accent5"/>
-          <w:sz w:val="24"/>
-          <w:szCs w:val="24"/>
+      <w:r>
+        <w:rPr>
+          <w:rFonts w:ascii="Arial" w:hAnsi="Arial" w:cs="Arial"/>
+          <w:color w:val="1F497D"/>
+          <w:sz w:val="18"/>
+          <w:szCs w:val="18"/>
+        </w:rPr>
+        <w:t>-</w:t>
+      </w:r>
+      <w:r>
+        <w:rPr>
+          <w:rFonts w:ascii="Arial" w:hAnsi="Arial" w:cs="Arial"/>
+          <w:color w:val="1F497D"/>
+          <w:sz w:val="18"/>
+          <w:szCs w:val="18"/>
         </w:rPr>
         <w:tab/>
       </w:r>
       <w:r>
         <w:rPr>
           <w:rFonts w:ascii="Arial" w:hAnsi="Arial" w:cs="Arial"/>
-          <w:b/>
-          <w:bCs/>
-          <w:color w:val="4472C4" w:themeColor="accent5"/>
-          <w:sz w:val="24"/>
-          <w:szCs w:val="24"/>
-        </w:rPr>
-        <w:t>30</w:t>
-      </w:r>
-      <w:r>
-        <w:rPr>
-          <w:rFonts w:ascii="Arial" w:hAnsi="Arial" w:cs="Arial"/>
-          <w:b/>
-          <w:bCs/>
-          <w:color w:val="4472C4" w:themeColor="accent5"/>
-          <w:sz w:val="24"/>
-          <w:szCs w:val="24"/>
-        </w:rPr>
-        <w:t>/</w:t>
-      </w:r>
-      <w:r>
-        <w:rPr>
-          <w:rFonts w:ascii="Arial" w:hAnsi="Arial" w:cs="Arial"/>
-          <w:b/>
-          <w:bCs/>
-          <w:color w:val="4472C4" w:themeColor="accent5"/>
-          <w:sz w:val="24"/>
-          <w:szCs w:val="24"/>
-        </w:rPr>
-        <w:t>07</w:t>
-      </w:r>
-      <w:r>
-        <w:rPr>
-          <w:rFonts w:ascii="Arial" w:hAnsi="Arial" w:cs="Arial"/>
-          <w:b/>
-          <w:bCs/>
-          <w:color w:val="4472C4" w:themeColor="accent5"/>
-          <w:sz w:val="24"/>
-          <w:szCs w:val="24"/>
-        </w:rPr>
-        <w:t>/2025</w:t>
+          <w:color w:val="1F497D"/>
+          <w:sz w:val="18"/>
+          <w:szCs w:val="18"/>
+        </w:rPr>
+        <w:t xml:space="preserve">Moved Revision History </w:t>
+      </w:r>
+      <w:r>
+        <w:rPr>
+          <w:rFonts w:ascii="Arial" w:hAnsi="Arial" w:cs="Arial"/>
+          <w:color w:val="1F497D"/>
+          <w:sz w:val="18"/>
+          <w:szCs w:val="18"/>
+        </w:rPr>
+        <w:t xml:space="preserve">(this document) </w:t>
+      </w:r>
+      <w:r>
+        <w:rPr>
+          <w:rFonts w:ascii="Arial" w:hAnsi="Arial" w:cs="Arial"/>
+          <w:color w:val="1F497D"/>
+          <w:sz w:val="18"/>
+          <w:szCs w:val="18"/>
+        </w:rPr>
+        <w:t xml:space="preserve">from the </w:t>
+      </w:r>
+      <w:r>
+        <w:rPr>
+          <w:rFonts w:ascii="Arial" w:hAnsi="Arial" w:cs="Arial"/>
+          <w:color w:val="1F497D"/>
+          <w:sz w:val="18"/>
+          <w:szCs w:val="18"/>
+        </w:rPr>
+        <w:t>m</w:t>
+      </w:r>
+      <w:r>
+        <w:rPr>
+          <w:rFonts w:ascii="Arial" w:hAnsi="Arial" w:cs="Arial"/>
+          <w:color w:val="1F497D"/>
+          <w:sz w:val="18"/>
+          <w:szCs w:val="18"/>
+        </w:rPr>
+        <w:t>ain menu to the About box.</w:t>
       </w:r>
     </w:p>
     <w:p>
@@ -2803,42 +2771,16 @@
           <w:szCs w:val="18"/>
         </w:rPr>
         <w:tab/>
-      </w:r>
-      <w:r>
-        <w:rPr>
-          <w:rFonts w:ascii="Arial" w:hAnsi="Arial" w:cs="Arial"/>
-          <w:color w:val="1F497D"/>
-          <w:sz w:val="18"/>
-          <w:szCs w:val="18"/>
-        </w:rPr>
-        <w:t>Test</w:t>
-      </w:r>
-      <w:r>
-        <w:rPr>
-          <w:rFonts w:ascii="Arial" w:hAnsi="Arial" w:cs="Arial"/>
-          <w:color w:val="1F497D"/>
-          <w:sz w:val="18"/>
-          <w:szCs w:val="18"/>
-        </w:rPr>
-        <w:t xml:space="preserve"> version </w:t>
-      </w:r>
-      <w:r>
-        <w:rPr>
-          <w:rFonts w:ascii="Arial" w:hAnsi="Arial" w:cs="Arial"/>
-          <w:color w:val="1F497D"/>
-          <w:sz w:val="18"/>
-          <w:szCs w:val="18"/>
-        </w:rPr>
-        <w:t xml:space="preserve">to </w:t>
-      </w:r>
-      <w:r>
-        <w:rPr>
-          <w:rFonts w:ascii="Arial" w:hAnsi="Arial" w:cs="Arial"/>
-          <w:color w:val="1F497D"/>
-          <w:sz w:val="18"/>
-          <w:szCs w:val="18"/>
-        </w:rPr>
-        <w:t xml:space="preserve">investigate </w:t>
+        <w:t>Corrected</w:t>
+      </w:r>
+      <w:r>
+        <w:rPr>
+          <w:rFonts w:ascii="Arial" w:hAnsi="Arial" w:cs="Arial"/>
+          <w:color w:val="1F497D"/>
+          <w:sz w:val="18"/>
+          <w:szCs w:val="18"/>
+        </w:rPr>
+        <w:t xml:space="preserve"> </w:t>
       </w:r>
       <w:r>
         <w:rPr>
@@ -2856,61 +2798,25 @@
           <w:sz w:val="18"/>
           <w:szCs w:val="18"/>
         </w:rPr>
-        <w:t>freezes</w:t>
-      </w:r>
-      <w:r>
-        <w:rPr>
-          <w:rFonts w:ascii="Arial" w:hAnsi="Arial" w:cs="Arial"/>
-          <w:color w:val="1F497D"/>
-          <w:sz w:val="18"/>
-          <w:szCs w:val="18"/>
-        </w:rPr>
-        <w:t xml:space="preserve"> and </w:t>
-      </w:r>
-      <w:r>
-        <w:rPr>
-          <w:rFonts w:ascii="Arial" w:hAnsi="Arial" w:cs="Arial"/>
-          <w:color w:val="1F497D"/>
-          <w:sz w:val="18"/>
-          <w:szCs w:val="18"/>
-        </w:rPr>
-        <w:t xml:space="preserve">crashes </w:t>
-      </w:r>
-      <w:r>
-        <w:rPr>
-          <w:rFonts w:ascii="Arial" w:hAnsi="Arial" w:cs="Arial"/>
-          <w:color w:val="1F497D"/>
-          <w:sz w:val="18"/>
-          <w:szCs w:val="18"/>
-        </w:rPr>
-        <w:t xml:space="preserve">that instances of the </w:t>
-      </w:r>
-      <w:r>
-        <w:rPr>
-          <w:rFonts w:ascii="Arial" w:hAnsi="Arial" w:cs="Arial"/>
-          <w:color w:val="1F497D"/>
-          <w:sz w:val="18"/>
-          <w:szCs w:val="18"/>
-        </w:rPr>
-        <w:t>v8.1.5</w:t>
-      </w:r>
-      <w:r>
-        <w:rPr>
-          <w:rFonts w:ascii="Arial" w:hAnsi="Arial" w:cs="Arial"/>
-          <w:color w:val="1F497D"/>
-          <w:sz w:val="18"/>
-          <w:szCs w:val="18"/>
-        </w:rPr>
-        <w:t xml:space="preserve"> MS Store app exhibited </w:t>
-      </w:r>
-      <w:r>
-        <w:rPr>
-          <w:rFonts w:ascii="Arial" w:hAnsi="Arial" w:cs="Arial"/>
-          <w:color w:val="1F497D"/>
-          <w:sz w:val="18"/>
-          <w:szCs w:val="18"/>
-        </w:rPr>
-        <w:t>after download/upload.</w:t>
+        <w:t xml:space="preserve">Comms Log viewer’s error </w:t>
+      </w:r>
+      <w:r>
+        <w:rPr>
+          <w:rFonts w:ascii="Arial" w:hAnsi="Arial" w:cs="Arial"/>
+          <w:color w:val="1F497D"/>
+          <w:sz w:val="18"/>
+          <w:szCs w:val="18"/>
+        </w:rPr>
+        <w:t>over</w:t>
+      </w:r>
+      <w:r>
+        <w:rPr>
+          <w:rFonts w:ascii="Arial" w:hAnsi="Arial" w:cs="Arial"/>
+          <w:color w:val="1F497D"/>
+          <w:sz w:val="18"/>
+          <w:szCs w:val="18"/>
+        </w:rPr>
+        <w:t>counts.</w:t>
       </w:r>
     </w:p>
     <w:p>
@@ -2946,7 +2852,6 @@
           <w:szCs w:val="16"/>
         </w:rPr>
       </w:pPr>
-      <w:bookmarkStart w:id="3" w:name="_Hlk203052739"/>
       <w:r>
         <w:rPr>
           <w:rFonts w:ascii="Arial" w:hAnsi="Arial" w:cs="Arial"/>
@@ -2968,7 +2873,7 @@
           <w:sz w:val="24"/>
           <w:szCs w:val="24"/>
         </w:rPr>
-        <w:t>5</w:t>
+        <w:t>6</w:t>
       </w:r>
       <w:r>
         <w:rPr>
@@ -2990,7 +2895,7 @@
           <w:sz w:val="24"/>
           <w:szCs w:val="24"/>
         </w:rPr>
-        <w:t>28</w:t>
+        <w:t>30</w:t>
       </w:r>
       <w:r>
         <w:rPr>
@@ -3071,61 +2976,106 @@
           <w:sz w:val="18"/>
           <w:szCs w:val="18"/>
         </w:rPr>
-        <w:t xml:space="preserve">The panel </w:t>
-      </w:r>
-      <w:r>
-        <w:rPr>
-          <w:rFonts w:ascii="Arial" w:hAnsi="Arial" w:cs="Arial"/>
-          <w:color w:val="1F497D"/>
-          <w:sz w:val="18"/>
-          <w:szCs w:val="18"/>
-        </w:rPr>
-        <w:t xml:space="preserve">upload </w:t>
-      </w:r>
-      <w:r>
-        <w:rPr>
-          <w:rFonts w:ascii="Arial" w:hAnsi="Arial" w:cs="Arial"/>
-          <w:color w:val="1F497D"/>
-          <w:sz w:val="18"/>
-          <w:szCs w:val="18"/>
-        </w:rPr>
-        <w:t xml:space="preserve">has been refined </w:t>
-      </w:r>
-      <w:r>
-        <w:rPr>
-          <w:rFonts w:ascii="Arial" w:hAnsi="Arial" w:cs="Arial"/>
-          <w:color w:val="1F497D"/>
-          <w:sz w:val="18"/>
-          <w:szCs w:val="18"/>
-        </w:rPr>
-        <w:t>so that d</w:t>
-      </w:r>
-      <w:r>
-        <w:rPr>
-          <w:rFonts w:ascii="Arial" w:hAnsi="Arial" w:cs="Arial"/>
-          <w:color w:val="1F497D"/>
-          <w:sz w:val="18"/>
-          <w:szCs w:val="18"/>
-        </w:rPr>
-        <w:t>uplicate data items</w:t>
-      </w:r>
-      <w:r>
-        <w:rPr>
-          <w:rFonts w:ascii="Arial" w:hAnsi="Arial" w:cs="Arial"/>
-          <w:color w:val="1F497D"/>
-          <w:sz w:val="18"/>
-          <w:szCs w:val="18"/>
-        </w:rPr>
-        <w:t xml:space="preserve"> are not sent</w:t>
-      </w:r>
-      <w:r>
-        <w:rPr>
-          <w:rFonts w:ascii="Arial" w:hAnsi="Arial" w:cs="Arial"/>
-          <w:color w:val="1F497D"/>
-          <w:sz w:val="18"/>
-          <w:szCs w:val="18"/>
-        </w:rPr>
-        <w:t>.</w:t>
+        <w:t>Test</w:t>
+      </w:r>
+      <w:r>
+        <w:rPr>
+          <w:rFonts w:ascii="Arial" w:hAnsi="Arial" w:cs="Arial"/>
+          <w:color w:val="1F497D"/>
+          <w:sz w:val="18"/>
+          <w:szCs w:val="18"/>
+        </w:rPr>
+        <w:t xml:space="preserve"> version </w:t>
+      </w:r>
+      <w:r>
+        <w:rPr>
+          <w:rFonts w:ascii="Arial" w:hAnsi="Arial" w:cs="Arial"/>
+          <w:color w:val="1F497D"/>
+          <w:sz w:val="18"/>
+          <w:szCs w:val="18"/>
+        </w:rPr>
+        <w:t xml:space="preserve">to </w:t>
+      </w:r>
+      <w:r>
+        <w:rPr>
+          <w:rFonts w:ascii="Arial" w:hAnsi="Arial" w:cs="Arial"/>
+          <w:color w:val="1F497D"/>
+          <w:sz w:val="18"/>
+          <w:szCs w:val="18"/>
+        </w:rPr>
+        <w:t xml:space="preserve">investigate </w:t>
+      </w:r>
+      <w:r>
+        <w:rPr>
+          <w:rFonts w:ascii="Arial" w:hAnsi="Arial" w:cs="Arial"/>
+          <w:color w:val="1F497D"/>
+          <w:sz w:val="18"/>
+          <w:szCs w:val="18"/>
+        </w:rPr>
+        <w:t xml:space="preserve">the </w:t>
+      </w:r>
+      <w:r>
+        <w:rPr>
+          <w:rFonts w:ascii="Arial" w:hAnsi="Arial" w:cs="Arial"/>
+          <w:color w:val="1F497D"/>
+          <w:sz w:val="18"/>
+          <w:szCs w:val="18"/>
+        </w:rPr>
+        <w:t>freezes</w:t>
+      </w:r>
+      <w:r>
+        <w:rPr>
+          <w:rFonts w:ascii="Arial" w:hAnsi="Arial" w:cs="Arial"/>
+          <w:color w:val="1F497D"/>
+          <w:sz w:val="18"/>
+          <w:szCs w:val="18"/>
+        </w:rPr>
+        <w:t xml:space="preserve"> and </w:t>
+      </w:r>
+      <w:r>
+        <w:rPr>
+          <w:rFonts w:ascii="Arial" w:hAnsi="Arial" w:cs="Arial"/>
+          <w:color w:val="1F497D"/>
+          <w:sz w:val="18"/>
+          <w:szCs w:val="18"/>
+        </w:rPr>
+        <w:t xml:space="preserve">crashes </w:t>
+      </w:r>
+      <w:r>
+        <w:rPr>
+          <w:rFonts w:ascii="Arial" w:hAnsi="Arial" w:cs="Arial"/>
+          <w:color w:val="1F497D"/>
+          <w:sz w:val="18"/>
+          <w:szCs w:val="18"/>
+        </w:rPr>
+        <w:t xml:space="preserve">that instances of the </w:t>
+      </w:r>
+      <w:r>
+        <w:rPr>
+          <w:rFonts w:ascii="Arial" w:hAnsi="Arial" w:cs="Arial"/>
+          <w:color w:val="1F497D"/>
+          <w:sz w:val="18"/>
+          <w:szCs w:val="18"/>
+        </w:rPr>
+        <w:t>v8.1.5</w:t>
+      </w:r>
+      <w:r>
+        <w:rPr>
+          <w:rFonts w:ascii="Arial" w:hAnsi="Arial" w:cs="Arial"/>
+          <w:color w:val="1F497D"/>
+          <w:sz w:val="18"/>
+          <w:szCs w:val="18"/>
+        </w:rPr>
+        <w:t xml:space="preserve"> MS Store app exhibited </w:t>
+      </w:r>
+      <w:r>
+        <w:rPr>
+          <w:rFonts w:ascii="Arial" w:hAnsi="Arial" w:cs="Arial"/>
+          <w:color w:val="1F497D"/>
+          <w:sz w:val="18"/>
+          <w:szCs w:val="18"/>
+        </w:rPr>
+        <w:t>after download/upload.</w:t>
       </w:r>
     </w:p>
     <w:p>
@@ -3148,32 +3098,96 @@
           <w:szCs w:val="18"/>
         </w:rPr>
       </w:pPr>
-      <w:r>
-        <w:rPr>
-          <w:rFonts w:ascii="Arial" w:hAnsi="Arial" w:cs="Arial"/>
-          <w:color w:val="1F497D"/>
-          <w:sz w:val="18"/>
-          <w:szCs w:val="18"/>
-        </w:rPr>
-        <w:t>-</w:t>
-      </w:r>
-      <w:r>
-        <w:rPr>
-          <w:rFonts w:ascii="Arial" w:hAnsi="Arial" w:cs="Arial"/>
-          <w:color w:val="1F497D"/>
-          <w:sz w:val="18"/>
-          <w:szCs w:val="18"/>
+    </w:p>
+    <w:p>
+      <w:pPr>
+        <w:tabs>
+          <w:tab w:val="left" w:pos="993"/>
+        </w:tabs>
+        <w:rPr>
+          <w:rFonts w:ascii="Arial" w:hAnsi="Arial" w:cs="Arial"/>
+          <w:color w:val="9CC2E5" w:themeColor="accent1" w:themeTint="99"/>
+          <w:sz w:val="16"/>
+          <w:szCs w:val="16"/>
+        </w:rPr>
+      </w:pPr>
+      <w:bookmarkStart w:id="3" w:name="_Hlk203052739"/>
+      <w:r>
+        <w:rPr>
+          <w:rFonts w:ascii="Arial" w:hAnsi="Arial" w:cs="Arial"/>
+          <w:b/>
+          <w:bCs/>
+          <w:color w:val="4472C4" w:themeColor="accent5"/>
+          <w:sz w:val="24"/>
+          <w:szCs w:val="24"/>
+        </w:rPr>
+        <w:t>v8.1.</w:t>
+      </w:r>
+      <w:r>
+        <w:rPr>
+          <w:rFonts w:ascii="Arial" w:hAnsi="Arial" w:cs="Arial"/>
+          <w:b/>
+          <w:bCs/>
+          <w:color w:val="4472C4" w:themeColor="accent5"/>
+          <w:sz w:val="24"/>
+          <w:szCs w:val="24"/>
+        </w:rPr>
+        <w:t>5</w:t>
+      </w:r>
+      <w:r>
+        <w:rPr>
+          <w:rFonts w:ascii="Arial" w:hAnsi="Arial" w:cs="Arial"/>
+          <w:b/>
+          <w:bCs/>
+          <w:color w:val="4472C4" w:themeColor="accent5"/>
+          <w:sz w:val="24"/>
+          <w:szCs w:val="24"/>
         </w:rPr>
         <w:tab/>
       </w:r>
       <w:r>
         <w:rPr>
           <w:rFonts w:ascii="Arial" w:hAnsi="Arial" w:cs="Arial"/>
-          <w:color w:val="1F497D"/>
-          <w:sz w:val="18"/>
-          <w:szCs w:val="18"/>
-        </w:rPr>
-        <w:t>The Validation Window now correctly reports multiple errors on a page instead of only one.</w:t>
+          <w:b/>
+          <w:bCs/>
+          <w:color w:val="4472C4" w:themeColor="accent5"/>
+          <w:sz w:val="24"/>
+          <w:szCs w:val="24"/>
+        </w:rPr>
+        <w:t>28</w:t>
+      </w:r>
+      <w:r>
+        <w:rPr>
+          <w:rFonts w:ascii="Arial" w:hAnsi="Arial" w:cs="Arial"/>
+          <w:b/>
+          <w:bCs/>
+          <w:color w:val="4472C4" w:themeColor="accent5"/>
+          <w:sz w:val="24"/>
+          <w:szCs w:val="24"/>
+        </w:rPr>
+        <w:t>/</w:t>
+      </w:r>
+      <w:r>
+        <w:rPr>
+          <w:rFonts w:ascii="Arial" w:hAnsi="Arial" w:cs="Arial"/>
+          <w:b/>
+          <w:bCs/>
+          <w:color w:val="4472C4" w:themeColor="accent5"/>
+          <w:sz w:val="24"/>
+          <w:szCs w:val="24"/>
+        </w:rPr>
+        <w:t>07</w:t>
+      </w:r>
+      <w:r>
+        <w:rPr>
+          <w:rFonts w:ascii="Arial" w:hAnsi="Arial" w:cs="Arial"/>
+          <w:b/>
+          <w:bCs/>
+          <w:color w:val="4472C4" w:themeColor="accent5"/>
+          <w:sz w:val="24"/>
+          <w:szCs w:val="24"/>
+        </w:rPr>
+        <w:t>/2025</w:t>
       </w:r>
     </w:p>
     <w:p>
@@ -3213,34 +3227,69 @@
           <w:szCs w:val="18"/>
         </w:rPr>
         <w:tab/>
-        <w:t xml:space="preserve">The device </w:t>
-      </w:r>
-      <w:r>
-        <w:rPr>
-          <w:rFonts w:ascii="Arial" w:hAnsi="Arial" w:cs="Arial"/>
-          <w:color w:val="1F497D"/>
-          <w:sz w:val="18"/>
-          <w:szCs w:val="18"/>
-        </w:rPr>
-        <w:t xml:space="preserve">count is </w:t>
-      </w:r>
-      <w:r>
-        <w:rPr>
-          <w:rFonts w:ascii="Arial" w:hAnsi="Arial" w:cs="Arial"/>
-          <w:color w:val="1F497D"/>
-          <w:sz w:val="18"/>
-          <w:szCs w:val="18"/>
-        </w:rPr>
-        <w:t xml:space="preserve">now </w:t>
-      </w:r>
-      <w:r>
-        <w:rPr>
-          <w:rFonts w:ascii="Arial" w:hAnsi="Arial" w:cs="Arial"/>
-          <w:color w:val="1F497D"/>
-          <w:sz w:val="18"/>
-          <w:szCs w:val="18"/>
-        </w:rPr>
-        <w:t>always correct after changing protocol when downloading from a panel or reading from a file.</w:t>
+      </w:r>
+      <w:r>
+        <w:rPr>
+          <w:rFonts w:ascii="Arial" w:hAnsi="Arial" w:cs="Arial"/>
+          <w:color w:val="1F497D"/>
+          <w:sz w:val="18"/>
+          <w:szCs w:val="18"/>
+        </w:rPr>
+        <w:t xml:space="preserve">The panel </w:t>
+      </w:r>
+      <w:r>
+        <w:rPr>
+          <w:rFonts w:ascii="Arial" w:hAnsi="Arial" w:cs="Arial"/>
+          <w:color w:val="1F497D"/>
+          <w:sz w:val="18"/>
+          <w:szCs w:val="18"/>
+        </w:rPr>
+        <w:t xml:space="preserve">upload </w:t>
+      </w:r>
+      <w:r>
+        <w:rPr>
+          <w:rFonts w:ascii="Arial" w:hAnsi="Arial" w:cs="Arial"/>
+          <w:color w:val="1F497D"/>
+          <w:sz w:val="18"/>
+          <w:szCs w:val="18"/>
+        </w:rPr>
+        <w:t xml:space="preserve">has been refined </w:t>
+      </w:r>
+      <w:r>
+        <w:rPr>
+          <w:rFonts w:ascii="Arial" w:hAnsi="Arial" w:cs="Arial"/>
+          <w:color w:val="1F497D"/>
+          <w:sz w:val="18"/>
+          <w:szCs w:val="18"/>
+        </w:rPr>
+        <w:t>so that d</w:t>
+      </w:r>
+      <w:r>
+        <w:rPr>
+          <w:rFonts w:ascii="Arial" w:hAnsi="Arial" w:cs="Arial"/>
+          <w:color w:val="1F497D"/>
+          <w:sz w:val="18"/>
+          <w:szCs w:val="18"/>
+        </w:rPr>
+        <w:t>uplicate data items</w:t>
+      </w:r>
+      <w:r>
+        <w:rPr>
+          <w:rFonts w:ascii="Arial" w:hAnsi="Arial" w:cs="Arial"/>
+          <w:color w:val="1F497D"/>
+          <w:sz w:val="18"/>
+          <w:szCs w:val="18"/>
+        </w:rPr>
+        <w:t xml:space="preserve"> are not sent</w:t>
+      </w:r>
+      <w:r>
+        <w:rPr>
+          <w:rFonts w:ascii="Arial" w:hAnsi="Arial" w:cs="Arial"/>
+          <w:color w:val="1F497D"/>
+          <w:sz w:val="18"/>
+          <w:szCs w:val="18"/>
+        </w:rPr>
+        <w:t>.</w:t>
       </w:r>
     </w:p>
     <w:p>
@@ -3280,7 +3329,15 @@
           <w:szCs w:val="18"/>
         </w:rPr>
         <w:tab/>
-        <w:t>Errors with the Causes &amp; Effects page not updating after downloading or reading from file have been fixed.</w:t>
+      </w:r>
+      <w:r>
+        <w:rPr>
+          <w:rFonts w:ascii="Arial" w:hAnsi="Arial" w:cs="Arial"/>
+          <w:color w:val="1F497D"/>
+          <w:sz w:val="18"/>
+          <w:szCs w:val="18"/>
+        </w:rPr>
+        <w:t>The Validation Window now correctly reports multiple errors on a page instead of only one.</w:t>
       </w:r>
     </w:p>
     <w:p>
@@ -3303,96 +3360,51 @@
           <w:szCs w:val="18"/>
         </w:rPr>
       </w:pPr>
-    </w:p>
-    <w:p>
-      <w:pPr>
-        <w:tabs>
-          <w:tab w:val="left" w:pos="993"/>
-        </w:tabs>
-        <w:rPr>
-          <w:rFonts w:ascii="Arial" w:hAnsi="Arial" w:cs="Arial"/>
-          <w:color w:val="9CC2E5" w:themeColor="accent1" w:themeTint="99"/>
-          <w:sz w:val="16"/>
-          <w:szCs w:val="16"/>
-        </w:rPr>
-      </w:pPr>
-      <w:bookmarkStart w:id="4" w:name="_Hlk199945625"/>
-      <w:r>
-        <w:rPr>
-          <w:rFonts w:ascii="Arial" w:hAnsi="Arial" w:cs="Arial"/>
-          <w:b/>
-          <w:bCs/>
-          <w:color w:val="4472C4" w:themeColor="accent5"/>
-          <w:sz w:val="24"/>
-          <w:szCs w:val="24"/>
-        </w:rPr>
-        <w:t>v8.1.</w:t>
-      </w:r>
-      <w:r>
-        <w:rPr>
-          <w:rFonts w:ascii="Arial" w:hAnsi="Arial" w:cs="Arial"/>
-          <w:b/>
-          <w:bCs/>
-          <w:color w:val="4472C4" w:themeColor="accent5"/>
-          <w:sz w:val="24"/>
-          <w:szCs w:val="24"/>
-        </w:rPr>
-        <w:t>4</w:t>
-      </w:r>
-      <w:r>
-        <w:rPr>
-          <w:rFonts w:ascii="Arial" w:hAnsi="Arial" w:cs="Arial"/>
-          <w:b/>
-          <w:bCs/>
-          <w:color w:val="4472C4" w:themeColor="accent5"/>
-          <w:sz w:val="24"/>
-          <w:szCs w:val="24"/>
+      <w:r>
+        <w:rPr>
+          <w:rFonts w:ascii="Arial" w:hAnsi="Arial" w:cs="Arial"/>
+          <w:color w:val="1F497D"/>
+          <w:sz w:val="18"/>
+          <w:szCs w:val="18"/>
+        </w:rPr>
+        <w:t>-</w:t>
+      </w:r>
+      <w:r>
+        <w:rPr>
+          <w:rFonts w:ascii="Arial" w:hAnsi="Arial" w:cs="Arial"/>
+          <w:color w:val="1F497D"/>
+          <w:sz w:val="18"/>
+          <w:szCs w:val="18"/>
         </w:rPr>
         <w:tab/>
-      </w:r>
-      <w:r>
-        <w:rPr>
-          <w:rFonts w:ascii="Arial" w:hAnsi="Arial" w:cs="Arial"/>
-          <w:b/>
-          <w:bCs/>
-          <w:color w:val="4472C4" w:themeColor="accent5"/>
-          <w:sz w:val="24"/>
-          <w:szCs w:val="24"/>
-        </w:rPr>
-        <w:t>09</w:t>
-      </w:r>
-      <w:r>
-        <w:rPr>
-          <w:rFonts w:ascii="Arial" w:hAnsi="Arial" w:cs="Arial"/>
-          <w:b/>
-          <w:bCs/>
-          <w:color w:val="4472C4" w:themeColor="accent5"/>
-          <w:sz w:val="24"/>
-          <w:szCs w:val="24"/>
-        </w:rPr>
-        <w:t>/</w:t>
-      </w:r>
-      <w:r>
-        <w:rPr>
-          <w:rFonts w:ascii="Arial" w:hAnsi="Arial" w:cs="Arial"/>
-          <w:b/>
-          <w:bCs/>
-          <w:color w:val="4472C4" w:themeColor="accent5"/>
-          <w:sz w:val="24"/>
-          <w:szCs w:val="24"/>
-        </w:rPr>
-        <w:t>07</w:t>
-      </w:r>
-      <w:r>
-        <w:rPr>
-          <w:rFonts w:ascii="Arial" w:hAnsi="Arial" w:cs="Arial"/>
-          <w:b/>
-          <w:bCs/>
-          <w:color w:val="4472C4" w:themeColor="accent5"/>
-          <w:sz w:val="24"/>
-          <w:szCs w:val="24"/>
-        </w:rPr>
-        <w:t>/2025</w:t>
+        <w:t xml:space="preserve">The device </w:t>
+      </w:r>
+      <w:r>
+        <w:rPr>
+          <w:rFonts w:ascii="Arial" w:hAnsi="Arial" w:cs="Arial"/>
+          <w:color w:val="1F497D"/>
+          <w:sz w:val="18"/>
+          <w:szCs w:val="18"/>
+        </w:rPr>
+        <w:t xml:space="preserve">count is </w:t>
+      </w:r>
+      <w:r>
+        <w:rPr>
+          <w:rFonts w:ascii="Arial" w:hAnsi="Arial" w:cs="Arial"/>
+          <w:color w:val="1F497D"/>
+          <w:sz w:val="18"/>
+          <w:szCs w:val="18"/>
+        </w:rPr>
+        <w:t xml:space="preserve">now </w:t>
+      </w:r>
+      <w:r>
+        <w:rPr>
+          <w:rFonts w:ascii="Arial" w:hAnsi="Arial" w:cs="Arial"/>
+          <w:color w:val="1F497D"/>
+          <w:sz w:val="18"/>
+          <w:szCs w:val="18"/>
+        </w:rPr>
+        <w:t>always correct after changing protocol when downloading from a panel or reading from a file.</w:t>
       </w:r>
     </w:p>
     <w:p>
@@ -3432,35 +3444,167 @@
           <w:szCs w:val="18"/>
         </w:rPr>
         <w:tab/>
-      </w:r>
-      <w:r>
-        <w:rPr>
-          <w:rFonts w:ascii="Arial" w:hAnsi="Arial" w:cs="Arial"/>
-          <w:color w:val="1F497D"/>
-          <w:sz w:val="18"/>
-          <w:szCs w:val="18"/>
-        </w:rPr>
-        <w:t>Groups page: Phased Delay can now be disabled by setting it to “</w:t>
-      </w:r>
-      <w:proofErr w:type="gramStart"/>
-      <w:r>
-        <w:rPr>
-          <w:rFonts w:ascii="Arial" w:hAnsi="Arial" w:cs="Arial"/>
-          <w:color w:val="1F497D"/>
-          <w:sz w:val="18"/>
-          <w:szCs w:val="18"/>
-        </w:rPr>
-        <w:t>--:--</w:t>
-      </w:r>
-      <w:proofErr w:type="gramEnd"/>
-      <w:r>
-        <w:rPr>
-          <w:rFonts w:ascii="Arial" w:hAnsi="Arial" w:cs="Arial"/>
-          <w:color w:val="1F497D"/>
-          <w:sz w:val="18"/>
-          <w:szCs w:val="18"/>
-        </w:rPr>
-        <w:t>“.</w:t>
+        <w:t>Errors with the Causes &amp; Effects page not updating after downloading or reading from file have been fixed.</w:t>
+      </w:r>
+    </w:p>
+    <w:p>
+      <w:pPr>
+        <w:tabs>
+          <w:tab w:val="left" w:pos="284"/>
+          <w:tab w:val="left" w:pos="567"/>
+          <w:tab w:val="left" w:pos="993"/>
+          <w:tab w:val="left" w:pos="1418"/>
+          <w:tab w:val="right" w:pos="9000"/>
+        </w:tabs>
+        <w:suppressAutoHyphens/>
+        <w:autoSpaceDN w:val="0"/>
+        <w:ind w:left="284" w:hanging="284"/>
+        <w:contextualSpacing/>
+        <w:rPr>
+          <w:rFonts w:ascii="Arial" w:hAnsi="Arial" w:cs="Arial"/>
+          <w:color w:val="1F497D"/>
+          <w:sz w:val="18"/>
+          <w:szCs w:val="18"/>
+        </w:rPr>
+      </w:pPr>
+    </w:p>
+    <w:p>
+      <w:pPr>
+        <w:tabs>
+          <w:tab w:val="left" w:pos="993"/>
+        </w:tabs>
+        <w:rPr>
+          <w:rFonts w:ascii="Arial" w:hAnsi="Arial" w:cs="Arial"/>
+          <w:color w:val="9CC2E5" w:themeColor="accent1" w:themeTint="99"/>
+          <w:sz w:val="16"/>
+          <w:szCs w:val="16"/>
+        </w:rPr>
+      </w:pPr>
+      <w:bookmarkStart w:id="4" w:name="_Hlk199945625"/>
+      <w:r>
+        <w:rPr>
+          <w:rFonts w:ascii="Arial" w:hAnsi="Arial" w:cs="Arial"/>
+          <w:b/>
+          <w:bCs/>
+          <w:color w:val="4472C4" w:themeColor="accent5"/>
+          <w:sz w:val="24"/>
+          <w:szCs w:val="24"/>
+        </w:rPr>
+        <w:t>v8.1.</w:t>
+      </w:r>
+      <w:r>
+        <w:rPr>
+          <w:rFonts w:ascii="Arial" w:hAnsi="Arial" w:cs="Arial"/>
+          <w:b/>
+          <w:bCs/>
+          <w:color w:val="4472C4" w:themeColor="accent5"/>
+          <w:sz w:val="24"/>
+          <w:szCs w:val="24"/>
+        </w:rPr>
+        <w:t>4</w:t>
+      </w:r>
+      <w:r>
+        <w:rPr>
+          <w:rFonts w:ascii="Arial" w:hAnsi="Arial" w:cs="Arial"/>
+          <w:b/>
+          <w:bCs/>
+          <w:color w:val="4472C4" w:themeColor="accent5"/>
+          <w:sz w:val="24"/>
+          <w:szCs w:val="24"/>
+        </w:rPr>
+        <w:tab/>
+      </w:r>
+      <w:r>
+        <w:rPr>
+          <w:rFonts w:ascii="Arial" w:hAnsi="Arial" w:cs="Arial"/>
+          <w:b/>
+          <w:bCs/>
+          <w:color w:val="4472C4" w:themeColor="accent5"/>
+          <w:sz w:val="24"/>
+          <w:szCs w:val="24"/>
+        </w:rPr>
+        <w:t>09</w:t>
+      </w:r>
+      <w:r>
+        <w:rPr>
+          <w:rFonts w:ascii="Arial" w:hAnsi="Arial" w:cs="Arial"/>
+          <w:b/>
+          <w:bCs/>
+          <w:color w:val="4472C4" w:themeColor="accent5"/>
+          <w:sz w:val="24"/>
+          <w:szCs w:val="24"/>
+        </w:rPr>
+        <w:t>/</w:t>
+      </w:r>
+      <w:r>
+        <w:rPr>
+          <w:rFonts w:ascii="Arial" w:hAnsi="Arial" w:cs="Arial"/>
+          <w:b/>
+          <w:bCs/>
+          <w:color w:val="4472C4" w:themeColor="accent5"/>
+          <w:sz w:val="24"/>
+          <w:szCs w:val="24"/>
+        </w:rPr>
+        <w:t>07</w:t>
+      </w:r>
+      <w:r>
+        <w:rPr>
+          <w:rFonts w:ascii="Arial" w:hAnsi="Arial" w:cs="Arial"/>
+          <w:b/>
+          <w:bCs/>
+          <w:color w:val="4472C4" w:themeColor="accent5"/>
+          <w:sz w:val="24"/>
+          <w:szCs w:val="24"/>
+        </w:rPr>
+        <w:t>/2025</w:t>
+      </w:r>
+    </w:p>
+    <w:p>
+      <w:pPr>
+        <w:tabs>
+          <w:tab w:val="left" w:pos="284"/>
+          <w:tab w:val="left" w:pos="567"/>
+          <w:tab w:val="left" w:pos="993"/>
+          <w:tab w:val="left" w:pos="1418"/>
+          <w:tab w:val="right" w:pos="9000"/>
+        </w:tabs>
+        <w:suppressAutoHyphens/>
+        <w:autoSpaceDN w:val="0"/>
+        <w:ind w:left="284" w:hanging="284"/>
+        <w:contextualSpacing/>
+        <w:rPr>
+          <w:rFonts w:ascii="Arial" w:hAnsi="Arial" w:cs="Arial"/>
+          <w:color w:val="1F497D"/>
+          <w:sz w:val="18"/>
+          <w:szCs w:val="18"/>
+        </w:rPr>
+      </w:pPr>
+      <w:r>
+        <w:rPr>
+          <w:rFonts w:ascii="Arial" w:hAnsi="Arial" w:cs="Arial"/>
+          <w:color w:val="1F497D"/>
+          <w:sz w:val="18"/>
+          <w:szCs w:val="18"/>
+        </w:rPr>
+        <w:t>-</w:t>
+      </w:r>
+      <w:r>
+        <w:rPr>
+          <w:rFonts w:ascii="Arial" w:hAnsi="Arial" w:cs="Arial"/>
+          <w:color w:val="1F497D"/>
+          <w:sz w:val="18"/>
+          <w:szCs w:val="18"/>
+        </w:rPr>
+        <w:tab/>
+      </w:r>
+      <w:r>
+        <w:rPr>
+          <w:rFonts w:ascii="Arial" w:hAnsi="Arial" w:cs="Arial"/>
+          <w:color w:val="1F497D"/>
+          <w:sz w:val="18"/>
+          <w:szCs w:val="18"/>
+        </w:rPr>
+        <w:t>Groups page: Phased Delay can now be disabled by setting it to “--:--“.</w:t>
       </w:r>
     </w:p>
     <w:p>
@@ -5439,6 +5583,7 @@
           <w:sz w:val="18"/>
           <w:szCs w:val="18"/>
         </w:rPr>
+        <w:lastRenderedPageBreak/>
         <w:t>-</w:t>
       </w:r>
       <w:r>
@@ -5536,7 +5681,6 @@
           <w:sz w:val="18"/>
           <w:szCs w:val="18"/>
         </w:rPr>
-        <w:lastRenderedPageBreak/>
         <w:t>-</w:t>
       </w:r>
       <w:r>
@@ -7540,45 +7684,14 @@
         </w:rPr>
         <w:tab/>
       </w:r>
-      <w:proofErr w:type="spellStart"/>
-      <w:r>
-        <w:rPr>
-          <w:rFonts w:ascii="Arial" w:hAnsi="Arial" w:cs="Arial"/>
-          <w:color w:val="1F4E79" w:themeColor="accent1" w:themeShade="80"/>
-          <w:sz w:val="18"/>
-          <w:szCs w:val="18"/>
-        </w:rPr>
-        <w:t>NumberSpinner</w:t>
-      </w:r>
-      <w:proofErr w:type="spellEnd"/>
-      <w:r>
-        <w:rPr>
-          <w:rFonts w:ascii="Arial" w:hAnsi="Arial" w:cs="Arial"/>
-          <w:color w:val="1F4E79" w:themeColor="accent1" w:themeShade="80"/>
-          <w:sz w:val="18"/>
-          <w:szCs w:val="18"/>
-        </w:rPr>
-        <w:t xml:space="preserve"> control: added </w:t>
-      </w:r>
-      <w:proofErr w:type="spellStart"/>
-      <w:r>
-        <w:rPr>
-          <w:rFonts w:ascii="Arial" w:hAnsi="Arial" w:cs="Arial"/>
-          <w:color w:val="1F4E79" w:themeColor="accent1" w:themeShade="80"/>
-          <w:sz w:val="18"/>
-          <w:szCs w:val="18"/>
-        </w:rPr>
-        <w:t>NumberSet</w:t>
-      </w:r>
-      <w:proofErr w:type="spellEnd"/>
-      <w:r>
-        <w:rPr>
-          <w:rFonts w:ascii="Arial" w:hAnsi="Arial" w:cs="Arial"/>
-          <w:color w:val="1F4E79" w:themeColor="accent1" w:themeShade="80"/>
-          <w:sz w:val="18"/>
-          <w:szCs w:val="18"/>
-        </w:rPr>
-        <w:t xml:space="preserve"> property, that defines the set of valid values for the case when the valid values are not consecutive, and </w:t>
+      <w:r>
+        <w:rPr>
+          <w:rFonts w:ascii="Arial" w:hAnsi="Arial" w:cs="Arial"/>
+          <w:color w:val="1F4E79" w:themeColor="accent1" w:themeShade="80"/>
+          <w:sz w:val="18"/>
+          <w:szCs w:val="18"/>
+        </w:rPr>
+        <w:t xml:space="preserve">NumberSpinner control: added NumberSet property, that defines the set of valid values for the case when the valid values are not consecutive, and </w:t>
       </w:r>
       <w:r>
         <w:rPr>
@@ -7623,6 +7736,7 @@
           <w:sz w:val="18"/>
           <w:szCs w:val="18"/>
         </w:rPr>
+        <w:lastRenderedPageBreak/>
         <w:t>-</w:t>
       </w:r>
       <w:r>
@@ -7767,7 +7881,6 @@
           <w:sz w:val="18"/>
           <w:szCs w:val="18"/>
         </w:rPr>
-        <w:lastRenderedPageBreak/>
         <w:t>-</w:t>
       </w:r>
       <w:r>
@@ -8533,37 +8646,7 @@
           <w:sz w:val="18"/>
           <w:szCs w:val="18"/>
         </w:rPr>
-        <w:t xml:space="preserve">Default </w:t>
-      </w:r>
-      <w:proofErr w:type="spellStart"/>
-      <w:r>
-        <w:rPr>
-          <w:rFonts w:ascii="Arial" w:hAnsi="Arial" w:cs="Arial"/>
-          <w:color w:val="1F4E79" w:themeColor="accent1" w:themeShade="80"/>
-          <w:sz w:val="18"/>
-          <w:szCs w:val="18"/>
-        </w:rPr>
-        <w:t>DeviceData</w:t>
-      </w:r>
-      <w:proofErr w:type="spellEnd"/>
-      <w:r>
-        <w:rPr>
-          <w:rFonts w:ascii="Arial" w:hAnsi="Arial" w:cs="Arial"/>
-          <w:color w:val="1F4E79" w:themeColor="accent1" w:themeShade="80"/>
-          <w:sz w:val="18"/>
-          <w:szCs w:val="18"/>
-        </w:rPr>
-        <w:t xml:space="preserve"> day/night modes are now set according to the device </w:t>
-      </w:r>
-      <w:proofErr w:type="gramStart"/>
-      <w:r>
-        <w:rPr>
-          <w:rFonts w:ascii="Arial" w:hAnsi="Arial" w:cs="Arial"/>
-          <w:color w:val="1F4E79" w:themeColor="accent1" w:themeShade="80"/>
-          <w:sz w:val="18"/>
-          <w:szCs w:val="18"/>
-        </w:rPr>
-        <w:t>type</w:t>
+        <w:t>Default DeviceData day/night modes are now set according to the device type</w:t>
       </w:r>
       <w:r>
         <w:rPr>
@@ -8581,17 +8664,7 @@
           <w:sz w:val="18"/>
           <w:szCs w:val="18"/>
         </w:rPr>
-        <w:t xml:space="preserve"> and</w:t>
-      </w:r>
-      <w:proofErr w:type="gramEnd"/>
-      <w:r>
-        <w:rPr>
-          <w:rFonts w:ascii="Arial" w:hAnsi="Arial" w:cs="Arial"/>
-          <w:color w:val="1F4E79" w:themeColor="accent1" w:themeShade="80"/>
-          <w:sz w:val="18"/>
-          <w:szCs w:val="18"/>
-        </w:rPr>
-        <w:t xml:space="preserve"> are set to default values when a device is changed or added.</w:t>
+        <w:t xml:space="preserve"> and are set to default values when a device is changed or added.</w:t>
       </w:r>
     </w:p>
     <w:p>
@@ -8924,27 +8997,7 @@
           <w:sz w:val="18"/>
           <w:szCs w:val="18"/>
         </w:rPr>
-        <w:t xml:space="preserve">The </w:t>
-      </w:r>
-      <w:proofErr w:type="spellStart"/>
-      <w:r>
-        <w:rPr>
-          <w:rFonts w:ascii="Arial" w:hAnsi="Arial" w:cs="Arial"/>
-          <w:color w:val="1F4E79" w:themeColor="accent1" w:themeShade="80"/>
-          <w:sz w:val="18"/>
-          <w:szCs w:val="18"/>
-        </w:rPr>
-        <w:t>TimePicker</w:t>
-      </w:r>
-      <w:proofErr w:type="spellEnd"/>
-      <w:r>
-        <w:rPr>
-          <w:rFonts w:ascii="Arial" w:hAnsi="Arial" w:cs="Arial"/>
-          <w:color w:val="1F4E79" w:themeColor="accent1" w:themeShade="80"/>
-          <w:sz w:val="18"/>
-          <w:szCs w:val="18"/>
-        </w:rPr>
-        <w:t xml:space="preserve"> control </w:t>
+        <w:t xml:space="preserve">The TimePicker control </w:t>
       </w:r>
       <w:r>
         <w:rPr>
@@ -8980,9 +9033,8 @@
           <w:sz w:val="18"/>
           <w:szCs w:val="18"/>
         </w:rPr>
-        <w:t xml:space="preserve"> “</w:t>
-      </w:r>
-      <w:proofErr w:type="gramStart"/>
+        <w:t xml:space="preserve"> “-</w:t>
+      </w:r>
       <w:r>
         <w:rPr>
           <w:rFonts w:ascii="Arial" w:hAnsi="Arial" w:cs="Arial"/>
@@ -8999,15 +9051,6 @@
           <w:sz w:val="18"/>
           <w:szCs w:val="18"/>
         </w:rPr>
-        <w:t>-</w:t>
-      </w:r>
-      <w:r>
-        <w:rPr>
-          <w:rFonts w:ascii="Arial" w:hAnsi="Arial" w:cs="Arial"/>
-          <w:color w:val="1F4E79" w:themeColor="accent1" w:themeShade="80"/>
-          <w:sz w:val="18"/>
-          <w:szCs w:val="18"/>
-        </w:rPr>
         <w:t>:--“</w:t>
       </w:r>
       <w:r>
@@ -9017,17 +9060,7 @@
           <w:sz w:val="18"/>
           <w:szCs w:val="18"/>
         </w:rPr>
-        <w:t xml:space="preserve"> to</w:t>
-      </w:r>
-      <w:proofErr w:type="gramEnd"/>
-      <w:r>
-        <w:rPr>
-          <w:rFonts w:ascii="Arial" w:hAnsi="Arial" w:cs="Arial"/>
-          <w:color w:val="1F4E79" w:themeColor="accent1" w:themeShade="80"/>
-          <w:sz w:val="18"/>
-          <w:szCs w:val="18"/>
-        </w:rPr>
-        <w:t xml:space="preserve"> indicate Never</w:t>
+        <w:t xml:space="preserve"> to indicate Never</w:t>
       </w:r>
       <w:r>
         <w:rPr>
@@ -9290,27 +9323,7 @@
           <w:sz w:val="18"/>
           <w:szCs w:val="18"/>
         </w:rPr>
-        <w:t xml:space="preserve">; </w:t>
-      </w:r>
-      <w:proofErr w:type="gramStart"/>
-      <w:r>
-        <w:rPr>
-          <w:rFonts w:ascii="Arial" w:hAnsi="Arial" w:cs="Arial"/>
-          <w:color w:val="1F4E79" w:themeColor="accent1" w:themeShade="80"/>
-          <w:sz w:val="18"/>
-          <w:szCs w:val="18"/>
-        </w:rPr>
-        <w:t>also</w:t>
-      </w:r>
-      <w:proofErr w:type="gramEnd"/>
-      <w:r>
-        <w:rPr>
-          <w:rFonts w:ascii="Arial" w:hAnsi="Arial" w:cs="Arial"/>
-          <w:color w:val="1F4E79" w:themeColor="accent1" w:themeShade="80"/>
-          <w:sz w:val="18"/>
-          <w:szCs w:val="18"/>
-        </w:rPr>
-        <w:t xml:space="preserve"> the option to remove it from the Recent Files list</w:t>
+        <w:t>; also the option to remove it from the Recent Files list</w:t>
       </w:r>
       <w:r>
         <w:rPr>
@@ -9418,38 +9431,16 @@
           <w:sz w:val="18"/>
           <w:szCs w:val="18"/>
         </w:rPr>
-        <w:t xml:space="preserve">Importing from </w:t>
-      </w:r>
-      <w:proofErr w:type="gramStart"/>
-      <w:r>
-        <w:rPr>
-          <w:rFonts w:ascii="Arial" w:hAnsi="Arial" w:cs="Arial"/>
-          <w:color w:val="1F4E79" w:themeColor="accent1" w:themeShade="80"/>
-          <w:sz w:val="18"/>
-          <w:szCs w:val="18"/>
-        </w:rPr>
-        <w:t>a .</w:t>
-      </w:r>
-      <w:proofErr w:type="spellStart"/>
-      <w:r>
-        <w:rPr>
-          <w:rFonts w:ascii="Arial" w:hAnsi="Arial" w:cs="Arial"/>
-          <w:color w:val="1F4E79" w:themeColor="accent1" w:themeShade="80"/>
-          <w:sz w:val="18"/>
-          <w:szCs w:val="18"/>
-        </w:rPr>
-        <w:t>xfp</w:t>
-      </w:r>
-      <w:proofErr w:type="spellEnd"/>
-      <w:proofErr w:type="gramEnd"/>
-      <w:r>
-        <w:rPr>
-          <w:rFonts w:ascii="Arial" w:hAnsi="Arial" w:cs="Arial"/>
-          <w:color w:val="1F4E79" w:themeColor="accent1" w:themeShade="80"/>
-          <w:sz w:val="18"/>
-          <w:szCs w:val="18"/>
-        </w:rPr>
-        <w:t xml:space="preserve"> </w:t>
+        <w:t>Importing from a .</w:t>
+      </w:r>
+      <w:r>
+        <w:rPr>
+          <w:rFonts w:ascii="Arial" w:hAnsi="Arial" w:cs="Arial"/>
+          <w:color w:val="1F4E79" w:themeColor="accent1" w:themeShade="80"/>
+          <w:sz w:val="18"/>
+          <w:szCs w:val="18"/>
+        </w:rPr>
+        <w:t xml:space="preserve">xfp </w:t>
       </w:r>
       <w:r>
         <w:rPr>
@@ -9800,6 +9791,7 @@
           <w:sz w:val="18"/>
           <w:szCs w:val="18"/>
         </w:rPr>
+        <w:lastRenderedPageBreak/>
         <w:t>-</w:t>
       </w:r>
       <w:r>
@@ -9990,27 +9982,7 @@
           <w:sz w:val="18"/>
           <w:szCs w:val="18"/>
         </w:rPr>
-        <w:t xml:space="preserve">Corrected the </w:t>
-      </w:r>
-      <w:proofErr w:type="spellStart"/>
-      <w:r>
-        <w:rPr>
-          <w:rFonts w:ascii="Arial" w:hAnsi="Arial" w:cs="Arial"/>
-          <w:color w:val="1F4E79" w:themeColor="accent1" w:themeShade="80"/>
-          <w:sz w:val="18"/>
-          <w:szCs w:val="18"/>
-        </w:rPr>
-        <w:t>TimePicker</w:t>
-      </w:r>
-      <w:proofErr w:type="spellEnd"/>
-      <w:r>
-        <w:rPr>
-          <w:rFonts w:ascii="Arial" w:hAnsi="Arial" w:cs="Arial"/>
-          <w:color w:val="1F4E79" w:themeColor="accent1" w:themeShade="80"/>
-          <w:sz w:val="18"/>
-          <w:szCs w:val="18"/>
-        </w:rPr>
-        <w:t xml:space="preserve"> control so that its time format now reflects a change of language.</w:t>
+        <w:t>Corrected the TimePicker control so that its time format now reflects a change of language.</w:t>
       </w:r>
     </w:p>
     <w:p>
@@ -10052,7 +10024,6 @@
           <w:sz w:val="24"/>
           <w:szCs w:val="24"/>
         </w:rPr>
-        <w:lastRenderedPageBreak/>
         <w:t>v7.0.5</w:t>
       </w:r>
       <w:r>
@@ -14672,6 +14643,7 @@
   <w:style w:type="character" w:default="1" w:styleId="DefaultParagraphFont">
     <w:name w:val="Default Paragraph Font"/>
     <w:uiPriority w:val="1"/>
+    <w:semiHidden/>
     <w:unhideWhenUsed/>
   </w:style>
   <w:style w:type="table" w:default="1" w:styleId="TableNormal">

</xml_diff>